<commit_message>
rechnungsvorlage um Summe min und Summe hh:mm erweitert. upsert logik für timesheet importe um doubletten bei mehrfachem import zu vermeiden
</commit_message>
<xml_diff>
--- a/templates/rechnungsvorlage.docx
+++ b/templates/rechnungsvorlage.docx
@@ -186,6 +186,14 @@
       <w:tblPr>
         <w:tblStyle w:val="Listentabelle1hell"/>
         <w:tblW w:w="9072" w:type="dxa"/>
+        <w:tblBorders>
+          <w:top w:val="single" w:sz="4" w:space="0" w:color="auto"/>
+          <w:left w:val="single" w:sz="4" w:space="0" w:color="auto"/>
+          <w:bottom w:val="single" w:sz="4" w:space="0" w:color="auto"/>
+          <w:right w:val="single" w:sz="4" w:space="0" w:color="auto"/>
+          <w:insideH w:val="single" w:sz="4" w:space="0" w:color="auto"/>
+          <w:insideV w:val="single" w:sz="4" w:space="0" w:color="auto"/>
+        </w:tblBorders>
         <w:tblLook w:val="0480" w:firstRow="0" w:lastRow="0" w:firstColumn="1" w:lastColumn="0" w:noHBand="0" w:noVBand="1"/>
       </w:tblPr>
       <w:tblGrid>
@@ -349,6 +357,14 @@
       <w:tblPr>
         <w:tblStyle w:val="Gitternetztabelle2Akzent3"/>
         <w:tblW w:w="9072" w:type="dxa"/>
+        <w:tblBorders>
+          <w:top w:val="single" w:sz="4" w:space="0" w:color="auto"/>
+          <w:left w:val="single" w:sz="4" w:space="0" w:color="auto"/>
+          <w:bottom w:val="single" w:sz="4" w:space="0" w:color="auto"/>
+          <w:right w:val="single" w:sz="4" w:space="0" w:color="auto"/>
+          <w:insideH w:val="single" w:sz="4" w:space="0" w:color="auto"/>
+          <w:insideV w:val="single" w:sz="4" w:space="0" w:color="auto"/>
+        </w:tblBorders>
         <w:tblLayout w:type="fixed"/>
         <w:tblLook w:val="0420" w:firstRow="1" w:lastRow="0" w:firstColumn="0" w:lastColumn="0" w:noHBand="0" w:noVBand="1"/>
       </w:tblPr>
@@ -367,6 +383,11 @@
         <w:tc>
           <w:tcPr>
             <w:tcW w:w="1484" w:type="dxa"/>
+            <w:tcBorders>
+              <w:top w:val="none" w:sz="0" w:space="0" w:color="auto"/>
+              <w:bottom w:val="none" w:sz="0" w:space="0" w:color="auto"/>
+              <w:right w:val="none" w:sz="0" w:space="0" w:color="auto"/>
+            </w:tcBorders>
             <w:vAlign w:val="center"/>
           </w:tcPr>
           <w:p>
@@ -413,6 +434,12 @@
         <w:tc>
           <w:tcPr>
             <w:tcW w:w="1307" w:type="dxa"/>
+            <w:tcBorders>
+              <w:top w:val="none" w:sz="0" w:space="0" w:color="auto"/>
+              <w:left w:val="none" w:sz="0" w:space="0" w:color="auto"/>
+              <w:bottom w:val="none" w:sz="0" w:space="0" w:color="auto"/>
+              <w:right w:val="none" w:sz="0" w:space="0" w:color="auto"/>
+            </w:tcBorders>
             <w:vAlign w:val="center"/>
           </w:tcPr>
           <w:p>
@@ -439,6 +466,12 @@
         <w:tc>
           <w:tcPr>
             <w:tcW w:w="1307" w:type="dxa"/>
+            <w:tcBorders>
+              <w:top w:val="none" w:sz="0" w:space="0" w:color="auto"/>
+              <w:left w:val="none" w:sz="0" w:space="0" w:color="auto"/>
+              <w:bottom w:val="none" w:sz="0" w:space="0" w:color="auto"/>
+              <w:right w:val="none" w:sz="0" w:space="0" w:color="auto"/>
+            </w:tcBorders>
             <w:vAlign w:val="center"/>
           </w:tcPr>
           <w:p>
@@ -475,6 +508,12 @@
         <w:tc>
           <w:tcPr>
             <w:tcW w:w="1705" w:type="dxa"/>
+            <w:tcBorders>
+              <w:top w:val="none" w:sz="0" w:space="0" w:color="auto"/>
+              <w:left w:val="none" w:sz="0" w:space="0" w:color="auto"/>
+              <w:bottom w:val="none" w:sz="0" w:space="0" w:color="auto"/>
+              <w:right w:val="none" w:sz="0" w:space="0" w:color="auto"/>
+            </w:tcBorders>
             <w:vAlign w:val="center"/>
           </w:tcPr>
           <w:p>
@@ -541,6 +580,12 @@
         <w:tc>
           <w:tcPr>
             <w:tcW w:w="1705" w:type="dxa"/>
+            <w:tcBorders>
+              <w:top w:val="none" w:sz="0" w:space="0" w:color="auto"/>
+              <w:left w:val="none" w:sz="0" w:space="0" w:color="auto"/>
+              <w:bottom w:val="none" w:sz="0" w:space="0" w:color="auto"/>
+              <w:right w:val="none" w:sz="0" w:space="0" w:color="auto"/>
+            </w:tcBorders>
             <w:vAlign w:val="center"/>
           </w:tcPr>
           <w:p>
@@ -576,6 +621,11 @@
         <w:tc>
           <w:tcPr>
             <w:tcW w:w="1564" w:type="dxa"/>
+            <w:tcBorders>
+              <w:top w:val="none" w:sz="0" w:space="0" w:color="auto"/>
+              <w:left w:val="none" w:sz="0" w:space="0" w:color="auto"/>
+              <w:bottom w:val="none" w:sz="0" w:space="0" w:color="auto"/>
+            </w:tcBorders>
             <w:vAlign w:val="center"/>
           </w:tcPr>
           <w:p>
@@ -998,7 +1048,7 @@
                 <w:sz w:val="22"/>
                 <w:szCs w:val="22"/>
               </w:rPr>
-              <w:t>Summe:</w:t>
+              <w:t>Summe/min:</w:t>
             </w:r>
           </w:p>
         </w:tc>
@@ -1172,7 +1222,7 @@
                 <w:sz w:val="22"/>
                 <w:szCs w:val="22"/>
               </w:rPr>
-              <w:t>summe_stunden|hhmm</w:t>
+              <w:t>summe_stunden|minutes</w:t>
             </w:r>
             <w:proofErr w:type="spellEnd"/>
             <w:r>
@@ -1229,6 +1279,268 @@
                 <w:szCs w:val="22"/>
               </w:rPr>
               <w:t>}}</w:t>
+            </w:r>
+          </w:p>
+        </w:tc>
+      </w:tr>
+      <w:tr>
+        <w:trPr>
+          <w:cnfStyle w:val="000000100000" w:firstRow="0" w:lastRow="0" w:firstColumn="0" w:lastColumn="0" w:oddVBand="0" w:evenVBand="0" w:oddHBand="1" w:evenHBand="0" w:firstRowFirstColumn="0" w:firstRowLastColumn="0" w:lastRowFirstColumn="0" w:lastRowLastColumn="0"/>
+          <w:trHeight w:val="454"/>
+        </w:trPr>
+        <w:tc>
+          <w:tcPr>
+            <w:tcW w:w="1484" w:type="dxa"/>
+            <w:vAlign w:val="bottom"/>
+          </w:tcPr>
+          <w:p>
+            <w:pPr>
+              <w:jc w:val="center"/>
+              <w:rPr>
+                <w:b/>
+                <w:bCs/>
+                <w:sz w:val="22"/>
+                <w:szCs w:val="22"/>
+              </w:rPr>
+            </w:pPr>
+            <w:r>
+              <w:rPr>
+                <w:b/>
+                <w:bCs/>
+                <w:sz w:val="22"/>
+                <w:szCs w:val="22"/>
+              </w:rPr>
+              <w:t>Summe [hh:mm]:</w:t>
+            </w:r>
+          </w:p>
+        </w:tc>
+        <w:tc>
+          <w:tcPr>
+            <w:tcW w:w="1307" w:type="dxa"/>
+            <w:vAlign w:val="bottom"/>
+          </w:tcPr>
+          <w:p>
+            <w:pPr>
+              <w:jc w:val="right"/>
+              <w:rPr>
+                <w:b/>
+                <w:bCs/>
+                <w:sz w:val="22"/>
+                <w:szCs w:val="22"/>
+              </w:rPr>
+            </w:pPr>
+            <w:r>
+              <w:rPr>
+                <w:b/>
+                <w:bCs/>
+                <w:sz w:val="22"/>
+                <w:szCs w:val="22"/>
+              </w:rPr>
+              <w:t>{{</w:t>
+            </w:r>
+            <w:proofErr w:type="spellStart"/>
+            <w:r>
+              <w:rPr>
+                <w:b/>
+                <w:bCs/>
+                <w:sz w:val="22"/>
+                <w:szCs w:val="22"/>
+              </w:rPr>
+              <w:t>summe_fahrtzeit|hhmm</w:t>
+            </w:r>
+            <w:proofErr w:type="spellEnd"/>
+            <w:r>
+              <w:rPr>
+                <w:b/>
+                <w:bCs/>
+                <w:sz w:val="22"/>
+                <w:szCs w:val="22"/>
+              </w:rPr>
+              <w:t>}}</w:t>
+            </w:r>
+          </w:p>
+        </w:tc>
+        <w:tc>
+          <w:tcPr>
+            <w:tcW w:w="1307" w:type="dxa"/>
+            <w:vAlign w:val="bottom"/>
+          </w:tcPr>
+          <w:p>
+            <w:pPr>
+              <w:jc w:val="right"/>
+              <w:rPr>
+                <w:b/>
+                <w:bCs/>
+                <w:sz w:val="22"/>
+                <w:szCs w:val="22"/>
+              </w:rPr>
+            </w:pPr>
+            <w:r>
+              <w:rPr>
+                <w:b/>
+                <w:bCs/>
+                <w:sz w:val="22"/>
+                <w:szCs w:val="22"/>
+              </w:rPr>
+              <w:t>{{</w:t>
+            </w:r>
+            <w:proofErr w:type="spellStart"/>
+            <w:r>
+              <w:rPr>
+                <w:b/>
+                <w:bCs/>
+                <w:sz w:val="22"/>
+                <w:szCs w:val="22"/>
+              </w:rPr>
+              <w:t>summe_direkt|hhmm</w:t>
+            </w:r>
+            <w:proofErr w:type="spellEnd"/>
+            <w:r>
+              <w:rPr>
+                <w:b/>
+                <w:bCs/>
+                <w:sz w:val="22"/>
+                <w:szCs w:val="22"/>
+              </w:rPr>
+              <w:t>}}</w:t>
+            </w:r>
+          </w:p>
+        </w:tc>
+        <w:tc>
+          <w:tcPr>
+            <w:tcW w:w="1705" w:type="dxa"/>
+            <w:vAlign w:val="bottom"/>
+          </w:tcPr>
+          <w:p>
+            <w:pPr>
+              <w:jc w:val="right"/>
+              <w:rPr>
+                <w:b/>
+                <w:bCs/>
+                <w:sz w:val="22"/>
+                <w:szCs w:val="22"/>
+              </w:rPr>
+            </w:pPr>
+            <w:r>
+              <w:rPr>
+                <w:b/>
+                <w:bCs/>
+                <w:sz w:val="22"/>
+                <w:szCs w:val="22"/>
+              </w:rPr>
+              <w:t>{{</w:t>
+            </w:r>
+            <w:proofErr w:type="spellStart"/>
+            <w:r>
+              <w:rPr>
+                <w:b/>
+                <w:bCs/>
+                <w:sz w:val="22"/>
+                <w:szCs w:val="22"/>
+              </w:rPr>
+              <w:t>summe_indirekt|hhmm</w:t>
+            </w:r>
+            <w:proofErr w:type="spellEnd"/>
+            <w:r>
+              <w:rPr>
+                <w:b/>
+                <w:bCs/>
+                <w:sz w:val="22"/>
+                <w:szCs w:val="22"/>
+              </w:rPr>
+              <w:t>}}</w:t>
+            </w:r>
+          </w:p>
+        </w:tc>
+        <w:tc>
+          <w:tcPr>
+            <w:tcW w:w="1705" w:type="dxa"/>
+            <w:vAlign w:val="bottom"/>
+          </w:tcPr>
+          <w:p>
+            <w:pPr>
+              <w:jc w:val="right"/>
+              <w:rPr>
+                <w:b/>
+                <w:bCs/>
+                <w:sz w:val="22"/>
+                <w:szCs w:val="22"/>
+              </w:rPr>
+            </w:pPr>
+            <w:r>
+              <w:rPr>
+                <w:b/>
+                <w:bCs/>
+                <w:sz w:val="22"/>
+                <w:szCs w:val="22"/>
+              </w:rPr>
+              <w:t>{{</w:t>
+            </w:r>
+            <w:proofErr w:type="spellStart"/>
+            <w:r>
+              <w:rPr>
+                <w:b/>
+                <w:bCs/>
+                <w:sz w:val="22"/>
+                <w:szCs w:val="22"/>
+              </w:rPr>
+              <w:t>summe_stunden|hhmm</w:t>
+            </w:r>
+            <w:proofErr w:type="spellEnd"/>
+            <w:r>
+              <w:rPr>
+                <w:b/>
+                <w:bCs/>
+                <w:sz w:val="22"/>
+                <w:szCs w:val="22"/>
+              </w:rPr>
+              <w:t>}}</w:t>
+            </w:r>
+          </w:p>
+        </w:tc>
+        <w:tc>
+          <w:tcPr>
+            <w:tcW w:w="1564" w:type="dxa"/>
+            <w:vAlign w:val="bottom"/>
+          </w:tcPr>
+          <w:p>
+            <w:pPr>
+              <w:jc w:val="right"/>
+              <w:rPr>
+                <w:b/>
+                <w:bCs/>
+                <w:sz w:val="22"/>
+                <w:szCs w:val="22"/>
+              </w:rPr>
+            </w:pPr>
+            <w:r>
+              <w:rPr>
+                <w:b/>
+                <w:bCs/>
+                <w:sz w:val="22"/>
+                <w:szCs w:val="22"/>
+              </w:rPr>
+              <w:t/>
+            </w:r>
+            <w:proofErr w:type="spellStart"/>
+            <w:r>
+              <w:rPr>
+                <w:b/>
+                <w:bCs/>
+                <w:sz w:val="22"/>
+                <w:szCs w:val="22"/>
+              </w:rPr>
+              <w:t/>
+            </w:r>
+            <w:proofErr w:type="spellEnd"/>
+            <w:r>
+              <w:rPr>
+                <w:b/>
+                <w:bCs/>
+                <w:sz w:val="22"/>
+                <w:szCs w:val="22"/>
+              </w:rPr>
+              <w:t/>
             </w:r>
           </w:p>
         </w:tc>

</xml_diff>

<commit_message>
batch import timesheets: Doubletten-Logik erweitert. Fehlerlogs definiert
</commit_message>
<xml_diff>
--- a/templates/rechnungsvorlage.docx
+++ b/templates/rechnungsvorlage.docx
@@ -1985,6 +1985,90 @@
 
 <file path=word/header1.xml><?xml version="1.0" encoding="utf-8"?>
 <w:hdr xmlns:wpc="http://schemas.microsoft.com/office/word/2010/wordprocessingCanvas" xmlns:cx="http://schemas.microsoft.com/office/drawing/2014/chartex" xmlns:cx1="http://schemas.microsoft.com/office/drawing/2015/9/8/chartex" xmlns:cx2="http://schemas.microsoft.com/office/drawing/2015/10/21/chartex" xmlns:cx3="http://schemas.microsoft.com/office/drawing/2016/5/9/chartex" xmlns:cx4="http://schemas.microsoft.com/office/drawing/2016/5/10/chartex" xmlns:cx5="http://schemas.microsoft.com/office/drawing/2016/5/11/chartex" xmlns:cx6="http://schemas.microsoft.com/office/drawing/2016/5/12/chartex" xmlns:cx7="http://schemas.microsoft.com/office/drawing/2016/5/13/chartex" xmlns:cx8="http://schemas.microsoft.com/office/drawing/2016/5/14/chartex" xmlns:mc="http://schemas.openxmlformats.org/markup-compatibility/2006" xmlns:aink="http://schemas.microsoft.com/office/drawing/2016/ink" xmlns:am3d="http://schemas.microsoft.com/office/drawing/2017/model3d" xmlns:o="urn:schemas-microsoft-com:office:office" xmlns:oel="http://schemas.microsoft.com/office/2019/extlst" xmlns:r="http://schemas.openxmlformats.org/officeDocument/2006/relationships" xmlns:m="http://schemas.openxmlformats.org/officeDocument/2006/math" xmlns:v="urn:schemas-microsoft-com:vml" xmlns:wp14="http://schemas.microsoft.com/office/word/2010/wordprocessingDrawing" xmlns:wp="http://schemas.openxmlformats.org/drawingml/2006/wordprocessingDrawing" xmlns:w10="urn:schemas-microsoft-com:office:word" xmlns:w="http://schemas.openxmlformats.org/wordprocessingml/2006/main" xmlns:w14="http://schemas.microsoft.com/office/word/2010/wordml" xmlns:w15="http://schemas.microsoft.com/office/word/2012/wordml" xmlns:w16cex="http://schemas.microsoft.com/office/word/2018/wordml/cex" xmlns:w16cid="http://schemas.microsoft.com/office/word/2016/wordml/cid" xmlns:w16="http://schemas.microsoft.com/office/word/2018/wordml" xmlns:w16du="http://schemas.microsoft.com/office/word/2023/wordml/word16du" xmlns:w16sdtdh="http://schemas.microsoft.com/office/word/2020/wordml/sdtdatahash" xmlns:w16sdtfl="http://schemas.microsoft.com/office/word/2024/wordml/sdtformatlock" xmlns:w16se="http://schemas.microsoft.com/office/word/2015/wordml/symex" xmlns:wpg="http://schemas.microsoft.com/office/word/2010/wordprocessingGroup" xmlns:wpi="http://schemas.microsoft.com/office/word/2010/wordprocessingInk" xmlns:wne="http://schemas.microsoft.com/office/word/2006/wordml" xmlns:wps="http://schemas.microsoft.com/office/word/2010/wordprocessingShape" mc:Ignorable="w14 w15 w16se w16cid w16 w16cex w16sdtdh w16sdtfl w16du wp14">
+  <w:p>
+    <w:pPr>
+      <w:pStyle w:val="Kopfzeile"/>
+      <w:tabs>
+        <w:tab w:val="clear" w:pos="4536"/>
+        <w:tab w:val="clear" w:pos="9072"/>
+        <w:tab w:val="center" w:pos="4861"/>
+      </w:tabs>
+      <w:rPr>
+        <w:noProof/>
+      </w:rPr>
+    </w:pPr>
+    <w:r>
+      <w:rPr>
+        <w:b/>
+        <w:bCs/>
+        <w:noProof/>
+        <w:sz w:val="36"/>
+        <w:szCs w:val="36"/>
+      </w:rPr>
+      <w:drawing>
+        <wp:anchor distT="0" distB="0" distL="114300" distR="114300" simplePos="0" relativeHeight="251672575" behindDoc="0" locked="0" layoutInCell="1" allowOverlap="1" wp14:anchorId="77288B09" wp14:editId="14BE03C0">
+          <wp:simplePos x="0" y="0"/>
+          <wp:positionH relativeFrom="column">
+            <wp:posOffset>3690620</wp:posOffset>
+          </wp:positionH>
+          <wp:positionV relativeFrom="paragraph">
+            <wp:posOffset>-136525</wp:posOffset>
+          </wp:positionV>
+          <wp:extent cx="2340000" cy="1990800"/>
+          <wp:effectExtent l="0" t="0" r="3175" b="9525"/>
+          <wp:wrapNone/>
+          <wp:docPr id="493092139" name="Grafik 493092139"/>
+          <wp:cNvGraphicFramePr>
+            <a:graphicFrameLocks xmlns:a="http://schemas.openxmlformats.org/drawingml/2006/main" noChangeAspect="1"/>
+          </wp:cNvGraphicFramePr>
+          <a:graphic xmlns:a="http://schemas.openxmlformats.org/drawingml/2006/main">
+            <a:graphicData uri="http://schemas.openxmlformats.org/drawingml/2006/picture">
+              <pic:pic xmlns:pic="http://schemas.openxmlformats.org/drawingml/2006/picture">
+                <pic:nvPicPr>
+                  <pic:cNvPr id="0" name="Picture 3"/>
+                  <pic:cNvPicPr>
+                    <a:picLocks noChangeAspect="1" noChangeArrowheads="1"/>
+                  </pic:cNvPicPr>
+                </pic:nvPicPr>
+                <pic:blipFill>
+                  <a:blip r:embed="rId1" cstate="print">
+                    <a:extLst>
+                      <a:ext uri="{28A0092B-C50C-407E-A947-70E740481C1C}">
+                        <a14:useLocalDpi xmlns:a14="http://schemas.microsoft.com/office/drawing/2010/main" val="0"/>
+                      </a:ext>
+                    </a:extLst>
+                  </a:blip>
+                  <a:srcRect/>
+                  <a:stretch>
+                    <a:fillRect/>
+                  </a:stretch>
+                </pic:blipFill>
+                <pic:spPr bwMode="auto">
+                  <a:xfrm>
+                    <a:off x="0" y="0"/>
+                    <a:ext cx="2340000" cy="1990800"/>
+                  </a:xfrm>
+                  <a:prstGeom prst="rect">
+                    <a:avLst/>
+                  </a:prstGeom>
+                  <a:noFill/>
+                  <a:ln>
+                    <a:noFill/>
+                  </a:ln>
+                </pic:spPr>
+              </pic:pic>
+            </a:graphicData>
+          </a:graphic>
+          <wp14:sizeRelH relativeFrom="margin">
+            <wp14:pctWidth>0</wp14:pctWidth>
+          </wp14:sizeRelH>
+          <wp14:sizeRelV relativeFrom="margin">
+            <wp14:pctHeight>0</wp14:pctHeight>
+          </wp14:sizeRelV>
+        </wp:anchor>
+      </w:drawing>
+    </w:r>
+  </w:p>
   <w:tbl>
     <w:tblPr>
       <w:tblStyle w:val="Tabellenraster"/>
@@ -2044,54 +2128,6 @@
               <w:sz w:val="36"/>
               <w:szCs w:val="36"/>
             </w:rPr>
-            <w:drawing>
-              <wp:inline distT="0" distB="0" distL="0" distR="0" wp14:anchorId="70F01CCD" wp14:editId="468DE86C">
-                <wp:extent cx="2215047" cy="1885063"/>
-                <wp:effectExtent l="0" t="0" r="0" b="1270"/>
-                <wp:docPr id="2027294060" name="Grafik 2027294060"/>
-                <wp:cNvGraphicFramePr>
-                  <a:graphicFrameLocks xmlns:a="http://schemas.openxmlformats.org/drawingml/2006/main" noChangeAspect="1"/>
-                </wp:cNvGraphicFramePr>
-                <a:graphic xmlns:a="http://schemas.openxmlformats.org/drawingml/2006/main">
-                  <a:graphicData uri="http://schemas.openxmlformats.org/drawingml/2006/picture">
-                    <pic:pic xmlns:pic="http://schemas.openxmlformats.org/drawingml/2006/picture">
-                      <pic:nvPicPr>
-                        <pic:cNvPr id="0" name="Picture 3"/>
-                        <pic:cNvPicPr>
-                          <a:picLocks noChangeAspect="1" noChangeArrowheads="1"/>
-                        </pic:cNvPicPr>
-                      </pic:nvPicPr>
-                      <pic:blipFill>
-                        <a:blip cstate="print">
-                          <a:extLst>
-                            <a:ext uri="{28A0092B-C50C-407E-A947-70E740481C1C}">
-                              <a14:useLocalDpi xmlns:a14="http://schemas.microsoft.com/office/drawing/2010/main" val="0"/>
-                            </a:ext>
-                          </a:extLst>
-                        </a:blip>
-                        <a:srcRect/>
-                        <a:stretch>
-                          <a:fillRect/>
-                        </a:stretch>
-                      </pic:blipFill>
-                      <pic:spPr bwMode="auto">
-                        <a:xfrm>
-                          <a:off x="0" y="0"/>
-                          <a:ext cx="2215047" cy="1885063"/>
-                        </a:xfrm>
-                        <a:prstGeom prst="rect">
-                          <a:avLst/>
-                        </a:prstGeom>
-                        <a:noFill/>
-                        <a:ln>
-                          <a:noFill/>
-                        </a:ln>
-                      </pic:spPr>
-                    </pic:pic>
-                  </a:graphicData>
-                </a:graphic>
-              </wp:inline>
-            </w:drawing>
           </w:r>
         </w:p>
       </w:tc>
@@ -2357,6 +2393,90 @@
 
 <file path=word/header2.xml><?xml version="1.0" encoding="utf-8"?>
 <w:hdr xmlns:wpc="http://schemas.microsoft.com/office/word/2010/wordprocessingCanvas" xmlns:cx="http://schemas.microsoft.com/office/drawing/2014/chartex" xmlns:cx1="http://schemas.microsoft.com/office/drawing/2015/9/8/chartex" xmlns:cx2="http://schemas.microsoft.com/office/drawing/2015/10/21/chartex" xmlns:cx3="http://schemas.microsoft.com/office/drawing/2016/5/9/chartex" xmlns:cx4="http://schemas.microsoft.com/office/drawing/2016/5/10/chartex" xmlns:cx5="http://schemas.microsoft.com/office/drawing/2016/5/11/chartex" xmlns:cx6="http://schemas.microsoft.com/office/drawing/2016/5/12/chartex" xmlns:cx7="http://schemas.microsoft.com/office/drawing/2016/5/13/chartex" xmlns:cx8="http://schemas.microsoft.com/office/drawing/2016/5/14/chartex" xmlns:mc="http://schemas.openxmlformats.org/markup-compatibility/2006" xmlns:aink="http://schemas.microsoft.com/office/drawing/2016/ink" xmlns:am3d="http://schemas.microsoft.com/office/drawing/2017/model3d" xmlns:o="urn:schemas-microsoft-com:office:office" xmlns:oel="http://schemas.microsoft.com/office/2019/extlst" xmlns:r="http://schemas.openxmlformats.org/officeDocument/2006/relationships" xmlns:m="http://schemas.openxmlformats.org/officeDocument/2006/math" xmlns:v="urn:schemas-microsoft-com:vml" xmlns:wp14="http://schemas.microsoft.com/office/word/2010/wordprocessingDrawing" xmlns:wp="http://schemas.openxmlformats.org/drawingml/2006/wordprocessingDrawing" xmlns:w10="urn:schemas-microsoft-com:office:word" xmlns:w="http://schemas.openxmlformats.org/wordprocessingml/2006/main" xmlns:w14="http://schemas.microsoft.com/office/word/2010/wordml" xmlns:w15="http://schemas.microsoft.com/office/word/2012/wordml" xmlns:w16cex="http://schemas.microsoft.com/office/word/2018/wordml/cex" xmlns:w16cid="http://schemas.microsoft.com/office/word/2016/wordml/cid" xmlns:w16="http://schemas.microsoft.com/office/word/2018/wordml" xmlns:w16du="http://schemas.microsoft.com/office/word/2023/wordml/word16du" xmlns:w16sdtdh="http://schemas.microsoft.com/office/word/2020/wordml/sdtdatahash" xmlns:w16sdtfl="http://schemas.microsoft.com/office/word/2024/wordml/sdtformatlock" xmlns:w16se="http://schemas.microsoft.com/office/word/2015/wordml/symex" xmlns:wpg="http://schemas.microsoft.com/office/word/2010/wordprocessingGroup" xmlns:wpi="http://schemas.microsoft.com/office/word/2010/wordprocessingInk" xmlns:wne="http://schemas.microsoft.com/office/word/2006/wordml" xmlns:wps="http://schemas.microsoft.com/office/word/2010/wordprocessingShape" mc:Ignorable="w14 w15 w16se w16cid w16 w16cex w16sdtdh w16sdtfl w16du wp14">
+  <w:p>
+    <w:pPr>
+      <w:pStyle w:val="Kopfzeile"/>
+      <w:tabs>
+        <w:tab w:val="clear" w:pos="4536"/>
+        <w:tab w:val="clear" w:pos="9072"/>
+        <w:tab w:val="center" w:pos="4861"/>
+      </w:tabs>
+      <w:rPr>
+        <w:noProof/>
+      </w:rPr>
+    </w:pPr>
+    <w:r>
+      <w:rPr>
+        <w:b/>
+        <w:bCs/>
+        <w:noProof/>
+        <w:sz w:val="36"/>
+        <w:szCs w:val="36"/>
+      </w:rPr>
+      <w:drawing>
+        <wp:anchor distT="0" distB="0" distL="114300" distR="114300" simplePos="0" relativeHeight="251672575" behindDoc="0" locked="0" layoutInCell="1" allowOverlap="1" wp14:anchorId="77288B09" wp14:editId="14BE03C0">
+          <wp:simplePos x="0" y="0"/>
+          <wp:positionH relativeFrom="column">
+            <wp:posOffset>3690620</wp:posOffset>
+          </wp:positionH>
+          <wp:positionV relativeFrom="paragraph">
+            <wp:posOffset>-136525</wp:posOffset>
+          </wp:positionV>
+          <wp:extent cx="2340000" cy="1990800"/>
+          <wp:effectExtent l="0" t="0" r="3175" b="9525"/>
+          <wp:wrapNone/>
+          <wp:docPr id="493092139" name="Grafik 493092139"/>
+          <wp:cNvGraphicFramePr>
+            <a:graphicFrameLocks xmlns:a="http://schemas.openxmlformats.org/drawingml/2006/main" noChangeAspect="1"/>
+          </wp:cNvGraphicFramePr>
+          <a:graphic xmlns:a="http://schemas.openxmlformats.org/drawingml/2006/main">
+            <a:graphicData uri="http://schemas.openxmlformats.org/drawingml/2006/picture">
+              <pic:pic xmlns:pic="http://schemas.openxmlformats.org/drawingml/2006/picture">
+                <pic:nvPicPr>
+                  <pic:cNvPr id="0" name="Picture 3"/>
+                  <pic:cNvPicPr>
+                    <a:picLocks noChangeAspect="1" noChangeArrowheads="1"/>
+                  </pic:cNvPicPr>
+                </pic:nvPicPr>
+                <pic:blipFill>
+                  <a:blip r:embed="rId1" cstate="print">
+                    <a:extLst>
+                      <a:ext uri="{28A0092B-C50C-407E-A947-70E740481C1C}">
+                        <a14:useLocalDpi xmlns:a14="http://schemas.microsoft.com/office/drawing/2010/main" val="0"/>
+                      </a:ext>
+                    </a:extLst>
+                  </a:blip>
+                  <a:srcRect/>
+                  <a:stretch>
+                    <a:fillRect/>
+                  </a:stretch>
+                </pic:blipFill>
+                <pic:spPr bwMode="auto">
+                  <a:xfrm>
+                    <a:off x="0" y="0"/>
+                    <a:ext cx="2340000" cy="1990800"/>
+                  </a:xfrm>
+                  <a:prstGeom prst="rect">
+                    <a:avLst/>
+                  </a:prstGeom>
+                  <a:noFill/>
+                  <a:ln>
+                    <a:noFill/>
+                  </a:ln>
+                </pic:spPr>
+              </pic:pic>
+            </a:graphicData>
+          </a:graphic>
+          <wp14:sizeRelH relativeFrom="margin">
+            <wp14:pctWidth>0</wp14:pctWidth>
+          </wp14:sizeRelH>
+          <wp14:sizeRelV relativeFrom="margin">
+            <wp14:pctHeight>0</wp14:pctHeight>
+          </wp14:sizeRelV>
+        </wp:anchor>
+      </w:drawing>
+    </w:r>
+  </w:p>
   <w:tbl>
     <w:tblPr>
       <w:tblStyle w:val="Tabellenraster"/>
@@ -2638,68 +2758,6 @@
               <w:sz w:val="36"/>
               <w:szCs w:val="36"/>
             </w:rPr>
-            <w:drawing>
-              <wp:anchor distT="0" distB="0" distL="114300" distR="114300" simplePos="0" relativeHeight="251674623" behindDoc="0" locked="0" layoutInCell="1" allowOverlap="1" wp14:anchorId="062D0E3A" wp14:editId="35A27A24">
-                <wp:simplePos x="0" y="0"/>
-                <wp:positionH relativeFrom="column">
-                  <wp:posOffset>713105</wp:posOffset>
-                </wp:positionH>
-                <wp:positionV relativeFrom="paragraph">
-                  <wp:posOffset>-779780</wp:posOffset>
-                </wp:positionV>
-                <wp:extent cx="2340000" cy="1990800"/>
-                <wp:effectExtent l="0" t="0" r="3175" b="9525"/>
-                <wp:wrapNone/>
-                <wp:docPr id="1734441756" name="Grafik 1734441756"/>
-                <wp:cNvGraphicFramePr>
-                  <a:graphicFrameLocks xmlns:a="http://schemas.openxmlformats.org/drawingml/2006/main" noChangeAspect="1"/>
-                </wp:cNvGraphicFramePr>
-                <a:graphic xmlns:a="http://schemas.openxmlformats.org/drawingml/2006/main">
-                  <a:graphicData uri="http://schemas.openxmlformats.org/drawingml/2006/picture">
-                    <pic:pic xmlns:pic="http://schemas.openxmlformats.org/drawingml/2006/picture">
-                      <pic:nvPicPr>
-                        <pic:cNvPr id="0" name="Picture 3"/>
-                        <pic:cNvPicPr>
-                          <a:picLocks noChangeAspect="1" noChangeArrowheads="1"/>
-                        </pic:cNvPicPr>
-                      </pic:nvPicPr>
-                      <pic:blipFill>
-                        <a:blip r:embed="rId1" cstate="print">
-                          <a:extLst>
-                            <a:ext uri="{28A0092B-C50C-407E-A947-70E740481C1C}">
-                              <a14:useLocalDpi xmlns:a14="http://schemas.microsoft.com/office/drawing/2010/main" val="0"/>
-                            </a:ext>
-                          </a:extLst>
-                        </a:blip>
-                        <a:srcRect/>
-                        <a:stretch>
-                          <a:fillRect/>
-                        </a:stretch>
-                      </pic:blipFill>
-                      <pic:spPr bwMode="auto">
-                        <a:xfrm>
-                          <a:off x="0" y="0"/>
-                          <a:ext cx="2340000" cy="1990800"/>
-                        </a:xfrm>
-                        <a:prstGeom prst="rect">
-                          <a:avLst/>
-                        </a:prstGeom>
-                        <a:noFill/>
-                        <a:ln>
-                          <a:noFill/>
-                        </a:ln>
-                      </pic:spPr>
-                    </pic:pic>
-                  </a:graphicData>
-                </a:graphic>
-                <wp14:sizeRelH relativeFrom="margin">
-                  <wp14:pctWidth>0</wp14:pctWidth>
-                </wp14:sizeRelH>
-                <wp14:sizeRelV relativeFrom="margin">
-                  <wp14:pctHeight>0</wp14:pctHeight>
-                </wp14:sizeRelV>
-              </wp:anchor>
-            </w:drawing>
           </w:r>
         </w:p>
         <w:p>

</xml_diff>

<commit_message>
Datumsanpassungen, (fehlendes oder fehlerhaftes Jahr im Leistungsdatum, ...)Namenskonvention für Rechnungen als DOCX und als PDF, Erweiterung CLI um no-reset bei Batch import Timesheets (service_data  reset vor Import)
</commit_message>
<xml_diff>
--- a/templates/rechnungsvorlage.docx
+++ b/templates/rechnungsvorlage.docx
@@ -17,35 +17,7 @@
         <w:rPr>
           <w:lang w:val="en-US"/>
         </w:rPr>
-        <w:t>{{</w:t>
-      </w:r>
-      <w:proofErr w:type="spellStart"/>
-      <w:r>
-        <w:rPr>
-          <w:lang w:val="en-US"/>
-        </w:rPr>
-        <w:t>provider_city</w:t>
-      </w:r>
-      <w:proofErr w:type="spellEnd"/>
-      <w:r>
-        <w:rPr>
-          <w:lang w:val="en-US"/>
-        </w:rPr>
-        <w:t>}}, den {{</w:t>
-      </w:r>
-      <w:proofErr w:type="spellStart"/>
-      <w:r>
-        <w:rPr>
-          <w:lang w:val="en-US"/>
-        </w:rPr>
-        <w:t>invoice_date|date</w:t>
-      </w:r>
-      <w:proofErr w:type="spellEnd"/>
-      <w:r>
-        <w:rPr>
-          <w:lang w:val="en-US"/>
-        </w:rPr>
-        <w:t>}}</w:t>
+        <w:t>{{provider_city}}, den {{invoice_date|date}}</w:t>
       </w:r>
     </w:p>
     <w:p>
@@ -72,7 +44,6 @@
           <w:lang w:val="en-US"/>
         </w:rPr>
       </w:pPr>
-      <w:proofErr w:type="spellStart"/>
       <w:r>
         <w:rPr>
           <w:rStyle w:val="Fett"/>
@@ -82,7 +53,6 @@
         </w:rPr>
         <w:t>Rechnungsnummer</w:t>
       </w:r>
-      <w:proofErr w:type="spellEnd"/>
       <w:r>
         <w:rPr>
           <w:rStyle w:val="Fett"/>
@@ -96,21 +66,7 @@
         <w:rPr>
           <w:lang w:val="en-US"/>
         </w:rPr>
-        <w:t>{{</w:t>
-      </w:r>
-      <w:proofErr w:type="spellStart"/>
-      <w:r>
-        <w:rPr>
-          <w:lang w:val="en-US"/>
-        </w:rPr>
-        <w:t>invoice_id</w:t>
-      </w:r>
-      <w:proofErr w:type="spellEnd"/>
-      <w:r>
-        <w:rPr>
-          <w:lang w:val="en-US"/>
-        </w:rPr>
-        <w:t>}}</w:t>
+        <w:t>{{invoice_id}}</w:t>
       </w:r>
     </w:p>
     <w:p>
@@ -129,16 +85,7 @@
           <w:bCs/>
           <w:lang w:val="en-US"/>
         </w:rPr>
-        <w:t>{{</w:t>
-      </w:r>
-      <w:proofErr w:type="spellStart"/>
-      <w:r>
-        <w:rPr>
-          <w:b/>
-          <w:bCs/>
-          <w:lang w:val="en-US"/>
-        </w:rPr>
-        <w:t>service_type</w:t>
+        <w:t>{{service_type</w:t>
       </w:r>
       <w:r>
         <w:rPr>
@@ -148,7 +95,6 @@
         </w:rPr>
         <w:t>_description</w:t>
       </w:r>
-      <w:proofErr w:type="spellEnd"/>
       <w:r>
         <w:rPr>
           <w:b/>
@@ -238,11 +184,9 @@
             <w:r>
               <w:t>{{</w:t>
             </w:r>
-            <w:proofErr w:type="spellStart"/>
             <w:r>
               <w:t>service_requester</w:t>
             </w:r>
-            <w:proofErr w:type="spellEnd"/>
             <w:r>
               <w:t>}}</w:t>
             </w:r>
@@ -284,7 +228,6 @@
             <w:r>
               <w:t>{{</w:t>
             </w:r>
-            <w:proofErr w:type="spellStart"/>
             <w:r>
               <w:t>client</w:t>
             </w:r>
@@ -294,7 +237,6 @@
             <w:r>
               <w:t>name</w:t>
             </w:r>
-            <w:proofErr w:type="spellEnd"/>
             <w:r>
               <w:t>}}</w:t>
             </w:r>
@@ -339,11 +281,9 @@
             <w:r>
               <w:t>{{</w:t>
             </w:r>
-            <w:proofErr w:type="spellStart"/>
             <w:r>
               <w:t>client.social_security_number</w:t>
             </w:r>
-            <w:proofErr w:type="spellEnd"/>
             <w:r>
               <w:t>}}</w:t>
             </w:r>
@@ -417,18 +357,8 @@
                 <w:szCs w:val="22"/>
               </w:rPr>
               <w:br/>
-            </w:r>
-            <w:proofErr w:type="spellStart"/>
-            <w:r>
-              <w:rPr>
-                <w:b w:val="0"/>
-                <w:bCs w:val="0"/>
-                <w:sz w:val="22"/>
-                <w:szCs w:val="22"/>
-              </w:rPr>
               <w:t>datum</w:t>
             </w:r>
-            <w:proofErr w:type="spellEnd"/>
           </w:p>
         </w:tc>
         <w:tc>
@@ -533,9 +463,8 @@
                 <w:sz w:val="22"/>
                 <w:szCs w:val="22"/>
               </w:rPr>
-              <w:t xml:space="preserve">Indirekte </w:t>
-            </w:r>
-            <w:proofErr w:type="spellStart"/>
+              <w:t>Indirekte Fallbe-</w:t>
+            </w:r>
             <w:r>
               <w:rPr>
                 <w:b w:val="0"/>
@@ -543,38 +472,9 @@
                 <w:sz w:val="22"/>
                 <w:szCs w:val="22"/>
               </w:rPr>
-              <w:t>Fallbe</w:t>
-            </w:r>
-            <w:proofErr w:type="spellEnd"/>
-            <w:r>
-              <w:rPr>
-                <w:b w:val="0"/>
-                <w:bCs w:val="0"/>
-                <w:sz w:val="22"/>
-                <w:szCs w:val="22"/>
-              </w:rPr>
-              <w:t>-</w:t>
-            </w:r>
-            <w:r>
-              <w:rPr>
-                <w:b w:val="0"/>
-                <w:bCs w:val="0"/>
-                <w:sz w:val="22"/>
-                <w:szCs w:val="22"/>
-              </w:rPr>
               <w:br/>
-            </w:r>
-            <w:proofErr w:type="spellStart"/>
-            <w:r>
-              <w:rPr>
-                <w:b w:val="0"/>
-                <w:bCs w:val="0"/>
-                <w:sz w:val="22"/>
-                <w:szCs w:val="22"/>
-              </w:rPr>
               <w:t>arbeitung</w:t>
             </w:r>
-            <w:proofErr w:type="spellEnd"/>
           </w:p>
         </w:tc>
         <w:tc>
@@ -686,7 +586,6 @@
               </w:rPr>
               <w:t xml:space="preserve"> </w:t>
             </w:r>
-            <w:proofErr w:type="spellStart"/>
             <w:r>
               <w:rPr>
                 <w:sz w:val="22"/>
@@ -694,7 +593,6 @@
               </w:rPr>
               <w:t>Leistungsdatum|date</w:t>
             </w:r>
-            <w:proofErr w:type="spellEnd"/>
           </w:p>
           <w:p>
             <w:pPr>
@@ -734,23 +632,7 @@
                 <w:sz w:val="22"/>
                 <w:szCs w:val="22"/>
               </w:rPr>
-              <w:t>{{</w:t>
-            </w:r>
-            <w:proofErr w:type="spellStart"/>
-            <w:r>
-              <w:rPr>
-                <w:sz w:val="22"/>
-                <w:szCs w:val="22"/>
-              </w:rPr>
-              <w:t>item.Fahrtzeit|minutes</w:t>
-            </w:r>
-            <w:proofErr w:type="spellEnd"/>
-            <w:r>
-              <w:rPr>
-                <w:sz w:val="22"/>
-                <w:szCs w:val="22"/>
-              </w:rPr>
-              <w:t>}}</w:t>
+              <w:t>{{item.Fahrtzeit|minutes}}</w:t>
             </w:r>
           </w:p>
         </w:tc>
@@ -773,23 +655,7 @@
                 <w:sz w:val="22"/>
                 <w:szCs w:val="22"/>
               </w:rPr>
-              <w:t>{{</w:t>
-            </w:r>
-            <w:proofErr w:type="spellStart"/>
-            <w:r>
-              <w:rPr>
-                <w:sz w:val="22"/>
-                <w:szCs w:val="22"/>
-              </w:rPr>
-              <w:t>item.Direkt|minutes</w:t>
-            </w:r>
-            <w:proofErr w:type="spellEnd"/>
-            <w:r>
-              <w:rPr>
-                <w:sz w:val="22"/>
-                <w:szCs w:val="22"/>
-              </w:rPr>
-              <w:t>}}</w:t>
+              <w:t>{{item.Direkt|minutes}}</w:t>
             </w:r>
           </w:p>
         </w:tc>
@@ -812,23 +678,7 @@
                 <w:sz w:val="22"/>
                 <w:szCs w:val="22"/>
               </w:rPr>
-              <w:t>{{</w:t>
-            </w:r>
-            <w:proofErr w:type="spellStart"/>
-            <w:r>
-              <w:rPr>
-                <w:sz w:val="22"/>
-                <w:szCs w:val="22"/>
-              </w:rPr>
-              <w:t>item.Indirekt|minutes</w:t>
-            </w:r>
-            <w:proofErr w:type="spellEnd"/>
-            <w:r>
-              <w:rPr>
-                <w:sz w:val="22"/>
-                <w:szCs w:val="22"/>
-              </w:rPr>
-              <w:t>}}</w:t>
+              <w:t>{{item.Indirekt|minutes}}</w:t>
             </w:r>
           </w:p>
         </w:tc>
@@ -851,23 +701,7 @@
                 <w:sz w:val="22"/>
                 <w:szCs w:val="22"/>
               </w:rPr>
-              <w:t>{{</w:t>
-            </w:r>
-            <w:proofErr w:type="spellStart"/>
-            <w:r>
-              <w:rPr>
-                <w:sz w:val="22"/>
-                <w:szCs w:val="22"/>
-              </w:rPr>
-              <w:t>item.Stunden|hhmm</w:t>
-            </w:r>
-            <w:proofErr w:type="spellEnd"/>
-            <w:r>
-              <w:rPr>
-                <w:sz w:val="22"/>
-                <w:szCs w:val="22"/>
-              </w:rPr>
-              <w:t>}}</w:t>
+              <w:t>{{item.Stunden|hhmm}}</w:t>
             </w:r>
           </w:p>
         </w:tc>
@@ -890,17 +724,8 @@
                 <w:sz w:val="22"/>
                 <w:szCs w:val="22"/>
               </w:rPr>
-              <w:t>{{</w:t>
-            </w:r>
-            <w:proofErr w:type="spellStart"/>
-            <w:r>
-              <w:rPr>
-                <w:sz w:val="22"/>
-                <w:szCs w:val="22"/>
-              </w:rPr>
-              <w:t>item.Kosten|currency</w:t>
-            </w:r>
-            <w:proofErr w:type="spellEnd"/>
+              <w:t>{{item.Kosten|currency</w:t>
+            </w:r>
             <w:r>
               <w:rPr>
                 <w:sz w:val="22"/>
@@ -930,23 +755,7 @@
                 <w:sz w:val="22"/>
                 <w:szCs w:val="22"/>
               </w:rPr>
-              <w:t xml:space="preserve">{% </w:t>
-            </w:r>
-            <w:proofErr w:type="spellStart"/>
-            <w:r>
-              <w:rPr>
-                <w:sz w:val="22"/>
-                <w:szCs w:val="22"/>
-              </w:rPr>
-              <w:t>endfor</w:t>
-            </w:r>
-            <w:proofErr w:type="spellEnd"/>
-            <w:r>
-              <w:rPr>
-                <w:sz w:val="22"/>
-                <w:szCs w:val="22"/>
-              </w:rPr>
-              <w:t xml:space="preserve"> %}</w:t>
+              <w:t>{% endfor %}</w:t>
             </w:r>
           </w:p>
         </w:tc>
@@ -1074,27 +883,7 @@
                 <w:sz w:val="22"/>
                 <w:szCs w:val="22"/>
               </w:rPr>
-              <w:t>{{</w:t>
-            </w:r>
-            <w:proofErr w:type="spellStart"/>
-            <w:r>
-              <w:rPr>
-                <w:b/>
-                <w:bCs/>
-                <w:sz w:val="22"/>
-                <w:szCs w:val="22"/>
-              </w:rPr>
-              <w:t>summe_fahrtzeit|minutes</w:t>
-            </w:r>
-            <w:proofErr w:type="spellEnd"/>
-            <w:r>
-              <w:rPr>
-                <w:b/>
-                <w:bCs/>
-                <w:sz w:val="22"/>
-                <w:szCs w:val="22"/>
-              </w:rPr>
-              <w:t>}}</w:t>
+              <w:t>{{summe_fahrtzeit|minutes}}</w:t>
             </w:r>
           </w:p>
         </w:tc>
@@ -1120,27 +909,7 @@
                 <w:sz w:val="22"/>
                 <w:szCs w:val="22"/>
               </w:rPr>
-              <w:t>{{</w:t>
-            </w:r>
-            <w:proofErr w:type="spellStart"/>
-            <w:r>
-              <w:rPr>
-                <w:b/>
-                <w:bCs/>
-                <w:sz w:val="22"/>
-                <w:szCs w:val="22"/>
-              </w:rPr>
-              <w:t>summe_direkt|minutes</w:t>
-            </w:r>
-            <w:proofErr w:type="spellEnd"/>
-            <w:r>
-              <w:rPr>
-                <w:b/>
-                <w:bCs/>
-                <w:sz w:val="22"/>
-                <w:szCs w:val="22"/>
-              </w:rPr>
-              <w:t>}}</w:t>
+              <w:t>{{summe_direkt|minutes}}</w:t>
             </w:r>
           </w:p>
         </w:tc>
@@ -1166,27 +935,7 @@
                 <w:sz w:val="22"/>
                 <w:szCs w:val="22"/>
               </w:rPr>
-              <w:t>{{</w:t>
-            </w:r>
-            <w:proofErr w:type="spellStart"/>
-            <w:r>
-              <w:rPr>
-                <w:b/>
-                <w:bCs/>
-                <w:sz w:val="22"/>
-                <w:szCs w:val="22"/>
-              </w:rPr>
-              <w:t>summe_indirekt|minutes</w:t>
-            </w:r>
-            <w:proofErr w:type="spellEnd"/>
-            <w:r>
-              <w:rPr>
-                <w:b/>
-                <w:bCs/>
-                <w:sz w:val="22"/>
-                <w:szCs w:val="22"/>
-              </w:rPr>
-              <w:t>}}</w:t>
+              <w:t>{{summe_indirekt|minutes}}</w:t>
             </w:r>
           </w:p>
         </w:tc>
@@ -1212,27 +961,7 @@
                 <w:sz w:val="22"/>
                 <w:szCs w:val="22"/>
               </w:rPr>
-              <w:t>{{</w:t>
-            </w:r>
-            <w:proofErr w:type="spellStart"/>
-            <w:r>
-              <w:rPr>
-                <w:b/>
-                <w:bCs/>
-                <w:sz w:val="22"/>
-                <w:szCs w:val="22"/>
-              </w:rPr>
-              <w:t>summe_stunden|minutes</w:t>
-            </w:r>
-            <w:proofErr w:type="spellEnd"/>
-            <w:r>
-              <w:rPr>
-                <w:b/>
-                <w:bCs/>
-                <w:sz w:val="22"/>
-                <w:szCs w:val="22"/>
-              </w:rPr>
-              <w:t>}}</w:t>
+              <w:t>{{summe_stunden|minutes}}</w:t>
             </w:r>
           </w:p>
         </w:tc>
@@ -1258,34 +987,13 @@
                 <w:sz w:val="22"/>
                 <w:szCs w:val="22"/>
               </w:rPr>
-              <w:t>{{</w:t>
-            </w:r>
-            <w:proofErr w:type="spellStart"/>
-            <w:r>
-              <w:rPr>
-                <w:b/>
-                <w:bCs/>
-                <w:sz w:val="22"/>
-                <w:szCs w:val="22"/>
-              </w:rPr>
-              <w:t>summe_kosten|currency</w:t>
-            </w:r>
-            <w:proofErr w:type="spellEnd"/>
-            <w:r>
-              <w:rPr>
-                <w:b/>
-                <w:bCs/>
-                <w:sz w:val="22"/>
-                <w:szCs w:val="22"/>
-              </w:rPr>
-              <w:t>}}</w:t>
+              <w:t>{{summe_kosten|currency}}</w:t>
             </w:r>
           </w:p>
         </w:tc>
       </w:tr>
       <w:tr>
         <w:trPr>
-          <w:cnfStyle w:val="000000100000" w:firstRow="0" w:lastRow="0" w:firstColumn="0" w:lastColumn="0" w:oddVBand="0" w:evenVBand="0" w:oddHBand="1" w:evenHBand="0" w:firstRowFirstColumn="0" w:firstRowLastColumn="0" w:lastRowFirstColumn="0" w:lastRowLastColumn="0"/>
           <w:trHeight w:val="454"/>
         </w:trPr>
         <w:tc>
@@ -1336,27 +1044,7 @@
                 <w:sz w:val="22"/>
                 <w:szCs w:val="22"/>
               </w:rPr>
-              <w:t>{{</w:t>
-            </w:r>
-            <w:proofErr w:type="spellStart"/>
-            <w:r>
-              <w:rPr>
-                <w:b/>
-                <w:bCs/>
-                <w:sz w:val="22"/>
-                <w:szCs w:val="22"/>
-              </w:rPr>
-              <w:t>summe_fahrtzeit|hhmm</w:t>
-            </w:r>
-            <w:proofErr w:type="spellEnd"/>
-            <w:r>
-              <w:rPr>
-                <w:b/>
-                <w:bCs/>
-                <w:sz w:val="22"/>
-                <w:szCs w:val="22"/>
-              </w:rPr>
-              <w:t>}}</w:t>
+              <w:t>{{summe_fahrtzeit|hhmm}}</w:t>
             </w:r>
           </w:p>
         </w:tc>
@@ -1382,27 +1070,7 @@
                 <w:sz w:val="22"/>
                 <w:szCs w:val="22"/>
               </w:rPr>
-              <w:t>{{</w:t>
-            </w:r>
-            <w:proofErr w:type="spellStart"/>
-            <w:r>
-              <w:rPr>
-                <w:b/>
-                <w:bCs/>
-                <w:sz w:val="22"/>
-                <w:szCs w:val="22"/>
-              </w:rPr>
-              <w:t>summe_direkt|hhmm</w:t>
-            </w:r>
-            <w:proofErr w:type="spellEnd"/>
-            <w:r>
-              <w:rPr>
-                <w:b/>
-                <w:bCs/>
-                <w:sz w:val="22"/>
-                <w:szCs w:val="22"/>
-              </w:rPr>
-              <w:t>}}</w:t>
+              <w:t>{{summe_direkt|hhmm}}</w:t>
             </w:r>
           </w:p>
         </w:tc>
@@ -1428,27 +1096,7 @@
                 <w:sz w:val="22"/>
                 <w:szCs w:val="22"/>
               </w:rPr>
-              <w:t>{{</w:t>
-            </w:r>
-            <w:proofErr w:type="spellStart"/>
-            <w:r>
-              <w:rPr>
-                <w:b/>
-                <w:bCs/>
-                <w:sz w:val="22"/>
-                <w:szCs w:val="22"/>
-              </w:rPr>
-              <w:t>summe_indirekt|hhmm</w:t>
-            </w:r>
-            <w:proofErr w:type="spellEnd"/>
-            <w:r>
-              <w:rPr>
-                <w:b/>
-                <w:bCs/>
-                <w:sz w:val="22"/>
-                <w:szCs w:val="22"/>
-              </w:rPr>
-              <w:t>}}</w:t>
+              <w:t>{{summe_indirekt|hhmm}}</w:t>
             </w:r>
           </w:p>
         </w:tc>
@@ -1474,27 +1122,7 @@
                 <w:sz w:val="22"/>
                 <w:szCs w:val="22"/>
               </w:rPr>
-              <w:t>{{</w:t>
-            </w:r>
-            <w:proofErr w:type="spellStart"/>
-            <w:r>
-              <w:rPr>
-                <w:b/>
-                <w:bCs/>
-                <w:sz w:val="22"/>
-                <w:szCs w:val="22"/>
-              </w:rPr>
-              <w:t>summe_stunden|hhmm</w:t>
-            </w:r>
-            <w:proofErr w:type="spellEnd"/>
-            <w:r>
-              <w:rPr>
-                <w:b/>
-                <w:bCs/>
-                <w:sz w:val="22"/>
-                <w:szCs w:val="22"/>
-              </w:rPr>
-              <w:t>}}</w:t>
+              <w:t>{{summe_stunden|hhmm}}</w:t>
             </w:r>
           </w:p>
         </w:tc>
@@ -1513,35 +1141,6 @@
                 <w:szCs w:val="22"/>
               </w:rPr>
             </w:pPr>
-            <w:r>
-              <w:rPr>
-                <w:b/>
-                <w:bCs/>
-                <w:sz w:val="22"/>
-                <w:szCs w:val="22"/>
-              </w:rPr>
-              <w:t/>
-            </w:r>
-            <w:proofErr w:type="spellStart"/>
-            <w:r>
-              <w:rPr>
-                <w:b/>
-                <w:bCs/>
-                <w:sz w:val="22"/>
-                <w:szCs w:val="22"/>
-              </w:rPr>
-              <w:t/>
-            </w:r>
-            <w:proofErr w:type="spellEnd"/>
-            <w:r>
-              <w:rPr>
-                <w:b/>
-                <w:bCs/>
-                <w:sz w:val="22"/>
-                <w:szCs w:val="22"/>
-              </w:rPr>
-              <w:t/>
-            </w:r>
           </w:p>
         </w:tc>
       </w:tr>
@@ -1615,11 +1214,9 @@
                             <w:r>
                               <w:t>{</w:t>
                             </w:r>
-                            <w:proofErr w:type="spellStart"/>
                             <w:r>
                               <w:t>payment_part</w:t>
                             </w:r>
-                            <w:proofErr w:type="spellEnd"/>
                             <w:r>
                               <w:t>}</w:t>
                             </w:r>
@@ -1689,8 +1286,10 @@
     <w:sectPr>
       <w:headerReference w:type="even" r:id="rId7"/>
       <w:headerReference w:type="default" r:id="rId8"/>
-      <w:headerReference w:type="first" r:id="rId9"/>
-      <w:footerReference w:type="first" r:id="rId10"/>
+      <w:footerReference w:type="even" r:id="rId9"/>
+      <w:footerReference w:type="default" r:id="rId10"/>
+      <w:headerReference w:type="first" r:id="rId11"/>
+      <w:footerReference w:type="first" r:id="rId12"/>
       <w:pgSz w:w="11906" w:h="16838"/>
       <w:pgMar w:top="1417" w:right="1417" w:bottom="1134" w:left="1417" w:header="708" w:footer="567" w:gutter="0"/>
       <w:cols w:space="708"/>
@@ -1722,6 +1321,26 @@
 
 <file path=word/footer1.xml><?xml version="1.0" encoding="utf-8"?>
 <w:ftr xmlns:wpc="http://schemas.microsoft.com/office/word/2010/wordprocessingCanvas" xmlns:cx="http://schemas.microsoft.com/office/drawing/2014/chartex" xmlns:cx1="http://schemas.microsoft.com/office/drawing/2015/9/8/chartex" xmlns:cx2="http://schemas.microsoft.com/office/drawing/2015/10/21/chartex" xmlns:cx3="http://schemas.microsoft.com/office/drawing/2016/5/9/chartex" xmlns:cx4="http://schemas.microsoft.com/office/drawing/2016/5/10/chartex" xmlns:cx5="http://schemas.microsoft.com/office/drawing/2016/5/11/chartex" xmlns:cx6="http://schemas.microsoft.com/office/drawing/2016/5/12/chartex" xmlns:cx7="http://schemas.microsoft.com/office/drawing/2016/5/13/chartex" xmlns:cx8="http://schemas.microsoft.com/office/drawing/2016/5/14/chartex" xmlns:mc="http://schemas.openxmlformats.org/markup-compatibility/2006" xmlns:aink="http://schemas.microsoft.com/office/drawing/2016/ink" xmlns:am3d="http://schemas.microsoft.com/office/drawing/2017/model3d" xmlns:o="urn:schemas-microsoft-com:office:office" xmlns:oel="http://schemas.microsoft.com/office/2019/extlst" xmlns:r="http://schemas.openxmlformats.org/officeDocument/2006/relationships" xmlns:m="http://schemas.openxmlformats.org/officeDocument/2006/math" xmlns:v="urn:schemas-microsoft-com:vml" xmlns:wp14="http://schemas.microsoft.com/office/word/2010/wordprocessingDrawing" xmlns:wp="http://schemas.openxmlformats.org/drawingml/2006/wordprocessingDrawing" xmlns:w10="urn:schemas-microsoft-com:office:word" xmlns:w="http://schemas.openxmlformats.org/wordprocessingml/2006/main" xmlns:w14="http://schemas.microsoft.com/office/word/2010/wordml" xmlns:w15="http://schemas.microsoft.com/office/word/2012/wordml" xmlns:w16cex="http://schemas.microsoft.com/office/word/2018/wordml/cex" xmlns:w16cid="http://schemas.microsoft.com/office/word/2016/wordml/cid" xmlns:w16="http://schemas.microsoft.com/office/word/2018/wordml" xmlns:w16du="http://schemas.microsoft.com/office/word/2023/wordml/word16du" xmlns:w16sdtdh="http://schemas.microsoft.com/office/word/2020/wordml/sdtdatahash" xmlns:w16sdtfl="http://schemas.microsoft.com/office/word/2024/wordml/sdtformatlock" xmlns:w16se="http://schemas.microsoft.com/office/word/2015/wordml/symex" xmlns:wpg="http://schemas.microsoft.com/office/word/2010/wordprocessingGroup" xmlns:wpi="http://schemas.microsoft.com/office/word/2010/wordprocessingInk" xmlns:wne="http://schemas.microsoft.com/office/word/2006/wordml" xmlns:wps="http://schemas.microsoft.com/office/word/2010/wordprocessingShape" mc:Ignorable="w14 w15 w16se w16cid w16 w16cex w16sdtdh w16sdtfl w16du wp14">
+  <w:p>
+    <w:pPr>
+      <w:pStyle w:val="Fuzeile"/>
+    </w:pPr>
+  </w:p>
+</w:ftr>
+</file>
+
+<file path=word/footer2.xml><?xml version="1.0" encoding="utf-8"?>
+<w:ftr xmlns:wpc="http://schemas.microsoft.com/office/word/2010/wordprocessingCanvas" xmlns:cx="http://schemas.microsoft.com/office/drawing/2014/chartex" xmlns:cx1="http://schemas.microsoft.com/office/drawing/2015/9/8/chartex" xmlns:cx2="http://schemas.microsoft.com/office/drawing/2015/10/21/chartex" xmlns:cx3="http://schemas.microsoft.com/office/drawing/2016/5/9/chartex" xmlns:cx4="http://schemas.microsoft.com/office/drawing/2016/5/10/chartex" xmlns:cx5="http://schemas.microsoft.com/office/drawing/2016/5/11/chartex" xmlns:cx6="http://schemas.microsoft.com/office/drawing/2016/5/12/chartex" xmlns:cx7="http://schemas.microsoft.com/office/drawing/2016/5/13/chartex" xmlns:cx8="http://schemas.microsoft.com/office/drawing/2016/5/14/chartex" xmlns:mc="http://schemas.openxmlformats.org/markup-compatibility/2006" xmlns:aink="http://schemas.microsoft.com/office/drawing/2016/ink" xmlns:am3d="http://schemas.microsoft.com/office/drawing/2017/model3d" xmlns:o="urn:schemas-microsoft-com:office:office" xmlns:oel="http://schemas.microsoft.com/office/2019/extlst" xmlns:r="http://schemas.openxmlformats.org/officeDocument/2006/relationships" xmlns:m="http://schemas.openxmlformats.org/officeDocument/2006/math" xmlns:v="urn:schemas-microsoft-com:vml" xmlns:wp14="http://schemas.microsoft.com/office/word/2010/wordprocessingDrawing" xmlns:wp="http://schemas.openxmlformats.org/drawingml/2006/wordprocessingDrawing" xmlns:w10="urn:schemas-microsoft-com:office:word" xmlns:w="http://schemas.openxmlformats.org/wordprocessingml/2006/main" xmlns:w14="http://schemas.microsoft.com/office/word/2010/wordml" xmlns:w15="http://schemas.microsoft.com/office/word/2012/wordml" xmlns:w16cex="http://schemas.microsoft.com/office/word/2018/wordml/cex" xmlns:w16cid="http://schemas.microsoft.com/office/word/2016/wordml/cid" xmlns:w16="http://schemas.microsoft.com/office/word/2018/wordml" xmlns:w16du="http://schemas.microsoft.com/office/word/2023/wordml/word16du" xmlns:w16sdtdh="http://schemas.microsoft.com/office/word/2020/wordml/sdtdatahash" xmlns:w16sdtfl="http://schemas.microsoft.com/office/word/2024/wordml/sdtformatlock" xmlns:w16se="http://schemas.microsoft.com/office/word/2015/wordml/symex" xmlns:wpg="http://schemas.microsoft.com/office/word/2010/wordprocessingGroup" xmlns:wpi="http://schemas.microsoft.com/office/word/2010/wordprocessingInk" xmlns:wne="http://schemas.microsoft.com/office/word/2006/wordml" xmlns:wps="http://schemas.microsoft.com/office/word/2010/wordprocessingShape" mc:Ignorable="w14 w15 w16se w16cid w16 w16cex w16sdtdh w16sdtfl w16du wp14">
+  <w:p>
+    <w:pPr>
+      <w:pStyle w:val="Fuzeile"/>
+    </w:pPr>
+  </w:p>
+</w:ftr>
+</file>
+
+<file path=word/footer3.xml><?xml version="1.0" encoding="utf-8"?>
+<w:ftr xmlns:wpc="http://schemas.microsoft.com/office/word/2010/wordprocessingCanvas" xmlns:cx="http://schemas.microsoft.com/office/drawing/2014/chartex" xmlns:cx1="http://schemas.microsoft.com/office/drawing/2015/9/8/chartex" xmlns:cx2="http://schemas.microsoft.com/office/drawing/2015/10/21/chartex" xmlns:cx3="http://schemas.microsoft.com/office/drawing/2016/5/9/chartex" xmlns:cx4="http://schemas.microsoft.com/office/drawing/2016/5/10/chartex" xmlns:cx5="http://schemas.microsoft.com/office/drawing/2016/5/11/chartex" xmlns:cx6="http://schemas.microsoft.com/office/drawing/2016/5/12/chartex" xmlns:cx7="http://schemas.microsoft.com/office/drawing/2016/5/13/chartex" xmlns:cx8="http://schemas.microsoft.com/office/drawing/2016/5/14/chartex" xmlns:mc="http://schemas.openxmlformats.org/markup-compatibility/2006" xmlns:aink="http://schemas.microsoft.com/office/drawing/2016/ink" xmlns:am3d="http://schemas.microsoft.com/office/drawing/2017/model3d" xmlns:o="urn:schemas-microsoft-com:office:office" xmlns:oel="http://schemas.microsoft.com/office/2019/extlst" xmlns:r="http://schemas.openxmlformats.org/officeDocument/2006/relationships" xmlns:m="http://schemas.openxmlformats.org/officeDocument/2006/math" xmlns:v="urn:schemas-microsoft-com:vml" xmlns:wp14="http://schemas.microsoft.com/office/word/2010/wordprocessingDrawing" xmlns:wp="http://schemas.openxmlformats.org/drawingml/2006/wordprocessingDrawing" xmlns:w10="urn:schemas-microsoft-com:office:word" xmlns:w="http://schemas.openxmlformats.org/wordprocessingml/2006/main" xmlns:w14="http://schemas.microsoft.com/office/word/2010/wordml" xmlns:w15="http://schemas.microsoft.com/office/word/2012/wordml" xmlns:w16cex="http://schemas.microsoft.com/office/word/2018/wordml/cex" xmlns:w16cid="http://schemas.microsoft.com/office/word/2016/wordml/cid" xmlns:w16="http://schemas.microsoft.com/office/word/2018/wordml" xmlns:w16du="http://schemas.microsoft.com/office/word/2023/wordml/word16du" xmlns:w16sdtdh="http://schemas.microsoft.com/office/word/2020/wordml/sdtdatahash" xmlns:w16sdtfl="http://schemas.microsoft.com/office/word/2024/wordml/sdtformatlock" xmlns:w16se="http://schemas.microsoft.com/office/word/2015/wordml/symex" xmlns:wpg="http://schemas.microsoft.com/office/word/2010/wordprocessingGroup" xmlns:wpi="http://schemas.microsoft.com/office/word/2010/wordprocessingInk" xmlns:wne="http://schemas.microsoft.com/office/word/2006/wordml" xmlns:wps="http://schemas.microsoft.com/office/word/2010/wordprocessingShape" mc:Ignorable="w14 w15 w16se w16cid w16 w16cex w16sdtdh w16sdtfl w16du wp14">
   <w:tbl>
     <w:tblPr>
       <w:tblStyle w:val="Tabellenraster"/>
@@ -1752,12 +1371,14 @@
             <w:rPr>
               <w:sz w:val="22"/>
               <w:szCs w:val="22"/>
+              <w:lang w:val="en-US"/>
             </w:rPr>
           </w:pPr>
           <w:r>
             <w:rPr>
               <w:sz w:val="22"/>
               <w:szCs w:val="22"/>
+              <w:lang w:val="en-US"/>
             </w:rPr>
             <w:t>Wegpiraten GmbH</w:t>
           </w:r>
@@ -1765,80 +1386,79 @@
             <w:rPr>
               <w:sz w:val="22"/>
               <w:szCs w:val="22"/>
+              <w:lang w:val="en-US"/>
             </w:rPr>
             <w:br/>
           </w:r>
-          <w:proofErr w:type="spellStart"/>
           <w:r>
             <w:rPr>
               <w:sz w:val="22"/>
               <w:szCs w:val="22"/>
-            </w:rPr>
-            <w:t>Hauptstra</w:t>
+              <w:lang w:val="en-US"/>
+            </w:rPr>
+            <w:t>{{t</w:t>
           </w:r>
           <w:r>
             <w:rPr>
               <w:sz w:val="22"/>
               <w:szCs w:val="22"/>
-            </w:rPr>
-            <w:t>ss</w:t>
+              <w:lang w:val="en-US"/>
+            </w:rPr>
+            <w:t>enant_street}}</w:t>
           </w:r>
           <w:r>
             <w:rPr>
               <w:sz w:val="22"/>
               <w:szCs w:val="22"/>
-            </w:rPr>
-            <w:t>e</w:t>
-          </w:r>
-          <w:proofErr w:type="spellEnd"/>
+              <w:lang w:val="en-US"/>
+            </w:rPr>
+            <w:br/>
+          </w:r>
           <w:r>
             <w:rPr>
               <w:sz w:val="22"/>
               <w:szCs w:val="22"/>
-            </w:rPr>
-            <w:t xml:space="preserve"> 47</w:t>
+              <w:lang w:val="en-US"/>
+            </w:rPr>
+            <w:t>{{tenant_zip}}</w:t>
           </w:r>
           <w:r>
             <w:rPr>
               <w:sz w:val="22"/>
               <w:szCs w:val="22"/>
-            </w:rPr>
-            <w:br/>
+              <w:lang w:val="en-US"/>
+            </w:rPr>
+            <w:t xml:space="preserve"> </w:t>
           </w:r>
           <w:r>
             <w:rPr>
               <w:sz w:val="22"/>
               <w:szCs w:val="22"/>
-            </w:rPr>
-            <w:t xml:space="preserve">3800 </w:t>
+              <w:lang w:val="en-US"/>
+            </w:rPr>
+            <w:t>{{</w:t>
           </w:r>
           <w:r>
             <w:rPr>
               <w:sz w:val="22"/>
               <w:szCs w:val="22"/>
-            </w:rPr>
-            <w:t>{{</w:t>
-          </w:r>
-          <w:proofErr w:type="spellStart"/>
+              <w:lang w:val="en-US"/>
+            </w:rPr>
+            <w:t>tenant</w:t>
+          </w:r>
           <w:r>
             <w:rPr>
               <w:sz w:val="22"/>
               <w:szCs w:val="22"/>
-            </w:rPr>
-            <w:t>provider_city</w:t>
-          </w:r>
-          <w:proofErr w:type="spellEnd"/>
+              <w:lang w:val="en-US"/>
+            </w:rPr>
+            <w:t>_city}}</w:t>
+          </w:r>
           <w:r>
             <w:rPr>
               <w:sz w:val="22"/>
               <w:szCs w:val="22"/>
-            </w:rPr>
-            <w:t>}}</w:t>
-          </w:r>
-          <w:r>
-            <w:rPr>
-              <w:sz w:val="22"/>
-              <w:szCs w:val="22"/>
+              <w:lang w:val="en-US"/>
             </w:rPr>
             <w:t xml:space="preserve"> </w:t>
           </w:r>
@@ -1950,7 +1570,14 @@
               <w:sz w:val="22"/>
               <w:szCs w:val="22"/>
             </w:rPr>
-            <w:t>IBAN: CH07 0839 3053 8385 3915 1</w:t>
+            <w:t xml:space="preserve">IBAN: </w:t>
+          </w:r>
+          <w:r>
+            <w:rPr>
+              <w:sz w:val="22"/>
+              <w:szCs w:val="22"/>
+            </w:rPr>
+            <w:t>{{tenant_iban}}</w:t>
           </w:r>
         </w:p>
       </w:tc>
@@ -2006,7 +1633,7 @@
         <w:szCs w:val="36"/>
       </w:rPr>
       <w:drawing>
-        <wp:anchor distT="0" distB="0" distL="114300" distR="114300" simplePos="0" relativeHeight="251672575" behindDoc="0" locked="0" layoutInCell="1" allowOverlap="1" wp14:anchorId="77288B09" wp14:editId="14BE03C0">
+        <wp:anchor distT="0" distB="0" distL="114300" distR="114300" simplePos="0" relativeHeight="251656704" behindDoc="0" locked="0" layoutInCell="1" allowOverlap="1" wp14:anchorId="77288B09" wp14:editId="14BE03C0">
           <wp:simplePos x="0" y="0"/>
           <wp:positionH relativeFrom="column">
             <wp:posOffset>3690620</wp:posOffset>
@@ -2084,8 +1711,8 @@
       <w:tblLook w:val="04A0" w:firstRow="1" w:lastRow="0" w:firstColumn="1" w:lastColumn="0" w:noHBand="0" w:noVBand="1"/>
     </w:tblPr>
     <w:tblGrid>
-      <w:gridCol w:w="5019"/>
-      <w:gridCol w:w="4889"/>
+      <w:gridCol w:w="4531"/>
+      <w:gridCol w:w="4962"/>
     </w:tblGrid>
     <w:tr>
       <w:trPr>
@@ -2120,15 +1747,6 @@
           <w:r>
             <w:tab/>
           </w:r>
-          <w:r>
-            <w:rPr>
-              <w:b/>
-              <w:bCs/>
-              <w:noProof/>
-              <w:sz w:val="36"/>
-              <w:szCs w:val="36"/>
-            </w:rPr>
-          </w:r>
         </w:p>
       </w:tc>
       <w:tc>
@@ -2196,15 +1814,7 @@
             <w:t xml:space="preserve">3800 </w:t>
           </w:r>
           <w:r>
-            <w:t>{{</w:t>
-          </w:r>
-          <w:proofErr w:type="spellStart"/>
-          <w:r>
-            <w:t>provider_city</w:t>
-          </w:r>
-          <w:proofErr w:type="spellEnd"/>
-          <w:r>
-            <w:t>}}</w:t>
+            <w:t>{{provider_city}}</w:t>
           </w:r>
         </w:p>
       </w:tc>
@@ -2323,15 +1933,7 @@
                   <w:jc w:val="right"/>
                 </w:pPr>
                 <w:r>
-                  <w:t>{{</w:t>
-                </w:r>
-                <w:proofErr w:type="spellStart"/>
-                <w:r>
-                  <w:t>payer.street</w:t>
-                </w:r>
-                <w:proofErr w:type="spellEnd"/>
-                <w:r>
-                  <w:t>}}</w:t>
+                  <w:t>{{payer.street}}</w:t>
                 </w:r>
               </w:p>
             </w:tc>
@@ -2356,15 +1958,7 @@
                   <w:jc w:val="right"/>
                 </w:pPr>
                 <w:r>
-                  <w:t>{{</w:t>
-                </w:r>
-                <w:proofErr w:type="spellStart"/>
-                <w:r>
-                  <w:t>payer.zip_city</w:t>
-                </w:r>
-                <w:proofErr w:type="spellEnd"/>
-                <w:r>
-                  <w:t>}}</w:t>
+                  <w:t>{{payer.zip_city}}</w:t>
                 </w:r>
               </w:p>
             </w:tc>
@@ -2414,7 +2008,7 @@
         <w:szCs w:val="36"/>
       </w:rPr>
       <w:drawing>
-        <wp:anchor distT="0" distB="0" distL="114300" distR="114300" simplePos="0" relativeHeight="251672575" behindDoc="0" locked="0" layoutInCell="1" allowOverlap="1" wp14:anchorId="77288B09" wp14:editId="14BE03C0">
+        <wp:anchor distT="0" distB="0" distL="114300" distR="114300" simplePos="0" relativeHeight="251658752" behindDoc="0" locked="0" layoutInCell="1" allowOverlap="1" wp14:anchorId="77288B09" wp14:editId="14BE03C0">
           <wp:simplePos x="0" y="0"/>
           <wp:positionH relativeFrom="column">
             <wp:posOffset>3690620</wp:posOffset>
@@ -2425,7 +2019,7 @@
           <wp:extent cx="2340000" cy="1990800"/>
           <wp:effectExtent l="0" t="0" r="3175" b="9525"/>
           <wp:wrapNone/>
-          <wp:docPr id="493092139" name="Grafik 493092139"/>
+          <wp:docPr id="1883434486" name="Grafik 1883434486"/>
           <wp:cNvGraphicFramePr>
             <a:graphicFrameLocks xmlns:a="http://schemas.openxmlformats.org/drawingml/2006/main" noChangeAspect="1"/>
           </wp:cNvGraphicFramePr>
@@ -2620,6 +2214,7 @@
         <w:p>
           <w:pPr>
             <w:rPr>
+              <w:lang w:val="en-US"/>
               <w14:textOutline w14:w="9525" w14:cap="rnd" w14:cmpd="sng" w14:algn="ctr">
                 <w14:noFill/>
                 <w14:prstDash w14:val="solid"/>
@@ -2629,6 +2224,7 @@
           </w:pPr>
           <w:r>
             <w:rPr>
+              <w:lang w:val="en-US"/>
               <w14:textOutline w14:w="9525" w14:cap="rnd" w14:cmpd="sng" w14:algn="ctr">
                 <w14:noFill/>
                 <w14:prstDash w14:val="solid"/>
@@ -2639,6 +2235,7 @@
           </w:r>
           <w:r>
             <w:rPr>
+              <w:lang w:val="en-US"/>
               <w14:textOutline w14:w="9525" w14:cap="rnd" w14:cmpd="sng" w14:algn="ctr">
                 <w14:noFill/>
                 <w14:prstDash w14:val="solid"/>
@@ -2647,80 +2244,71 @@
             </w:rPr>
             <w:br/>
           </w:r>
-          <w:proofErr w:type="spellStart"/>
-          <w:r>
-            <w:rPr>
+          <w:r>
+            <w:rPr>
+              <w:lang w:val="en-US"/>
               <w14:textOutline w14:w="9525" w14:cap="rnd" w14:cmpd="sng" w14:algn="ctr">
                 <w14:noFill/>
                 <w14:prstDash w14:val="solid"/>
                 <w14:bevel/>
               </w14:textOutline>
             </w:rPr>
-            <w:t>Hauptstra</w:t>
-          </w:r>
-          <w:r>
-            <w:rPr>
+            <w:t>{{tenant_street}}</w:t>
+          </w:r>
+          <w:r>
+            <w:rPr>
+              <w:lang w:val="en-US"/>
               <w14:textOutline w14:w="9525" w14:cap="rnd" w14:cmpd="sng" w14:algn="ctr">
                 <w14:noFill/>
                 <w14:prstDash w14:val="solid"/>
                 <w14:bevel/>
               </w14:textOutline>
             </w:rPr>
-            <w:t>ss</w:t>
-          </w:r>
-          <w:r>
-            <w:rPr>
+            <w:br/>
+          </w:r>
+          <w:r>
+            <w:rPr>
+              <w:lang w:val="en-US"/>
               <w14:textOutline w14:w="9525" w14:cap="rnd" w14:cmpd="sng" w14:algn="ctr">
                 <w14:noFill/>
                 <w14:prstDash w14:val="solid"/>
                 <w14:bevel/>
               </w14:textOutline>
             </w:rPr>
-            <w:t>e</w:t>
-          </w:r>
-          <w:proofErr w:type="spellEnd"/>
-          <w:r>
-            <w:rPr>
+            <w:t>{{tenant_zip}}</w:t>
+          </w:r>
+          <w:r>
+            <w:rPr>
+              <w:lang w:val="en-US"/>
               <w14:textOutline w14:w="9525" w14:cap="rnd" w14:cmpd="sng" w14:algn="ctr">
                 <w14:noFill/>
                 <w14:prstDash w14:val="solid"/>
                 <w14:bevel/>
               </w14:textOutline>
             </w:rPr>
-            <w:t xml:space="preserve"> 47</w:t>
-          </w:r>
-          <w:r>
-            <w:rPr>
+            <w:t xml:space="preserve"> {{</w:t>
+          </w:r>
+          <w:r>
+            <w:rPr>
+              <w:lang w:val="en-US"/>
               <w14:textOutline w14:w="9525" w14:cap="rnd" w14:cmpd="sng" w14:algn="ctr">
                 <w14:noFill/>
                 <w14:prstDash w14:val="solid"/>
                 <w14:bevel/>
               </w14:textOutline>
             </w:rPr>
-            <w:br/>
-            <w:t>3800 {{</w:t>
-          </w:r>
-          <w:proofErr w:type="spellStart"/>
-          <w:r>
-            <w:rPr>
+            <w:t>tenant</w:t>
+          </w:r>
+          <w:r>
+            <w:rPr>
+              <w:lang w:val="en-US"/>
               <w14:textOutline w14:w="9525" w14:cap="rnd" w14:cmpd="sng" w14:algn="ctr">
                 <w14:noFill/>
                 <w14:prstDash w14:val="solid"/>
                 <w14:bevel/>
               </w14:textOutline>
             </w:rPr>
-            <w:t>provider_city</w:t>
-          </w:r>
-          <w:proofErr w:type="spellEnd"/>
-          <w:r>
-            <w:rPr>
-              <w14:textOutline w14:w="9525" w14:cap="rnd" w14:cmpd="sng" w14:algn="ctr">
-                <w14:noFill/>
-                <w14:prstDash w14:val="solid"/>
-                <w14:bevel/>
-              </w14:textOutline>
-            </w:rPr>
-            <w:t>}}</w:t>
+            <w:t>_city}}</w:t>
           </w:r>
         </w:p>
         <w:p>
@@ -2734,6 +2322,7 @@
             <w:rPr>
               <w:b/>
               <w:bCs/>
+              <w:lang w:val="en-US"/>
             </w:rPr>
           </w:pPr>
         </w:p>
@@ -2749,16 +2338,10 @@
             </w:tabs>
             <w:ind w:left="108"/>
             <w:jc w:val="right"/>
-          </w:pPr>
-          <w:r>
-            <w:rPr>
-              <w:b/>
-              <w:bCs/>
-              <w:noProof/>
-              <w:sz w:val="36"/>
-              <w:szCs w:val="36"/>
-            </w:rPr>
-          </w:r>
+            <w:rPr>
+              <w:lang w:val="en-US"/>
+            </w:rPr>
+          </w:pPr>
         </w:p>
         <w:p>
           <w:pPr>
@@ -2767,6 +2350,9 @@
             </w:tabs>
             <w:ind w:left="108"/>
             <w:jc w:val="right"/>
+            <w:rPr>
+              <w:lang w:val="en-US"/>
+            </w:rPr>
           </w:pPr>
         </w:p>
         <w:p>
@@ -2776,6 +2362,9 @@
             </w:tabs>
             <w:ind w:left="108"/>
             <w:jc w:val="right"/>
+            <w:rPr>
+              <w:lang w:val="en-US"/>
+            </w:rPr>
           </w:pPr>
         </w:p>
         <w:p>
@@ -2785,6 +2374,9 @@
             </w:tabs>
             <w:ind w:left="108"/>
             <w:jc w:val="right"/>
+            <w:rPr>
+              <w:lang w:val="en-US"/>
+            </w:rPr>
           </w:pPr>
         </w:p>
         <w:p>
@@ -2795,6 +2387,7 @@
             <w:rPr>
               <w:b/>
               <w:bCs/>
+              <w:lang w:val="en-US"/>
             </w:rPr>
           </w:pPr>
         </w:p>
@@ -2819,6 +2412,7 @@
             <w:rPr>
               <w:b/>
               <w:bCs/>
+              <w:lang w:val="en-US"/>
             </w:rPr>
           </w:pPr>
         </w:p>
@@ -2840,27 +2434,11 @@
           </w:r>
           <w:r>
             <w:br/>
-            <w:t>{{</w:t>
-          </w:r>
-          <w:proofErr w:type="spellStart"/>
-          <w:r>
-            <w:t>payer.street</w:t>
-          </w:r>
-          <w:proofErr w:type="spellEnd"/>
-          <w:r>
-            <w:t>}}</w:t>
+            <w:t>{{payer.street}}</w:t>
           </w:r>
           <w:r>
             <w:br/>
-            <w:t>{{</w:t>
-          </w:r>
-          <w:proofErr w:type="spellStart"/>
-          <w:r>
-            <w:t>payer.zip_city</w:t>
-          </w:r>
-          <w:proofErr w:type="spellEnd"/>
-          <w:r>
-            <w:t>}}</w:t>
+            <w:t>{{payer.zip_city}}</w:t>
           </w:r>
         </w:p>
         <w:p>
@@ -2906,7 +2484,7 @@
         <w:szCs w:val="36"/>
       </w:rPr>
       <w:drawing>
-        <wp:anchor distT="0" distB="0" distL="114300" distR="114300" simplePos="0" relativeHeight="251672575" behindDoc="0" locked="0" layoutInCell="1" allowOverlap="1" wp14:anchorId="77288B09" wp14:editId="14BE03C0">
+        <wp:anchor distT="0" distB="0" distL="114300" distR="114300" simplePos="0" relativeHeight="251657728" behindDoc="0" locked="0" layoutInCell="1" allowOverlap="1" wp14:anchorId="77288B09" wp14:editId="14BE03C0">
           <wp:simplePos x="0" y="0"/>
           <wp:positionH relativeFrom="column">
             <wp:posOffset>3690620</wp:posOffset>
@@ -2917,7 +2495,7 @@
           <wp:extent cx="2340000" cy="1990800"/>
           <wp:effectExtent l="0" t="0" r="3175" b="9525"/>
           <wp:wrapNone/>
-          <wp:docPr id="493092139" name="Grafik 493092139"/>
+          <wp:docPr id="1179070576" name="Grafik 1179070576"/>
           <wp:cNvGraphicFramePr>
             <a:graphicFrameLocks xmlns:a="http://schemas.openxmlformats.org/drawingml/2006/main" noChangeAspect="1"/>
           </wp:cNvGraphicFramePr>
@@ -3139,7 +2717,6 @@
             </w:rPr>
             <w:br/>
           </w:r>
-          <w:proofErr w:type="spellStart"/>
           <w:r>
             <w:rPr>
               <w14:textOutline w14:w="9525" w14:cap="rnd" w14:cmpd="sng" w14:algn="ctr">
@@ -3148,7 +2725,7 @@
                 <w14:bevel/>
               </w14:textOutline>
             </w:rPr>
-            <w:t>Hauptstra</w:t>
+            <w:t xml:space="preserve">{{tenant_street}} </w:t>
           </w:r>
           <w:r>
             <w:rPr>
@@ -3158,7 +2735,7 @@
                 <w14:bevel/>
               </w14:textOutline>
             </w:rPr>
-            <w:t>ss</w:t>
+            <w:br/>
           </w:r>
           <w:r>
             <w:rPr>
@@ -3168,9 +2745,8 @@
                 <w14:bevel/>
               </w14:textOutline>
             </w:rPr>
-            <w:t>e</w:t>
-          </w:r>
-          <w:proofErr w:type="spellEnd"/>
+            <w:t>{{tenant_zip}}</w:t>
+          </w:r>
           <w:r>
             <w:rPr>
               <w14:textOutline w14:w="9525" w14:cap="rnd" w14:cmpd="sng" w14:algn="ctr">
@@ -3179,7 +2755,7 @@
                 <w14:bevel/>
               </w14:textOutline>
             </w:rPr>
-            <w:t xml:space="preserve"> 47</w:t>
+            <w:t xml:space="preserve"> {{</w:t>
           </w:r>
           <w:r>
             <w:rPr>
@@ -3189,10 +2765,8 @@
                 <w14:bevel/>
               </w14:textOutline>
             </w:rPr>
-            <w:br/>
-            <w:t>3800 {{</w:t>
-          </w:r>
-          <w:proofErr w:type="spellStart"/>
+            <w:t>tenant</w:t>
+          </w:r>
           <w:r>
             <w:rPr>
               <w14:textOutline w14:w="9525" w14:cap="rnd" w14:cmpd="sng" w14:algn="ctr">
@@ -3201,18 +2775,7 @@
                 <w14:bevel/>
               </w14:textOutline>
             </w:rPr>
-            <w:t>provider_city</w:t>
-          </w:r>
-          <w:proofErr w:type="spellEnd"/>
-          <w:r>
-            <w:rPr>
-              <w14:textOutline w14:w="9525" w14:cap="rnd" w14:cmpd="sng" w14:algn="ctr">
-                <w14:noFill/>
-                <w14:prstDash w14:val="solid"/>
-                <w14:bevel/>
-              </w14:textOutline>
-            </w:rPr>
-            <w:t>}}</w:t>
+            <w:t>_city}}</w:t>
           </w:r>
         </w:p>
         <w:p>
@@ -3323,27 +2886,11 @@
           </w:r>
           <w:r>
             <w:br/>
-            <w:t>{{</w:t>
-          </w:r>
-          <w:proofErr w:type="spellStart"/>
-          <w:r>
-            <w:t>payer.street</w:t>
-          </w:r>
-          <w:proofErr w:type="spellEnd"/>
-          <w:r>
-            <w:t>}}</w:t>
+            <w:t>{{payer.street}}</w:t>
           </w:r>
           <w:r>
             <w:br/>
-            <w:t>{{</w:t>
-          </w:r>
-          <w:proofErr w:type="spellStart"/>
-          <w:r>
-            <w:t>payer.zip_city</w:t>
-          </w:r>
-          <w:proofErr w:type="spellEnd"/>
-          <w:r>
-            <w:t>}}</w:t>
+            <w:t>{{payer.zip_city}}</w:t>
           </w:r>
         </w:p>
         <w:p>

</xml_diff>

<commit_message>
Bugfix: SPC-Zahlschein zeigt Tenant-Daten (IBAN, Anschrift, Name); Tenant-name-Feld im Import
- SPC/Zahlschein nutzt klientenspezifische Tenant-IBAN und -Anschrift statt globaler Config
- Tenant-Modell um Namensfeld erweitert (YAML, SQL, Context, Factory)
- ALTER TABLE-Migration für bestehende DBs (name-Spalte)
- make timesheets speichert MONTH nicht mehr in .month

Co-Authored-By: Claude Sonnet 4.6 <noreply@anthropic.com>
</commit_message>
<xml_diff>
--- a/templates/rechnungsvorlage.docx
+++ b/templates/rechnungsvorlage.docx
@@ -17,35 +17,7 @@
         <w:rPr>
           <w:lang w:val="en-US"/>
         </w:rPr>
-        <w:t>{{</w:t>
-      </w:r>
-      <w:proofErr w:type="spellStart"/>
-      <w:r>
-        <w:rPr>
-          <w:lang w:val="en-US"/>
-        </w:rPr>
-        <w:t>provider_city</w:t>
-      </w:r>
-      <w:proofErr w:type="spellEnd"/>
-      <w:r>
-        <w:rPr>
-          <w:lang w:val="en-US"/>
-        </w:rPr>
-        <w:t>}}, den {{</w:t>
-      </w:r>
-      <w:proofErr w:type="spellStart"/>
-      <w:r>
-        <w:rPr>
-          <w:lang w:val="en-US"/>
-        </w:rPr>
-        <w:t>invoice_date|date</w:t>
-      </w:r>
-      <w:proofErr w:type="spellEnd"/>
-      <w:r>
-        <w:rPr>
-          <w:lang w:val="en-US"/>
-        </w:rPr>
-        <w:t>}}</w:t>
+        <w:t>{{provider_city}}, den {{invoice_date|date}}</w:t>
       </w:r>
     </w:p>
     <w:p>
@@ -72,7 +44,6 @@
           <w:lang w:val="en-US"/>
         </w:rPr>
       </w:pPr>
-      <w:proofErr w:type="spellStart"/>
       <w:r>
         <w:rPr>
           <w:rStyle w:val="Fett"/>
@@ -82,7 +53,6 @@
         </w:rPr>
         <w:t>Rechnungsnummer</w:t>
       </w:r>
-      <w:proofErr w:type="spellEnd"/>
       <w:r>
         <w:rPr>
           <w:rStyle w:val="Fett"/>
@@ -96,21 +66,7 @@
         <w:rPr>
           <w:lang w:val="en-US"/>
         </w:rPr>
-        <w:t>{{</w:t>
-      </w:r>
-      <w:proofErr w:type="spellStart"/>
-      <w:r>
-        <w:rPr>
-          <w:lang w:val="en-US"/>
-        </w:rPr>
-        <w:t>invoice_id</w:t>
-      </w:r>
-      <w:proofErr w:type="spellEnd"/>
-      <w:r>
-        <w:rPr>
-          <w:lang w:val="en-US"/>
-        </w:rPr>
-        <w:t>}}</w:t>
+        <w:t>{{invoice_id}}</w:t>
       </w:r>
     </w:p>
     <w:p>
@@ -129,16 +85,7 @@
           <w:bCs/>
           <w:lang w:val="en-US"/>
         </w:rPr>
-        <w:t>{{</w:t>
-      </w:r>
-      <w:proofErr w:type="spellStart"/>
-      <w:r>
-        <w:rPr>
-          <w:b/>
-          <w:bCs/>
-          <w:lang w:val="en-US"/>
-        </w:rPr>
-        <w:t>service_type</w:t>
+        <w:t>{{service_type</w:t>
       </w:r>
       <w:r>
         <w:rPr>
@@ -148,7 +95,6 @@
         </w:rPr>
         <w:t>_description</w:t>
       </w:r>
-      <w:proofErr w:type="spellEnd"/>
       <w:r>
         <w:rPr>
           <w:b/>
@@ -168,47 +114,11 @@
           <w:lang w:val="en-US"/>
         </w:rPr>
       </w:pPr>
-      <w:proofErr w:type="spellStart"/>
       <w:r>
         <w:rPr>
           <w:lang w:val="en-US"/>
         </w:rPr>
-        <w:t>Zeitraum</w:t>
-      </w:r>
-      <w:proofErr w:type="spellEnd"/>
-      <w:r>
-        <w:rPr>
-          <w:lang w:val="en-US"/>
-        </w:rPr>
-        <w:t xml:space="preserve"> der </w:t>
-      </w:r>
-      <w:proofErr w:type="spellStart"/>
-      <w:r>
-        <w:rPr>
-          <w:lang w:val="en-US"/>
-        </w:rPr>
-        <w:t>Leistungserbringung</w:t>
-      </w:r>
-      <w:proofErr w:type="spellEnd"/>
-      <w:r>
-        <w:rPr>
-          <w:lang w:val="en-US"/>
-        </w:rPr>
-        <w:t>: {{</w:t>
-      </w:r>
-      <w:proofErr w:type="spellStart"/>
-      <w:r>
-        <w:rPr>
-          <w:lang w:val="en-US"/>
-        </w:rPr>
-        <w:t>start_inv_period|date</w:t>
-      </w:r>
-      <w:proofErr w:type="spellEnd"/>
-      <w:r>
-        <w:rPr>
-          <w:lang w:val="en-US"/>
-        </w:rPr>
-        <w:t>}} –</w:t>
+        <w:t>Zeitraum der Leistungserbringung: {{start_inv_period|date}} –</w:t>
       </w:r>
       <w:r>
         <w:rPr>
@@ -220,21 +130,7 @@
         <w:rPr>
           <w:lang w:val="en-US"/>
         </w:rPr>
-        <w:t>{{</w:t>
-      </w:r>
-      <w:proofErr w:type="spellStart"/>
-      <w:r>
-        <w:rPr>
-          <w:lang w:val="en-US"/>
-        </w:rPr>
-        <w:t>end_inv_period|date</w:t>
-      </w:r>
-      <w:proofErr w:type="spellEnd"/>
-      <w:r>
-        <w:rPr>
-          <w:lang w:val="en-US"/>
-        </w:rPr>
-        <w:t>}}</w:t>
+        <w:t>{{end_inv_period|date}}</w:t>
       </w:r>
     </w:p>
     <w:p>
@@ -253,6 +149,8 @@
           <w:left w:val="single" w:sz="4" w:space="0" w:color="auto"/>
           <w:bottom w:val="single" w:sz="4" w:space="0" w:color="auto"/>
           <w:right w:val="single" w:sz="4" w:space="0" w:color="auto"/>
+          <w:insideH w:val="single" w:sz="4" w:space="0" w:color="auto"/>
+          <w:insideV w:val="single" w:sz="4" w:space="0" w:color="auto"/>
         </w:tblBorders>
         <w:tblLook w:val="04A0" w:firstRow="1" w:lastRow="0" w:firstColumn="1" w:lastColumn="0" w:noHBand="0" w:noVBand="1"/>
       </w:tblPr>
@@ -312,7 +210,6 @@
               </w:rPr>
               <w:t>{{</w:t>
             </w:r>
-            <w:proofErr w:type="spellStart"/>
             <w:r>
               <w:rPr>
                 <w:b w:val="0"/>
@@ -320,7 +217,6 @@
               </w:rPr>
               <w:t>service_requester</w:t>
             </w:r>
-            <w:proofErr w:type="spellEnd"/>
             <w:r>
               <w:rPr>
                 <w:b w:val="0"/>
@@ -369,7 +265,6 @@
             <w:r>
               <w:t>{{</w:t>
             </w:r>
-            <w:proofErr w:type="spellStart"/>
             <w:r>
               <w:t>client</w:t>
             </w:r>
@@ -379,7 +274,6 @@
             <w:r>
               <w:t>name</w:t>
             </w:r>
-            <w:proofErr w:type="spellEnd"/>
             <w:r>
               <w:t>}}</w:t>
             </w:r>
@@ -421,11 +315,9 @@
             <w:r>
               <w:t>{{</w:t>
             </w:r>
-            <w:proofErr w:type="spellStart"/>
             <w:r>
               <w:t>client.social_security_number</w:t>
             </w:r>
-            <w:proofErr w:type="spellEnd"/>
             <w:r>
               <w:t>}}</w:t>
             </w:r>
@@ -433,7 +325,6 @@
         </w:tc>
       </w:tr>
     </w:tbl>
-    <w:p/>
     <w:p/>
     <w:tbl>
       <w:tblPr>
@@ -530,7 +421,7 @@
                 <w:sz w:val="22"/>
                 <w:szCs w:val="22"/>
               </w:rPr>
-              <w:t>Fahrtzeiten</w:t>
+              <w:t>Fahrzeiten</w:t>
             </w:r>
           </w:p>
         </w:tc>
@@ -744,7 +635,6 @@
               </w:rPr>
               <w:t xml:space="preserve"> </w:t>
             </w:r>
-            <w:proofErr w:type="spellStart"/>
             <w:r>
               <w:rPr>
                 <w:sz w:val="22"/>
@@ -752,7 +642,6 @@
               </w:rPr>
               <w:t>Leistungsdatum|date</w:t>
             </w:r>
-            <w:proofErr w:type="spellEnd"/>
           </w:p>
           <w:p>
             <w:pPr>
@@ -792,23 +681,7 @@
                 <w:sz w:val="22"/>
                 <w:szCs w:val="22"/>
               </w:rPr>
-              <w:t>{{</w:t>
-            </w:r>
-            <w:proofErr w:type="spellStart"/>
-            <w:r>
-              <w:rPr>
-                <w:sz w:val="22"/>
-                <w:szCs w:val="22"/>
-              </w:rPr>
-              <w:t>item.Fahrtzeit|minutes</w:t>
-            </w:r>
-            <w:proofErr w:type="spellEnd"/>
-            <w:r>
-              <w:rPr>
-                <w:sz w:val="22"/>
-                <w:szCs w:val="22"/>
-              </w:rPr>
-              <w:t>}}</w:t>
+              <w:t>{{item.Fahrtzeit|minutes}}</w:t>
             </w:r>
           </w:p>
         </w:tc>
@@ -831,23 +704,7 @@
                 <w:sz w:val="22"/>
                 <w:szCs w:val="22"/>
               </w:rPr>
-              <w:t>{{</w:t>
-            </w:r>
-            <w:proofErr w:type="spellStart"/>
-            <w:r>
-              <w:rPr>
-                <w:sz w:val="22"/>
-                <w:szCs w:val="22"/>
-              </w:rPr>
-              <w:t>item.Direkt|minutes</w:t>
-            </w:r>
-            <w:proofErr w:type="spellEnd"/>
-            <w:r>
-              <w:rPr>
-                <w:sz w:val="22"/>
-                <w:szCs w:val="22"/>
-              </w:rPr>
-              <w:t>}}</w:t>
+              <w:t>{{item.Direkt|minutes}}</w:t>
             </w:r>
           </w:p>
         </w:tc>
@@ -870,23 +727,7 @@
                 <w:sz w:val="22"/>
                 <w:szCs w:val="22"/>
               </w:rPr>
-              <w:t>{{</w:t>
-            </w:r>
-            <w:proofErr w:type="spellStart"/>
-            <w:r>
-              <w:rPr>
-                <w:sz w:val="22"/>
-                <w:szCs w:val="22"/>
-              </w:rPr>
-              <w:t>item.Indirekt|minutes</w:t>
-            </w:r>
-            <w:proofErr w:type="spellEnd"/>
-            <w:r>
-              <w:rPr>
-                <w:sz w:val="22"/>
-                <w:szCs w:val="22"/>
-              </w:rPr>
-              <w:t>}}</w:t>
+              <w:t>{{item.Indirekt|minutes}}</w:t>
             </w:r>
           </w:p>
         </w:tc>
@@ -909,23 +750,7 @@
                 <w:sz w:val="22"/>
                 <w:szCs w:val="22"/>
               </w:rPr>
-              <w:t>{{</w:t>
-            </w:r>
-            <w:proofErr w:type="spellStart"/>
-            <w:r>
-              <w:rPr>
-                <w:sz w:val="22"/>
-                <w:szCs w:val="22"/>
-              </w:rPr>
-              <w:t>item.Stunden|hhmm</w:t>
-            </w:r>
-            <w:proofErr w:type="spellEnd"/>
-            <w:r>
-              <w:rPr>
-                <w:sz w:val="22"/>
-                <w:szCs w:val="22"/>
-              </w:rPr>
-              <w:t>}}</w:t>
+              <w:t>{{item.Stunden|hhmm}}</w:t>
             </w:r>
           </w:p>
         </w:tc>
@@ -948,17 +773,8 @@
                 <w:sz w:val="22"/>
                 <w:szCs w:val="22"/>
               </w:rPr>
-              <w:t>{{</w:t>
-            </w:r>
-            <w:proofErr w:type="spellStart"/>
-            <w:r>
-              <w:rPr>
-                <w:sz w:val="22"/>
-                <w:szCs w:val="22"/>
-              </w:rPr>
-              <w:t>item.Kosten|currency</w:t>
-            </w:r>
-            <w:proofErr w:type="spellEnd"/>
+              <w:t>{{item.Kosten|currency</w:t>
+            </w:r>
             <w:r>
               <w:rPr>
                 <w:sz w:val="22"/>
@@ -988,23 +804,7 @@
                 <w:sz w:val="22"/>
                 <w:szCs w:val="22"/>
               </w:rPr>
-              <w:t xml:space="preserve">{% </w:t>
-            </w:r>
-            <w:proofErr w:type="spellStart"/>
-            <w:r>
-              <w:rPr>
-                <w:sz w:val="22"/>
-                <w:szCs w:val="22"/>
-              </w:rPr>
-              <w:t>endfor</w:t>
-            </w:r>
-            <w:proofErr w:type="spellEnd"/>
-            <w:r>
-              <w:rPr>
-                <w:sz w:val="22"/>
-                <w:szCs w:val="22"/>
-              </w:rPr>
-              <w:t xml:space="preserve"> %}</w:t>
+              <w:t>{% endfor %}</w:t>
             </w:r>
           </w:p>
         </w:tc>
@@ -1150,27 +950,7 @@
                 <w:sz w:val="22"/>
                 <w:szCs w:val="22"/>
               </w:rPr>
-              <w:t>{{</w:t>
-            </w:r>
-            <w:proofErr w:type="spellStart"/>
-            <w:r>
-              <w:rPr>
-                <w:b/>
-                <w:bCs/>
-                <w:sz w:val="22"/>
-                <w:szCs w:val="22"/>
-              </w:rPr>
-              <w:t>summe_fahrtzeit|minutes</w:t>
-            </w:r>
-            <w:proofErr w:type="spellEnd"/>
-            <w:r>
-              <w:rPr>
-                <w:b/>
-                <w:bCs/>
-                <w:sz w:val="22"/>
-                <w:szCs w:val="22"/>
-              </w:rPr>
-              <w:t>}}</w:t>
+              <w:t>{{summe_fahrtzeit|minutes}}</w:t>
             </w:r>
           </w:p>
         </w:tc>
@@ -1196,27 +976,7 @@
                 <w:sz w:val="22"/>
                 <w:szCs w:val="22"/>
               </w:rPr>
-              <w:t>{{</w:t>
-            </w:r>
-            <w:proofErr w:type="spellStart"/>
-            <w:r>
-              <w:rPr>
-                <w:b/>
-                <w:bCs/>
-                <w:sz w:val="22"/>
-                <w:szCs w:val="22"/>
-              </w:rPr>
-              <w:t>summe_direkt|minutes</w:t>
-            </w:r>
-            <w:proofErr w:type="spellEnd"/>
-            <w:r>
-              <w:rPr>
-                <w:b/>
-                <w:bCs/>
-                <w:sz w:val="22"/>
-                <w:szCs w:val="22"/>
-              </w:rPr>
-              <w:t>}}</w:t>
+              <w:t>{{summe_direkt|minutes}}</w:t>
             </w:r>
           </w:p>
         </w:tc>
@@ -1242,27 +1002,7 @@
                 <w:sz w:val="22"/>
                 <w:szCs w:val="22"/>
               </w:rPr>
-              <w:t>{{</w:t>
-            </w:r>
-            <w:proofErr w:type="spellStart"/>
-            <w:r>
-              <w:rPr>
-                <w:b/>
-                <w:bCs/>
-                <w:sz w:val="22"/>
-                <w:szCs w:val="22"/>
-              </w:rPr>
-              <w:t>summe_indirekt|minutes</w:t>
-            </w:r>
-            <w:proofErr w:type="spellEnd"/>
-            <w:r>
-              <w:rPr>
-                <w:b/>
-                <w:bCs/>
-                <w:sz w:val="22"/>
-                <w:szCs w:val="22"/>
-              </w:rPr>
-              <w:t>}}</w:t>
+              <w:t>{{summe_indirekt|minutes}}</w:t>
             </w:r>
           </w:p>
         </w:tc>
@@ -1288,27 +1028,7 @@
                 <w:sz w:val="22"/>
                 <w:szCs w:val="22"/>
               </w:rPr>
-              <w:t>{{</w:t>
-            </w:r>
-            <w:proofErr w:type="spellStart"/>
-            <w:r>
-              <w:rPr>
-                <w:b/>
-                <w:bCs/>
-                <w:sz w:val="22"/>
-                <w:szCs w:val="22"/>
-              </w:rPr>
-              <w:t>summe_stunden|minutes</w:t>
-            </w:r>
-            <w:proofErr w:type="spellEnd"/>
-            <w:r>
-              <w:rPr>
-                <w:b/>
-                <w:bCs/>
-                <w:sz w:val="22"/>
-                <w:szCs w:val="22"/>
-              </w:rPr>
-              <w:t>}}</w:t>
+              <w:t>{{summe_stunden|minutes}}</w:t>
             </w:r>
           </w:p>
         </w:tc>
@@ -1400,27 +1120,7 @@
                 <w:sz w:val="22"/>
                 <w:szCs w:val="22"/>
               </w:rPr>
-              <w:t>{{</w:t>
-            </w:r>
-            <w:proofErr w:type="spellStart"/>
-            <w:r>
-              <w:rPr>
-                <w:b/>
-                <w:bCs/>
-                <w:sz w:val="22"/>
-                <w:szCs w:val="22"/>
-              </w:rPr>
-              <w:t>summe_fahrtzeit|hhmm</w:t>
-            </w:r>
-            <w:proofErr w:type="spellEnd"/>
-            <w:r>
-              <w:rPr>
-                <w:b/>
-                <w:bCs/>
-                <w:sz w:val="22"/>
-                <w:szCs w:val="22"/>
-              </w:rPr>
-              <w:t>}}</w:t>
+              <w:t>{{summe_fahrtzeit|hhmm}}</w:t>
             </w:r>
           </w:p>
         </w:tc>
@@ -1446,27 +1146,7 @@
                 <w:sz w:val="22"/>
                 <w:szCs w:val="22"/>
               </w:rPr>
-              <w:t>{{</w:t>
-            </w:r>
-            <w:proofErr w:type="spellStart"/>
-            <w:r>
-              <w:rPr>
-                <w:b/>
-                <w:bCs/>
-                <w:sz w:val="22"/>
-                <w:szCs w:val="22"/>
-              </w:rPr>
-              <w:t>summe_direkt|hhmm</w:t>
-            </w:r>
-            <w:proofErr w:type="spellEnd"/>
-            <w:r>
-              <w:rPr>
-                <w:b/>
-                <w:bCs/>
-                <w:sz w:val="22"/>
-                <w:szCs w:val="22"/>
-              </w:rPr>
-              <w:t>}}</w:t>
+              <w:t>{{summe_direkt|hhmm}}</w:t>
             </w:r>
           </w:p>
         </w:tc>
@@ -1492,27 +1172,7 @@
                 <w:sz w:val="22"/>
                 <w:szCs w:val="22"/>
               </w:rPr>
-              <w:t>{{</w:t>
-            </w:r>
-            <w:proofErr w:type="spellStart"/>
-            <w:r>
-              <w:rPr>
-                <w:b/>
-                <w:bCs/>
-                <w:sz w:val="22"/>
-                <w:szCs w:val="22"/>
-              </w:rPr>
-              <w:t>summe_indirekt|hhmm</w:t>
-            </w:r>
-            <w:proofErr w:type="spellEnd"/>
-            <w:r>
-              <w:rPr>
-                <w:b/>
-                <w:bCs/>
-                <w:sz w:val="22"/>
-                <w:szCs w:val="22"/>
-              </w:rPr>
-              <w:t>}}</w:t>
+              <w:t>{{summe_indirekt|hhmm}}</w:t>
             </w:r>
           </w:p>
         </w:tc>
@@ -1538,27 +1198,7 @@
                 <w:sz w:val="22"/>
                 <w:szCs w:val="22"/>
               </w:rPr>
-              <w:t>{{</w:t>
-            </w:r>
-            <w:proofErr w:type="spellStart"/>
-            <w:r>
-              <w:rPr>
-                <w:b/>
-                <w:bCs/>
-                <w:sz w:val="22"/>
-                <w:szCs w:val="22"/>
-              </w:rPr>
-              <w:t>summe_stunden|hhmm</w:t>
-            </w:r>
-            <w:proofErr w:type="spellEnd"/>
-            <w:r>
-              <w:rPr>
-                <w:b/>
-                <w:bCs/>
-                <w:sz w:val="22"/>
-                <w:szCs w:val="22"/>
-              </w:rPr>
-              <w:t>}}</w:t>
+              <w:t>{{summe_stunden|hhmm}}</w:t>
             </w:r>
           </w:p>
         </w:tc>
@@ -1584,27 +1224,7 @@
                 <w:sz w:val="22"/>
                 <w:szCs w:val="22"/>
               </w:rPr>
-              <w:t>{{</w:t>
-            </w:r>
-            <w:proofErr w:type="spellStart"/>
-            <w:r>
-              <w:rPr>
-                <w:b/>
-                <w:bCs/>
-                <w:sz w:val="22"/>
-                <w:szCs w:val="22"/>
-              </w:rPr>
-              <w:t>summe_kosten|currency</w:t>
-            </w:r>
-            <w:proofErr w:type="spellEnd"/>
-            <w:r>
-              <w:rPr>
-                <w:b/>
-                <w:bCs/>
-                <w:sz w:val="22"/>
-                <w:szCs w:val="22"/>
-              </w:rPr>
-              <w:t>}}</w:t>
+              <w:t>{{summe_kosten|currency}}</w:t>
             </w:r>
           </w:p>
         </w:tc>
@@ -1679,11 +1299,9 @@
                             <w:r>
                               <w:t>{</w:t>
                             </w:r>
-                            <w:proofErr w:type="spellStart"/>
                             <w:r>
                               <w:t>payment_part</w:t>
                             </w:r>
-                            <w:proofErr w:type="spellEnd"/>
                             <w:r>
                               <w:t>}</w:t>
                             </w:r>
@@ -1841,23 +1459,21 @@
               <w:lang w:val="en-US"/>
             </w:rPr>
           </w:pPr>
-          <w:proofErr w:type="spellStart"/>
           <w:r>
             <w:rPr>
               <w:sz w:val="22"/>
               <w:szCs w:val="22"/>
               <w:lang w:val="en-US"/>
             </w:rPr>
-            <w:t>Wegpiraten</w:t>
-          </w:r>
-          <w:proofErr w:type="spellEnd"/>
+            <w:t>Wegpiraten GmbH</w:t>
+          </w:r>
           <w:r>
             <w:rPr>
               <w:sz w:val="22"/>
               <w:szCs w:val="22"/>
               <w:lang w:val="en-US"/>
             </w:rPr>
-            <w:t xml:space="preserve"> GmbH</w:t>
+            <w:br/>
           </w:r>
           <w:r>
             <w:rPr>
@@ -1865,7 +1481,7 @@
               <w:szCs w:val="22"/>
               <w:lang w:val="en-US"/>
             </w:rPr>
-            <w:br/>
+            <w:t>{{t</w:t>
           </w:r>
           <w:r>
             <w:rPr>
@@ -1873,16 +1489,15 @@
               <w:szCs w:val="22"/>
               <w:lang w:val="en-US"/>
             </w:rPr>
-            <w:t>{{</w:t>
-          </w:r>
-          <w:proofErr w:type="spellStart"/>
+            <w:t>enant_street}}</w:t>
+          </w:r>
           <w:r>
             <w:rPr>
               <w:sz w:val="22"/>
               <w:szCs w:val="22"/>
               <w:lang w:val="en-US"/>
             </w:rPr>
-            <w:t>t</w:t>
+            <w:br/>
           </w:r>
           <w:r>
             <w:rPr>
@@ -1890,16 +1505,15 @@
               <w:szCs w:val="22"/>
               <w:lang w:val="en-US"/>
             </w:rPr>
-            <w:t>enant_street</w:t>
-          </w:r>
-          <w:proofErr w:type="spellEnd"/>
+            <w:t>{{tenant_zip}}</w:t>
+          </w:r>
           <w:r>
             <w:rPr>
               <w:sz w:val="22"/>
               <w:szCs w:val="22"/>
               <w:lang w:val="en-US"/>
             </w:rPr>
-            <w:t>}}</w:t>
+            <w:t xml:space="preserve"> </w:t>
           </w:r>
           <w:r>
             <w:rPr>
@@ -1907,7 +1521,7 @@
               <w:szCs w:val="22"/>
               <w:lang w:val="en-US"/>
             </w:rPr>
-            <w:br/>
+            <w:t>{{</w:t>
           </w:r>
           <w:r>
             <w:rPr>
@@ -1915,67 +1529,15 @@
               <w:szCs w:val="22"/>
               <w:lang w:val="en-US"/>
             </w:rPr>
-            <w:t>{{</w:t>
-          </w:r>
-          <w:proofErr w:type="spellStart"/>
+            <w:t>tenant</w:t>
+          </w:r>
           <w:r>
             <w:rPr>
               <w:sz w:val="22"/>
               <w:szCs w:val="22"/>
               <w:lang w:val="en-US"/>
             </w:rPr>
-            <w:t>tenant_zip</w:t>
-          </w:r>
-          <w:proofErr w:type="spellEnd"/>
-          <w:r>
-            <w:rPr>
-              <w:sz w:val="22"/>
-              <w:szCs w:val="22"/>
-              <w:lang w:val="en-US"/>
-            </w:rPr>
-            <w:t>}}</w:t>
-          </w:r>
-          <w:r>
-            <w:rPr>
-              <w:sz w:val="22"/>
-              <w:szCs w:val="22"/>
-              <w:lang w:val="en-US"/>
-            </w:rPr>
-            <w:t xml:space="preserve"> </w:t>
-          </w:r>
-          <w:r>
-            <w:rPr>
-              <w:sz w:val="22"/>
-              <w:szCs w:val="22"/>
-              <w:lang w:val="en-US"/>
-            </w:rPr>
-            <w:t>{{</w:t>
-          </w:r>
-          <w:proofErr w:type="spellStart"/>
-          <w:r>
-            <w:rPr>
-              <w:sz w:val="22"/>
-              <w:szCs w:val="22"/>
-              <w:lang w:val="en-US"/>
-            </w:rPr>
-            <w:t>tenant</w:t>
-          </w:r>
-          <w:r>
-            <w:rPr>
-              <w:sz w:val="22"/>
-              <w:szCs w:val="22"/>
-              <w:lang w:val="en-US"/>
-            </w:rPr>
-            <w:t>_city</w:t>
-          </w:r>
-          <w:proofErr w:type="spellEnd"/>
-          <w:r>
-            <w:rPr>
-              <w:sz w:val="22"/>
-              <w:szCs w:val="22"/>
-              <w:lang w:val="en-US"/>
-            </w:rPr>
-            <w:t>}}</w:t>
+            <w:t>_city}}</w:t>
           </w:r>
           <w:r>
             <w:rPr>
@@ -2100,23 +1662,7 @@
               <w:sz w:val="22"/>
               <w:szCs w:val="22"/>
             </w:rPr>
-            <w:t>{{</w:t>
-          </w:r>
-          <w:proofErr w:type="spellStart"/>
-          <w:r>
-            <w:rPr>
-              <w:sz w:val="22"/>
-              <w:szCs w:val="22"/>
-            </w:rPr>
-            <w:t>tenant_iban</w:t>
-          </w:r>
-          <w:proofErr w:type="spellEnd"/>
-          <w:r>
-            <w:rPr>
-              <w:sz w:val="22"/>
-              <w:szCs w:val="22"/>
-            </w:rPr>
-            <w:t>}}</w:t>
+            <w:t>{{tenant_iban}}</w:t>
           </w:r>
         </w:p>
       </w:tc>
@@ -2353,15 +1899,7 @@
             <w:t xml:space="preserve">3800 </w:t>
           </w:r>
           <w:r>
-            <w:t>{{</w:t>
-          </w:r>
-          <w:proofErr w:type="spellStart"/>
-          <w:r>
-            <w:t>provider_city</w:t>
-          </w:r>
-          <w:proofErr w:type="spellEnd"/>
-          <w:r>
-            <w:t>}}</w:t>
+            <w:t>{{provider_city}}</w:t>
           </w:r>
         </w:p>
       </w:tc>
@@ -2480,15 +2018,7 @@
                   <w:jc w:val="right"/>
                 </w:pPr>
                 <w:r>
-                  <w:t>{{</w:t>
-                </w:r>
-                <w:proofErr w:type="spellStart"/>
-                <w:r>
-                  <w:t>payer.street</w:t>
-                </w:r>
-                <w:proofErr w:type="spellEnd"/>
-                <w:r>
-                  <w:t>}}</w:t>
+                  <w:t>{{payer.street}}</w:t>
                 </w:r>
               </w:p>
             </w:tc>
@@ -2513,15 +2043,7 @@
                   <w:jc w:val="right"/>
                 </w:pPr>
                 <w:r>
-                  <w:t>{{</w:t>
-                </w:r>
-                <w:proofErr w:type="spellStart"/>
-                <w:r>
-                  <w:t>payer.zip_city</w:t>
-                </w:r>
-                <w:proofErr w:type="spellEnd"/>
-                <w:r>
-                  <w:t>}}</w:t>
+                  <w:t>{{payer.zip_city}}</w:t>
                 </w:r>
               </w:p>
             </w:tc>
@@ -2973,27 +2495,11 @@
           </w:r>
           <w:r>
             <w:br/>
-            <w:t>{{</w:t>
-          </w:r>
-          <w:proofErr w:type="spellStart"/>
-          <w:r>
-            <w:t>payer.street</w:t>
-          </w:r>
-          <w:proofErr w:type="spellEnd"/>
-          <w:r>
-            <w:t>}}</w:t>
+            <w:t>{{payer.street}}</w:t>
           </w:r>
           <w:r>
             <w:br/>
-            <w:t>{{</w:t>
-          </w:r>
-          <w:proofErr w:type="spellStart"/>
-          <w:r>
-            <w:t>payer.zip_city</w:t>
-          </w:r>
-          <w:proofErr w:type="spellEnd"/>
-          <w:r>
-            <w:t>}}</w:t>
+            <w:t>{{payer.zip_city}}</w:t>
           </w:r>
         </w:p>
         <w:p>
@@ -3280,9 +2786,8 @@
                 <w14:bevel/>
               </w14:textOutline>
             </w:rPr>
-            <w:t>{{</w:t>
-          </w:r>
-          <w:proofErr w:type="spellStart"/>
+            <w:t xml:space="preserve">{{tenant_street}} </w:t>
+          </w:r>
           <w:r>
             <w:rPr>
               <w14:textOutline w14:w="9525" w14:cap="rnd" w14:cmpd="sng" w14:algn="ctr">
@@ -3291,9 +2796,8 @@
                 <w14:bevel/>
               </w14:textOutline>
             </w:rPr>
-            <w:t>tenant_street</w:t>
-          </w:r>
-          <w:proofErr w:type="spellEnd"/>
+            <w:br/>
+          </w:r>
           <w:r>
             <w:rPr>
               <w14:textOutline w14:w="9525" w14:cap="rnd" w14:cmpd="sng" w14:algn="ctr">
@@ -3302,7 +2806,7 @@
                 <w14:bevel/>
               </w14:textOutline>
             </w:rPr>
-            <w:t xml:space="preserve">}} </w:t>
+            <w:t>{{tenant_zip}}</w:t>
           </w:r>
           <w:r>
             <w:rPr>
@@ -3312,7 +2816,7 @@
                 <w14:bevel/>
               </w14:textOutline>
             </w:rPr>
-            <w:br/>
+            <w:t xml:space="preserve"> {{</w:t>
           </w:r>
           <w:r>
             <w:rPr>
@@ -3322,9 +2826,8 @@
                 <w14:bevel/>
               </w14:textOutline>
             </w:rPr>
-            <w:t>{{</w:t>
-          </w:r>
-          <w:proofErr w:type="spellStart"/>
+            <w:t>tenant</w:t>
+          </w:r>
           <w:r>
             <w:rPr>
               <w14:textOutline w14:w="9525" w14:cap="rnd" w14:cmpd="sng" w14:algn="ctr">
@@ -3333,60 +2836,7 @@
                 <w14:bevel/>
               </w14:textOutline>
             </w:rPr>
-            <w:t>tenant_zip</w:t>
-          </w:r>
-          <w:proofErr w:type="spellEnd"/>
-          <w:r>
-            <w:rPr>
-              <w14:textOutline w14:w="9525" w14:cap="rnd" w14:cmpd="sng" w14:algn="ctr">
-                <w14:noFill/>
-                <w14:prstDash w14:val="solid"/>
-                <w14:bevel/>
-              </w14:textOutline>
-            </w:rPr>
-            <w:t>}}</w:t>
-          </w:r>
-          <w:r>
-            <w:rPr>
-              <w14:textOutline w14:w="9525" w14:cap="rnd" w14:cmpd="sng" w14:algn="ctr">
-                <w14:noFill/>
-                <w14:prstDash w14:val="solid"/>
-                <w14:bevel/>
-              </w14:textOutline>
-            </w:rPr>
-            <w:t xml:space="preserve"> {{</w:t>
-          </w:r>
-          <w:proofErr w:type="spellStart"/>
-          <w:r>
-            <w:rPr>
-              <w14:textOutline w14:w="9525" w14:cap="rnd" w14:cmpd="sng" w14:algn="ctr">
-                <w14:noFill/>
-                <w14:prstDash w14:val="solid"/>
-                <w14:bevel/>
-              </w14:textOutline>
-            </w:rPr>
-            <w:t>tenant</w:t>
-          </w:r>
-          <w:r>
-            <w:rPr>
-              <w14:textOutline w14:w="9525" w14:cap="rnd" w14:cmpd="sng" w14:algn="ctr">
-                <w14:noFill/>
-                <w14:prstDash w14:val="solid"/>
-                <w14:bevel/>
-              </w14:textOutline>
-            </w:rPr>
-            <w:t>_city</w:t>
-          </w:r>
-          <w:proofErr w:type="spellEnd"/>
-          <w:r>
-            <w:rPr>
-              <w14:textOutline w14:w="9525" w14:cap="rnd" w14:cmpd="sng" w14:algn="ctr">
-                <w14:noFill/>
-                <w14:prstDash w14:val="solid"/>
-                <w14:bevel/>
-              </w14:textOutline>
-            </w:rPr>
-            <w:t>}}</w:t>
+            <w:t>_city}}</w:t>
           </w:r>
         </w:p>
         <w:p>
@@ -3497,27 +2947,11 @@
           </w:r>
           <w:r>
             <w:br/>
-            <w:t>{{</w:t>
-          </w:r>
-          <w:proofErr w:type="spellStart"/>
-          <w:r>
-            <w:t>payer.street</w:t>
-          </w:r>
-          <w:proofErr w:type="spellEnd"/>
-          <w:r>
-            <w:t>}}</w:t>
+            <w:t>{{payer.street}}</w:t>
           </w:r>
           <w:r>
             <w:br/>
-            <w:t>{{</w:t>
-          </w:r>
-          <w:proofErr w:type="spellStart"/>
-          <w:r>
-            <w:t>payer.zip_city</w:t>
-          </w:r>
-          <w:proofErr w:type="spellEnd"/>
-          <w:r>
-            <w:t>}}</w:t>
+            <w:t>{{payer.zip_city}}</w:t>
           </w:r>
         </w:p>
         <w:p>

</xml_diff>

<commit_message>
Formate angepasst, dezimale Stundenangaben werden korrekt in Minuten umgerechnet (erst *60, dann Konversion zu int)
</commit_message>
<xml_diff>
--- a/templates/rechnungsvorlage.docx
+++ b/templates/rechnungsvorlage.docx
@@ -17,7 +17,35 @@
         <w:rPr>
           <w:lang w:val="en-US"/>
         </w:rPr>
-        <w:t>{{provider_city}}, den {{invoice_date|date}}</w:t>
+        <w:t>{{</w:t>
+      </w:r>
+      <w:proofErr w:type="spellStart"/>
+      <w:r>
+        <w:rPr>
+          <w:lang w:val="en-US"/>
+        </w:rPr>
+        <w:t>provider_city</w:t>
+      </w:r>
+      <w:proofErr w:type="spellEnd"/>
+      <w:r>
+        <w:rPr>
+          <w:lang w:val="en-US"/>
+        </w:rPr>
+        <w:t>}}, den {{</w:t>
+      </w:r>
+      <w:proofErr w:type="spellStart"/>
+      <w:r>
+        <w:rPr>
+          <w:lang w:val="en-US"/>
+        </w:rPr>
+        <w:t>invoice_date|date</w:t>
+      </w:r>
+      <w:proofErr w:type="spellEnd"/>
+      <w:r>
+        <w:rPr>
+          <w:lang w:val="en-US"/>
+        </w:rPr>
+        <w:t>}}</w:t>
       </w:r>
     </w:p>
     <w:p>
@@ -44,6 +72,7 @@
           <w:lang w:val="en-US"/>
         </w:rPr>
       </w:pPr>
+      <w:proofErr w:type="spellStart"/>
       <w:r>
         <w:rPr>
           <w:rStyle w:val="Fett"/>
@@ -53,6 +82,7 @@
         </w:rPr>
         <w:t>Rechnungsnummer</w:t>
       </w:r>
+      <w:proofErr w:type="spellEnd"/>
       <w:r>
         <w:rPr>
           <w:rStyle w:val="Fett"/>
@@ -66,7 +96,21 @@
         <w:rPr>
           <w:lang w:val="en-US"/>
         </w:rPr>
-        <w:t>{{invoice_id}}</w:t>
+        <w:t>{{</w:t>
+      </w:r>
+      <w:proofErr w:type="spellStart"/>
+      <w:r>
+        <w:rPr>
+          <w:lang w:val="en-US"/>
+        </w:rPr>
+        <w:t>invoice_id</w:t>
+      </w:r>
+      <w:proofErr w:type="spellEnd"/>
+      <w:r>
+        <w:rPr>
+          <w:lang w:val="en-US"/>
+        </w:rPr>
+        <w:t>}}</w:t>
       </w:r>
     </w:p>
     <w:p>
@@ -85,7 +129,16 @@
           <w:bCs/>
           <w:lang w:val="en-US"/>
         </w:rPr>
-        <w:t>{{service_type</w:t>
+        <w:t>{{</w:t>
+      </w:r>
+      <w:proofErr w:type="spellStart"/>
+      <w:r>
+        <w:rPr>
+          <w:b/>
+          <w:bCs/>
+          <w:lang w:val="en-US"/>
+        </w:rPr>
+        <w:t>service_type</w:t>
       </w:r>
       <w:r>
         <w:rPr>
@@ -95,6 +148,7 @@
         </w:rPr>
         <w:t>_description</w:t>
       </w:r>
+      <w:proofErr w:type="spellEnd"/>
       <w:r>
         <w:rPr>
           <w:b/>
@@ -114,11 +168,47 @@
           <w:lang w:val="en-US"/>
         </w:rPr>
       </w:pPr>
+      <w:proofErr w:type="spellStart"/>
       <w:r>
         <w:rPr>
           <w:lang w:val="en-US"/>
         </w:rPr>
-        <w:t>Zeitraum der Leistungserbringung: {{start_inv_period|date}} –</w:t>
+        <w:t>Zeitraum</w:t>
+      </w:r>
+      <w:proofErr w:type="spellEnd"/>
+      <w:r>
+        <w:rPr>
+          <w:lang w:val="en-US"/>
+        </w:rPr>
+        <w:t xml:space="preserve"> der </w:t>
+      </w:r>
+      <w:proofErr w:type="spellStart"/>
+      <w:r>
+        <w:rPr>
+          <w:lang w:val="en-US"/>
+        </w:rPr>
+        <w:t>Leistungserbringung</w:t>
+      </w:r>
+      <w:proofErr w:type="spellEnd"/>
+      <w:r>
+        <w:rPr>
+          <w:lang w:val="en-US"/>
+        </w:rPr>
+        <w:t>: {{</w:t>
+      </w:r>
+      <w:proofErr w:type="spellStart"/>
+      <w:r>
+        <w:rPr>
+          <w:lang w:val="en-US"/>
+        </w:rPr>
+        <w:t>start_inv_period|date</w:t>
+      </w:r>
+      <w:proofErr w:type="spellEnd"/>
+      <w:r>
+        <w:rPr>
+          <w:lang w:val="en-US"/>
+        </w:rPr>
+        <w:t>}} –</w:t>
       </w:r>
       <w:r>
         <w:rPr>
@@ -130,7 +220,21 @@
         <w:rPr>
           <w:lang w:val="en-US"/>
         </w:rPr>
-        <w:t>{{end_inv_period|date}}</w:t>
+        <w:t>{{</w:t>
+      </w:r>
+      <w:proofErr w:type="spellStart"/>
+      <w:r>
+        <w:rPr>
+          <w:lang w:val="en-US"/>
+        </w:rPr>
+        <w:t>end_inv_period|date</w:t>
+      </w:r>
+      <w:proofErr w:type="spellEnd"/>
+      <w:r>
+        <w:rPr>
+          <w:lang w:val="en-US"/>
+        </w:rPr>
+        <w:t>}}</w:t>
       </w:r>
     </w:p>
     <w:p>
@@ -210,6 +314,7 @@
               </w:rPr>
               <w:t>{{</w:t>
             </w:r>
+            <w:proofErr w:type="spellStart"/>
             <w:r>
               <w:rPr>
                 <w:b w:val="0"/>
@@ -217,6 +322,7 @@
               </w:rPr>
               <w:t>service_requester</w:t>
             </w:r>
+            <w:proofErr w:type="spellEnd"/>
             <w:r>
               <w:rPr>
                 <w:b w:val="0"/>
@@ -265,6 +371,7 @@
             <w:r>
               <w:t>{{</w:t>
             </w:r>
+            <w:proofErr w:type="spellStart"/>
             <w:r>
               <w:t>client</w:t>
             </w:r>
@@ -274,6 +381,7 @@
             <w:r>
               <w:t>name</w:t>
             </w:r>
+            <w:proofErr w:type="spellEnd"/>
             <w:r>
               <w:t>}}</w:t>
             </w:r>
@@ -315,9 +423,11 @@
             <w:r>
               <w:t>{{</w:t>
             </w:r>
+            <w:proofErr w:type="spellStart"/>
             <w:r>
               <w:t>client.social_security_number</w:t>
             </w:r>
+            <w:proofErr w:type="spellEnd"/>
             <w:r>
               <w:t>}}</w:t>
             </w:r>
@@ -339,7 +449,7 @@
           <w:insideV w:val="single" w:sz="4" w:space="0" w:color="auto"/>
         </w:tblBorders>
         <w:tblLayout w:type="fixed"/>
-        <w:tblLook w:val="0420" w:firstRow="1" w:lastRow="0" w:firstColumn="0" w:lastColumn="0" w:noHBand="0" w:noVBand="1"/>
+        <w:tblLook w:val="0400" w:firstRow="0" w:lastRow="0" w:firstColumn="0" w:lastColumn="0" w:noHBand="0" w:noVBand="1"/>
       </w:tblPr>
       <w:tblGrid>
         <w:gridCol w:w="1484"/>
@@ -351,32 +461,25 @@
       </w:tblGrid>
       <w:tr>
         <w:trPr>
-          <w:cnfStyle w:val="100000000000" w:firstRow="1" w:lastRow="0" w:firstColumn="0" w:lastColumn="0" w:oddVBand="0" w:evenVBand="0" w:oddHBand="0" w:evenHBand="0" w:firstRowFirstColumn="0" w:firstRowLastColumn="0" w:lastRowFirstColumn="0" w:lastRowLastColumn="0"/>
+          <w:cnfStyle w:val="000000100000" w:firstRow="0" w:lastRow="0" w:firstColumn="0" w:lastColumn="0" w:oddVBand="0" w:evenVBand="0" w:oddHBand="1" w:evenHBand="0" w:firstRowFirstColumn="0" w:firstRowLastColumn="0" w:lastRowFirstColumn="0" w:lastRowLastColumn="0"/>
         </w:trPr>
         <w:tc>
           <w:tcPr>
             <w:tcW w:w="1484" w:type="dxa"/>
-            <w:tcBorders>
-              <w:top w:val="none" w:sz="0" w:space="0" w:color="auto"/>
-              <w:bottom w:val="none" w:sz="0" w:space="0" w:color="auto"/>
-              <w:right w:val="none" w:sz="0" w:space="0" w:color="auto"/>
-            </w:tcBorders>
             <w:vAlign w:val="center"/>
           </w:tcPr>
           <w:p>
             <w:pPr>
               <w:jc w:val="center"/>
               <w:rPr>
-                <w:b w:val="0"/>
-                <w:bCs w:val="0"/>
+                <w:b/>
+                <w:bCs/>
                 <w:sz w:val="22"/>
                 <w:szCs w:val="22"/>
               </w:rPr>
             </w:pPr>
             <w:r>
               <w:rPr>
-                <w:b w:val="0"/>
-                <w:bCs w:val="0"/>
                 <w:sz w:val="22"/>
                 <w:szCs w:val="22"/>
               </w:rPr>
@@ -384,8 +487,6 @@
             </w:r>
             <w:r>
               <w:rPr>
-                <w:b w:val="0"/>
-                <w:bCs w:val="0"/>
                 <w:sz w:val="22"/>
                 <w:szCs w:val="22"/>
               </w:rPr>
@@ -396,28 +497,20 @@
         <w:tc>
           <w:tcPr>
             <w:tcW w:w="1307" w:type="dxa"/>
-            <w:tcBorders>
-              <w:top w:val="none" w:sz="0" w:space="0" w:color="auto"/>
-              <w:left w:val="none" w:sz="0" w:space="0" w:color="auto"/>
-              <w:bottom w:val="none" w:sz="0" w:space="0" w:color="auto"/>
-              <w:right w:val="none" w:sz="0" w:space="0" w:color="auto"/>
-            </w:tcBorders>
             <w:vAlign w:val="center"/>
           </w:tcPr>
           <w:p>
             <w:pPr>
               <w:jc w:val="center"/>
               <w:rPr>
-                <w:b w:val="0"/>
-                <w:bCs w:val="0"/>
+                <w:b/>
+                <w:bCs/>
                 <w:sz w:val="22"/>
                 <w:szCs w:val="22"/>
               </w:rPr>
             </w:pPr>
             <w:r>
               <w:rPr>
-                <w:b w:val="0"/>
-                <w:bCs w:val="0"/>
                 <w:sz w:val="22"/>
                 <w:szCs w:val="22"/>
               </w:rPr>
@@ -428,28 +521,20 @@
         <w:tc>
           <w:tcPr>
             <w:tcW w:w="1307" w:type="dxa"/>
-            <w:tcBorders>
-              <w:top w:val="none" w:sz="0" w:space="0" w:color="auto"/>
-              <w:left w:val="none" w:sz="0" w:space="0" w:color="auto"/>
-              <w:bottom w:val="none" w:sz="0" w:space="0" w:color="auto"/>
-              <w:right w:val="none" w:sz="0" w:space="0" w:color="auto"/>
-            </w:tcBorders>
             <w:vAlign w:val="center"/>
           </w:tcPr>
           <w:p>
             <w:pPr>
               <w:jc w:val="center"/>
               <w:rPr>
-                <w:b w:val="0"/>
-                <w:bCs w:val="0"/>
+                <w:b/>
+                <w:bCs/>
                 <w:sz w:val="22"/>
                 <w:szCs w:val="22"/>
               </w:rPr>
             </w:pPr>
             <w:r>
               <w:rPr>
-                <w:b w:val="0"/>
-                <w:bCs w:val="0"/>
                 <w:sz w:val="22"/>
                 <w:szCs w:val="22"/>
               </w:rPr>
@@ -457,8 +542,6 @@
             </w:r>
             <w:r>
               <w:rPr>
-                <w:b w:val="0"/>
-                <w:bCs w:val="0"/>
                 <w:sz w:val="22"/>
                 <w:szCs w:val="22"/>
               </w:rPr>
@@ -470,28 +553,20 @@
         <w:tc>
           <w:tcPr>
             <w:tcW w:w="1705" w:type="dxa"/>
-            <w:tcBorders>
-              <w:top w:val="none" w:sz="0" w:space="0" w:color="auto"/>
-              <w:left w:val="none" w:sz="0" w:space="0" w:color="auto"/>
-              <w:bottom w:val="none" w:sz="0" w:space="0" w:color="auto"/>
-              <w:right w:val="none" w:sz="0" w:space="0" w:color="auto"/>
-            </w:tcBorders>
             <w:vAlign w:val="center"/>
           </w:tcPr>
           <w:p>
             <w:pPr>
               <w:jc w:val="center"/>
               <w:rPr>
-                <w:b w:val="0"/>
-                <w:bCs w:val="0"/>
+                <w:b/>
+                <w:bCs/>
                 <w:sz w:val="22"/>
                 <w:szCs w:val="22"/>
               </w:rPr>
             </w:pPr>
             <w:r>
               <w:rPr>
-                <w:b w:val="0"/>
-                <w:bCs w:val="0"/>
                 <w:sz w:val="22"/>
                 <w:szCs w:val="22"/>
               </w:rPr>
@@ -499,8 +574,6 @@
             </w:r>
             <w:r>
               <w:rPr>
-                <w:b w:val="0"/>
-                <w:bCs w:val="0"/>
                 <w:sz w:val="22"/>
                 <w:szCs w:val="22"/>
               </w:rPr>
@@ -508,8 +581,6 @@
             </w:r>
             <w:r>
               <w:rPr>
-                <w:b w:val="0"/>
-                <w:bCs w:val="0"/>
                 <w:sz w:val="22"/>
                 <w:szCs w:val="22"/>
               </w:rPr>
@@ -520,28 +591,20 @@
         <w:tc>
           <w:tcPr>
             <w:tcW w:w="1705" w:type="dxa"/>
-            <w:tcBorders>
-              <w:top w:val="none" w:sz="0" w:space="0" w:color="auto"/>
-              <w:left w:val="none" w:sz="0" w:space="0" w:color="auto"/>
-              <w:bottom w:val="none" w:sz="0" w:space="0" w:color="auto"/>
-              <w:right w:val="none" w:sz="0" w:space="0" w:color="auto"/>
-            </w:tcBorders>
             <w:vAlign w:val="center"/>
           </w:tcPr>
           <w:p>
             <w:pPr>
               <w:jc w:val="center"/>
               <w:rPr>
-                <w:b w:val="0"/>
-                <w:bCs w:val="0"/>
+                <w:b/>
+                <w:bCs/>
                 <w:sz w:val="22"/>
                 <w:szCs w:val="22"/>
               </w:rPr>
             </w:pPr>
             <w:r>
               <w:rPr>
-                <w:b w:val="0"/>
-                <w:bCs w:val="0"/>
                 <w:sz w:val="22"/>
                 <w:szCs w:val="22"/>
               </w:rPr>
@@ -549,8 +612,6 @@
             </w:r>
             <w:r>
               <w:rPr>
-                <w:b w:val="0"/>
-                <w:bCs w:val="0"/>
                 <w:sz w:val="22"/>
                 <w:szCs w:val="22"/>
               </w:rPr>
@@ -558,8 +619,6 @@
             </w:r>
             <w:r>
               <w:rPr>
-                <w:b w:val="0"/>
-                <w:bCs w:val="0"/>
                 <w:sz w:val="22"/>
                 <w:szCs w:val="22"/>
               </w:rPr>
@@ -570,31 +629,282 @@
         <w:tc>
           <w:tcPr>
             <w:tcW w:w="1564" w:type="dxa"/>
-            <w:tcBorders>
-              <w:top w:val="none" w:sz="0" w:space="0" w:color="auto"/>
-              <w:left w:val="none" w:sz="0" w:space="0" w:color="auto"/>
-              <w:bottom w:val="none" w:sz="0" w:space="0" w:color="auto"/>
-            </w:tcBorders>
             <w:vAlign w:val="center"/>
           </w:tcPr>
           <w:p>
             <w:pPr>
               <w:jc w:val="center"/>
               <w:rPr>
-                <w:b w:val="0"/>
-                <w:bCs w:val="0"/>
+                <w:b/>
+                <w:bCs/>
                 <w:sz w:val="22"/>
                 <w:szCs w:val="22"/>
               </w:rPr>
             </w:pPr>
             <w:r>
               <w:rPr>
-                <w:b w:val="0"/>
-                <w:bCs w:val="0"/>
                 <w:sz w:val="22"/>
                 <w:szCs w:val="22"/>
               </w:rPr>
               <w:t>Betrag</w:t>
+            </w:r>
+          </w:p>
+        </w:tc>
+      </w:tr>
+      <w:tr>
+        <w:tc>
+          <w:tcPr>
+            <w:tcW w:w="1484" w:type="dxa"/>
+          </w:tcPr>
+          <w:p>
+            <w:pPr>
+              <w:jc w:val="right"/>
+              <w:rPr>
+                <w:b/>
+                <w:bCs/>
+                <w:sz w:val="22"/>
+                <w:szCs w:val="22"/>
+              </w:rPr>
+            </w:pPr>
+            <w:r>
+              <w:rPr>
+                <w:sz w:val="22"/>
+                <w:szCs w:val="22"/>
+                <w:lang w:val="en-US"/>
+              </w:rPr>
+              <w:t>{% for item in positions %}{{item.</w:t>
+            </w:r>
+            <w:r>
+              <w:rPr>
+                <w:rFonts w:ascii="Consolas" w:hAnsi="Consolas" w:cs="Times New Roman"/>
+                <w:color w:val="92D69E"/>
+                <w:sz w:val="22"/>
+                <w:szCs w:val="22"/>
+                <w:lang w:val="en-US"/>
+              </w:rPr>
+              <w:t xml:space="preserve"> </w:t>
+            </w:r>
+            <w:proofErr w:type="spellStart"/>
+            <w:r>
+              <w:rPr>
+                <w:sz w:val="22"/>
+                <w:szCs w:val="22"/>
+              </w:rPr>
+              <w:t>Leistungsdatum|date</w:t>
+            </w:r>
+            <w:proofErr w:type="spellEnd"/>
+          </w:p>
+          <w:p>
+            <w:pPr>
+              <w:jc w:val="right"/>
+              <w:rPr>
+                <w:b/>
+                <w:bCs/>
+                <w:sz w:val="22"/>
+                <w:szCs w:val="22"/>
+              </w:rPr>
+            </w:pPr>
+            <w:r>
+              <w:rPr>
+                <w:sz w:val="22"/>
+                <w:szCs w:val="22"/>
+              </w:rPr>
+              <w:t>}}</w:t>
+            </w:r>
+          </w:p>
+        </w:tc>
+        <w:tc>
+          <w:tcPr>
+            <w:tcW w:w="1307" w:type="dxa"/>
+          </w:tcPr>
+          <w:p>
+            <w:pPr>
+              <w:jc w:val="right"/>
+              <w:rPr>
+                <w:b/>
+                <w:bCs/>
+                <w:sz w:val="22"/>
+                <w:szCs w:val="22"/>
+              </w:rPr>
+            </w:pPr>
+            <w:r>
+              <w:rPr>
+                <w:sz w:val="22"/>
+                <w:szCs w:val="22"/>
+              </w:rPr>
+              <w:t>{{</w:t>
+            </w:r>
+            <w:proofErr w:type="spellStart"/>
+            <w:r>
+              <w:rPr>
+                <w:sz w:val="22"/>
+                <w:szCs w:val="22"/>
+              </w:rPr>
+              <w:t>item.Fahrtzeit|minutes</w:t>
+            </w:r>
+            <w:proofErr w:type="spellEnd"/>
+            <w:r>
+              <w:rPr>
+                <w:sz w:val="22"/>
+                <w:szCs w:val="22"/>
+              </w:rPr>
+              <w:t>}}</w:t>
+            </w:r>
+          </w:p>
+        </w:tc>
+        <w:tc>
+          <w:tcPr>
+            <w:tcW w:w="1307" w:type="dxa"/>
+          </w:tcPr>
+          <w:p>
+            <w:pPr>
+              <w:jc w:val="right"/>
+              <w:rPr>
+                <w:b/>
+                <w:bCs/>
+                <w:sz w:val="22"/>
+                <w:szCs w:val="22"/>
+              </w:rPr>
+            </w:pPr>
+            <w:r>
+              <w:rPr>
+                <w:sz w:val="22"/>
+                <w:szCs w:val="22"/>
+              </w:rPr>
+              <w:t>{{</w:t>
+            </w:r>
+            <w:proofErr w:type="spellStart"/>
+            <w:r>
+              <w:rPr>
+                <w:sz w:val="22"/>
+                <w:szCs w:val="22"/>
+              </w:rPr>
+              <w:t>item.Direkt|minutes</w:t>
+            </w:r>
+            <w:proofErr w:type="spellEnd"/>
+            <w:r>
+              <w:rPr>
+                <w:sz w:val="22"/>
+                <w:szCs w:val="22"/>
+              </w:rPr>
+              <w:t>}}</w:t>
+            </w:r>
+          </w:p>
+        </w:tc>
+        <w:tc>
+          <w:tcPr>
+            <w:tcW w:w="1705" w:type="dxa"/>
+          </w:tcPr>
+          <w:p>
+            <w:pPr>
+              <w:jc w:val="right"/>
+              <w:rPr>
+                <w:b/>
+                <w:bCs/>
+                <w:sz w:val="22"/>
+                <w:szCs w:val="22"/>
+              </w:rPr>
+            </w:pPr>
+            <w:r>
+              <w:rPr>
+                <w:sz w:val="22"/>
+                <w:szCs w:val="22"/>
+              </w:rPr>
+              <w:t>{{</w:t>
+            </w:r>
+            <w:proofErr w:type="spellStart"/>
+            <w:r>
+              <w:rPr>
+                <w:sz w:val="22"/>
+                <w:szCs w:val="22"/>
+              </w:rPr>
+              <w:t>item.Indirekt|minutes</w:t>
+            </w:r>
+            <w:proofErr w:type="spellEnd"/>
+            <w:r>
+              <w:rPr>
+                <w:sz w:val="22"/>
+                <w:szCs w:val="22"/>
+              </w:rPr>
+              <w:t>}}</w:t>
+            </w:r>
+          </w:p>
+        </w:tc>
+        <w:tc>
+          <w:tcPr>
+            <w:tcW w:w="1705" w:type="dxa"/>
+          </w:tcPr>
+          <w:p>
+            <w:pPr>
+              <w:jc w:val="right"/>
+              <w:rPr>
+                <w:b/>
+                <w:bCs/>
+                <w:sz w:val="22"/>
+                <w:szCs w:val="22"/>
+              </w:rPr>
+            </w:pPr>
+            <w:r>
+              <w:rPr>
+                <w:sz w:val="22"/>
+                <w:szCs w:val="22"/>
+              </w:rPr>
+              <w:t>{{</w:t>
+            </w:r>
+            <w:proofErr w:type="spellStart"/>
+            <w:r>
+              <w:rPr>
+                <w:sz w:val="22"/>
+                <w:szCs w:val="22"/>
+              </w:rPr>
+              <w:t>item.Stunden|hhmm</w:t>
+            </w:r>
+            <w:proofErr w:type="spellEnd"/>
+            <w:r>
+              <w:rPr>
+                <w:sz w:val="22"/>
+                <w:szCs w:val="22"/>
+              </w:rPr>
+              <w:t>}}</w:t>
+            </w:r>
+          </w:p>
+        </w:tc>
+        <w:tc>
+          <w:tcPr>
+            <w:tcW w:w="1564" w:type="dxa"/>
+          </w:tcPr>
+          <w:p>
+            <w:pPr>
+              <w:jc w:val="right"/>
+              <w:rPr>
+                <w:b/>
+                <w:bCs/>
+                <w:sz w:val="22"/>
+                <w:szCs w:val="22"/>
+              </w:rPr>
+            </w:pPr>
+            <w:r>
+              <w:rPr>
+                <w:sz w:val="22"/>
+                <w:szCs w:val="22"/>
+              </w:rPr>
+              <w:t>{{</w:t>
+            </w:r>
+            <w:proofErr w:type="spellStart"/>
+            <w:r>
+              <w:rPr>
+                <w:sz w:val="22"/>
+                <w:szCs w:val="22"/>
+              </w:rPr>
+              <w:t>item.Kosten|currency</w:t>
+            </w:r>
+            <w:proofErr w:type="spellEnd"/>
+            <w:r>
+              <w:rPr>
+                <w:sz w:val="22"/>
+                <w:szCs w:val="22"/>
+              </w:rPr>
+              <w:t>}}</w:t>
             </w:r>
           </w:p>
         </w:tc>
@@ -611,200 +921,33 @@
             <w:pPr>
               <w:jc w:val="right"/>
               <w:rPr>
-                <w:b/>
-                <w:bCs/>
-                <w:sz w:val="22"/>
-                <w:szCs w:val="22"/>
+                <w:sz w:val="22"/>
+                <w:szCs w:val="22"/>
+                <w:lang w:val="en-US"/>
               </w:rPr>
             </w:pPr>
             <w:r>
               <w:rPr>
                 <w:sz w:val="22"/>
                 <w:szCs w:val="22"/>
-                <w:lang w:val="en-US"/>
-              </w:rPr>
-              <w:t>{% for item in positions %}{{item.</w:t>
-            </w:r>
-            <w:r>
-              <w:rPr>
-                <w:rFonts w:ascii="Consolas" w:hAnsi="Consolas" w:cs="Times New Roman"/>
-                <w:color w:val="92D69E"/>
-                <w:sz w:val="22"/>
-                <w:szCs w:val="22"/>
-                <w:lang w:val="en-US"/>
-              </w:rPr>
-              <w:t xml:space="preserve"> </w:t>
-            </w:r>
-            <w:r>
-              <w:rPr>
-                <w:sz w:val="22"/>
-                <w:szCs w:val="22"/>
-              </w:rPr>
-              <w:t>Leistungsdatum|date</w:t>
-            </w:r>
-          </w:p>
-          <w:p>
-            <w:pPr>
-              <w:jc w:val="right"/>
-              <w:rPr>
-                <w:b/>
-                <w:bCs/>
-                <w:sz w:val="22"/>
-                <w:szCs w:val="22"/>
-              </w:rPr>
-            </w:pPr>
-            <w:r>
-              <w:rPr>
-                <w:sz w:val="22"/>
-                <w:szCs w:val="22"/>
-              </w:rPr>
-              <w:t>}}</w:t>
-            </w:r>
-          </w:p>
-        </w:tc>
-        <w:tc>
-          <w:tcPr>
-            <w:tcW w:w="1307" w:type="dxa"/>
-          </w:tcPr>
-          <w:p>
-            <w:pPr>
-              <w:jc w:val="right"/>
-              <w:rPr>
-                <w:b/>
-                <w:bCs/>
-                <w:sz w:val="22"/>
-                <w:szCs w:val="22"/>
-              </w:rPr>
-            </w:pPr>
-            <w:r>
-              <w:rPr>
-                <w:sz w:val="22"/>
-                <w:szCs w:val="22"/>
-              </w:rPr>
-              <w:t>{{item.Fahrtzeit|minutes}}</w:t>
-            </w:r>
-          </w:p>
-        </w:tc>
-        <w:tc>
-          <w:tcPr>
-            <w:tcW w:w="1307" w:type="dxa"/>
-          </w:tcPr>
-          <w:p>
-            <w:pPr>
-              <w:jc w:val="right"/>
-              <w:rPr>
-                <w:b/>
-                <w:bCs/>
-                <w:sz w:val="22"/>
-                <w:szCs w:val="22"/>
-              </w:rPr>
-            </w:pPr>
-            <w:r>
-              <w:rPr>
-                <w:sz w:val="22"/>
-                <w:szCs w:val="22"/>
-              </w:rPr>
-              <w:t>{{item.Direkt|minutes}}</w:t>
-            </w:r>
-          </w:p>
-        </w:tc>
-        <w:tc>
-          <w:tcPr>
-            <w:tcW w:w="1705" w:type="dxa"/>
-          </w:tcPr>
-          <w:p>
-            <w:pPr>
-              <w:jc w:val="right"/>
-              <w:rPr>
-                <w:b/>
-                <w:bCs/>
-                <w:sz w:val="22"/>
-                <w:szCs w:val="22"/>
-              </w:rPr>
-            </w:pPr>
-            <w:r>
-              <w:rPr>
-                <w:sz w:val="22"/>
-                <w:szCs w:val="22"/>
-              </w:rPr>
-              <w:t>{{item.Indirekt|minutes}}</w:t>
-            </w:r>
-          </w:p>
-        </w:tc>
-        <w:tc>
-          <w:tcPr>
-            <w:tcW w:w="1705" w:type="dxa"/>
-          </w:tcPr>
-          <w:p>
-            <w:pPr>
-              <w:jc w:val="right"/>
-              <w:rPr>
-                <w:b/>
-                <w:bCs/>
-                <w:sz w:val="22"/>
-                <w:szCs w:val="22"/>
-              </w:rPr>
-            </w:pPr>
-            <w:r>
-              <w:rPr>
-                <w:sz w:val="22"/>
-                <w:szCs w:val="22"/>
-              </w:rPr>
-              <w:t>{{item.Stunden|hhmm}}</w:t>
-            </w:r>
-          </w:p>
-        </w:tc>
-        <w:tc>
-          <w:tcPr>
-            <w:tcW w:w="1564" w:type="dxa"/>
-          </w:tcPr>
-          <w:p>
-            <w:pPr>
-              <w:jc w:val="right"/>
-              <w:rPr>
-                <w:b/>
-                <w:bCs/>
-                <w:sz w:val="22"/>
-                <w:szCs w:val="22"/>
-              </w:rPr>
-            </w:pPr>
-            <w:r>
-              <w:rPr>
-                <w:sz w:val="22"/>
-                <w:szCs w:val="22"/>
-              </w:rPr>
-              <w:t>{{item.Kosten|currency</w:t>
-            </w:r>
-            <w:r>
-              <w:rPr>
-                <w:sz w:val="22"/>
-                <w:szCs w:val="22"/>
-              </w:rPr>
-              <w:t>}}</w:t>
-            </w:r>
-          </w:p>
-        </w:tc>
-      </w:tr>
-      <w:tr>
-        <w:tc>
-          <w:tcPr>
-            <w:tcW w:w="1484" w:type="dxa"/>
-          </w:tcPr>
-          <w:p>
-            <w:pPr>
-              <w:jc w:val="right"/>
-              <w:rPr>
-                <w:sz w:val="22"/>
-                <w:szCs w:val="22"/>
-                <w:lang w:val="en-US"/>
-              </w:rPr>
-            </w:pPr>
-            <w:r>
-              <w:rPr>
-                <w:sz w:val="22"/>
-                <w:szCs w:val="22"/>
-              </w:rPr>
-              <w:t>{% endfor %}</w:t>
+              </w:rPr>
+              <w:t xml:space="preserve">{% </w:t>
+            </w:r>
+            <w:proofErr w:type="spellStart"/>
+            <w:r>
+              <w:rPr>
+                <w:sz w:val="22"/>
+                <w:szCs w:val="22"/>
+              </w:rPr>
+              <w:t>endfor</w:t>
+            </w:r>
+            <w:proofErr w:type="spellEnd"/>
+            <w:r>
+              <w:rPr>
+                <w:sz w:val="22"/>
+                <w:szCs w:val="22"/>
+              </w:rPr>
+              <w:t xml:space="preserve"> %}</w:t>
             </w:r>
           </w:p>
         </w:tc>
@@ -872,6 +1015,256 @@
             <w:pPr>
               <w:jc w:val="right"/>
               <w:rPr>
+                <w:sz w:val="22"/>
+                <w:szCs w:val="22"/>
+              </w:rPr>
+            </w:pPr>
+          </w:p>
+        </w:tc>
+      </w:tr>
+      <w:tr>
+        <w:trPr>
+          <w:trHeight w:val="454"/>
+        </w:trPr>
+        <w:tc>
+          <w:tcPr>
+            <w:tcW w:w="1484" w:type="dxa"/>
+            <w:vAlign w:val="bottom"/>
+          </w:tcPr>
+          <w:p>
+            <w:pPr>
+              <w:jc w:val="center"/>
+              <w:rPr>
+                <w:b/>
+                <w:bCs/>
+                <w:sz w:val="22"/>
+                <w:szCs w:val="22"/>
+              </w:rPr>
+            </w:pPr>
+            <w:r>
+              <w:rPr>
+                <w:b/>
+                <w:bCs/>
+                <w:sz w:val="22"/>
+                <w:szCs w:val="22"/>
+              </w:rPr>
+              <w:t>Summe/</w:t>
+            </w:r>
+            <w:r>
+              <w:rPr>
+                <w:b/>
+                <w:bCs/>
+                <w:sz w:val="22"/>
+                <w:szCs w:val="22"/>
+              </w:rPr>
+              <w:t>M</w:t>
+            </w:r>
+            <w:r>
+              <w:rPr>
+                <w:b/>
+                <w:bCs/>
+                <w:sz w:val="22"/>
+                <w:szCs w:val="22"/>
+              </w:rPr>
+              <w:t>in:</w:t>
+            </w:r>
+          </w:p>
+        </w:tc>
+        <w:tc>
+          <w:tcPr>
+            <w:tcW w:w="1307" w:type="dxa"/>
+            <w:vAlign w:val="bottom"/>
+          </w:tcPr>
+          <w:p>
+            <w:pPr>
+              <w:jc w:val="right"/>
+              <w:rPr>
+                <w:b/>
+                <w:bCs/>
+                <w:sz w:val="22"/>
+                <w:szCs w:val="22"/>
+              </w:rPr>
+            </w:pPr>
+            <w:r>
+              <w:rPr>
+                <w:b/>
+                <w:bCs/>
+                <w:sz w:val="22"/>
+                <w:szCs w:val="22"/>
+              </w:rPr>
+              <w:t>{{</w:t>
+            </w:r>
+            <w:proofErr w:type="spellStart"/>
+            <w:r>
+              <w:rPr>
+                <w:b/>
+                <w:bCs/>
+                <w:sz w:val="22"/>
+                <w:szCs w:val="22"/>
+              </w:rPr>
+              <w:t>summe_fahrtzeit|minutes</w:t>
+            </w:r>
+            <w:proofErr w:type="spellEnd"/>
+            <w:r>
+              <w:rPr>
+                <w:b/>
+                <w:bCs/>
+                <w:sz w:val="22"/>
+                <w:szCs w:val="22"/>
+              </w:rPr>
+              <w:t>}}</w:t>
+            </w:r>
+          </w:p>
+        </w:tc>
+        <w:tc>
+          <w:tcPr>
+            <w:tcW w:w="1307" w:type="dxa"/>
+            <w:vAlign w:val="bottom"/>
+          </w:tcPr>
+          <w:p>
+            <w:pPr>
+              <w:jc w:val="right"/>
+              <w:rPr>
+                <w:b/>
+                <w:bCs/>
+                <w:sz w:val="22"/>
+                <w:szCs w:val="22"/>
+              </w:rPr>
+            </w:pPr>
+            <w:r>
+              <w:rPr>
+                <w:b/>
+                <w:bCs/>
+                <w:sz w:val="22"/>
+                <w:szCs w:val="22"/>
+              </w:rPr>
+              <w:t>{{</w:t>
+            </w:r>
+            <w:proofErr w:type="spellStart"/>
+            <w:r>
+              <w:rPr>
+                <w:b/>
+                <w:bCs/>
+                <w:sz w:val="22"/>
+                <w:szCs w:val="22"/>
+              </w:rPr>
+              <w:t>summe_direkt|minutes</w:t>
+            </w:r>
+            <w:proofErr w:type="spellEnd"/>
+            <w:r>
+              <w:rPr>
+                <w:b/>
+                <w:bCs/>
+                <w:sz w:val="22"/>
+                <w:szCs w:val="22"/>
+              </w:rPr>
+              <w:t>}}</w:t>
+            </w:r>
+          </w:p>
+        </w:tc>
+        <w:tc>
+          <w:tcPr>
+            <w:tcW w:w="1705" w:type="dxa"/>
+            <w:vAlign w:val="bottom"/>
+          </w:tcPr>
+          <w:p>
+            <w:pPr>
+              <w:jc w:val="right"/>
+              <w:rPr>
+                <w:b/>
+                <w:bCs/>
+                <w:sz w:val="22"/>
+                <w:szCs w:val="22"/>
+              </w:rPr>
+            </w:pPr>
+            <w:r>
+              <w:rPr>
+                <w:b/>
+                <w:bCs/>
+                <w:sz w:val="22"/>
+                <w:szCs w:val="22"/>
+              </w:rPr>
+              <w:t>{{</w:t>
+            </w:r>
+            <w:proofErr w:type="spellStart"/>
+            <w:r>
+              <w:rPr>
+                <w:b/>
+                <w:bCs/>
+                <w:sz w:val="22"/>
+                <w:szCs w:val="22"/>
+              </w:rPr>
+              <w:t>summe_indirekt|minutes</w:t>
+            </w:r>
+            <w:proofErr w:type="spellEnd"/>
+            <w:r>
+              <w:rPr>
+                <w:b/>
+                <w:bCs/>
+                <w:sz w:val="22"/>
+                <w:szCs w:val="22"/>
+              </w:rPr>
+              <w:t>}}</w:t>
+            </w:r>
+          </w:p>
+        </w:tc>
+        <w:tc>
+          <w:tcPr>
+            <w:tcW w:w="1705" w:type="dxa"/>
+            <w:vAlign w:val="bottom"/>
+          </w:tcPr>
+          <w:p>
+            <w:pPr>
+              <w:jc w:val="right"/>
+              <w:rPr>
+                <w:b/>
+                <w:bCs/>
+                <w:sz w:val="22"/>
+                <w:szCs w:val="22"/>
+              </w:rPr>
+            </w:pPr>
+            <w:r>
+              <w:rPr>
+                <w:b/>
+                <w:bCs/>
+                <w:sz w:val="22"/>
+                <w:szCs w:val="22"/>
+              </w:rPr>
+              <w:t>{{</w:t>
+            </w:r>
+            <w:proofErr w:type="spellStart"/>
+            <w:r>
+              <w:rPr>
+                <w:b/>
+                <w:bCs/>
+                <w:sz w:val="22"/>
+                <w:szCs w:val="22"/>
+              </w:rPr>
+              <w:t>summe_stunden|minutes</w:t>
+            </w:r>
+            <w:proofErr w:type="spellEnd"/>
+            <w:r>
+              <w:rPr>
+                <w:b/>
+                <w:bCs/>
+                <w:sz w:val="22"/>
+                <w:szCs w:val="22"/>
+              </w:rPr>
+              <w:t>}}</w:t>
+            </w:r>
+          </w:p>
+        </w:tc>
+        <w:tc>
+          <w:tcPr>
+            <w:tcW w:w="1564" w:type="dxa"/>
+            <w:vAlign w:val="bottom"/>
+          </w:tcPr>
+          <w:p>
+            <w:pPr>
+              <w:jc w:val="right"/>
+              <w:rPr>
+                <w:b/>
+                <w:bCs/>
                 <w:sz w:val="22"/>
                 <w:szCs w:val="22"/>
               </w:rPr>
@@ -906,25 +1299,25 @@
                 <w:sz w:val="22"/>
                 <w:szCs w:val="22"/>
               </w:rPr>
-              <w:t>Summe/</w:t>
-            </w:r>
-            <w:r>
-              <w:rPr>
-                <w:b/>
-                <w:bCs/>
-                <w:sz w:val="22"/>
-                <w:szCs w:val="22"/>
-              </w:rPr>
-              <w:t>M</w:t>
-            </w:r>
-            <w:r>
-              <w:rPr>
-                <w:b/>
-                <w:bCs/>
-                <w:sz w:val="22"/>
-                <w:szCs w:val="22"/>
-              </w:rPr>
-              <w:t>in:</w:t>
+              <w:t>Summe</w:t>
+            </w:r>
+            <w:r>
+              <w:rPr>
+                <w:b/>
+                <w:bCs/>
+                <w:sz w:val="22"/>
+                <w:szCs w:val="22"/>
+              </w:rPr>
+              <w:t>/Std</w:t>
+            </w:r>
+            <w:r>
+              <w:rPr>
+                <w:b/>
+                <w:bCs/>
+                <w:sz w:val="22"/>
+                <w:szCs w:val="22"/>
+              </w:rPr>
+              <w:t>:</w:t>
             </w:r>
           </w:p>
         </w:tc>
@@ -950,7 +1343,27 @@
                 <w:sz w:val="22"/>
                 <w:szCs w:val="22"/>
               </w:rPr>
-              <w:t>{{summe_fahrtzeit|minutes}}</w:t>
+              <w:t>{{</w:t>
+            </w:r>
+            <w:proofErr w:type="spellStart"/>
+            <w:r>
+              <w:rPr>
+                <w:b/>
+                <w:bCs/>
+                <w:sz w:val="22"/>
+                <w:szCs w:val="22"/>
+              </w:rPr>
+              <w:t>summe_fahrtzeit|hhmm</w:t>
+            </w:r>
+            <w:proofErr w:type="spellEnd"/>
+            <w:r>
+              <w:rPr>
+                <w:b/>
+                <w:bCs/>
+                <w:sz w:val="22"/>
+                <w:szCs w:val="22"/>
+              </w:rPr>
+              <w:t>}}</w:t>
             </w:r>
           </w:p>
         </w:tc>
@@ -976,7 +1389,27 @@
                 <w:sz w:val="22"/>
                 <w:szCs w:val="22"/>
               </w:rPr>
-              <w:t>{{summe_direkt|minutes}}</w:t>
+              <w:t>{{</w:t>
+            </w:r>
+            <w:proofErr w:type="spellStart"/>
+            <w:r>
+              <w:rPr>
+                <w:b/>
+                <w:bCs/>
+                <w:sz w:val="22"/>
+                <w:szCs w:val="22"/>
+              </w:rPr>
+              <w:t>summe_direkt|hhmm</w:t>
+            </w:r>
+            <w:proofErr w:type="spellEnd"/>
+            <w:r>
+              <w:rPr>
+                <w:b/>
+                <w:bCs/>
+                <w:sz w:val="22"/>
+                <w:szCs w:val="22"/>
+              </w:rPr>
+              <w:t>}}</w:t>
             </w:r>
           </w:p>
         </w:tc>
@@ -1002,7 +1435,27 @@
                 <w:sz w:val="22"/>
                 <w:szCs w:val="22"/>
               </w:rPr>
-              <w:t>{{summe_indirekt|minutes}}</w:t>
+              <w:t>{{</w:t>
+            </w:r>
+            <w:proofErr w:type="spellStart"/>
+            <w:r>
+              <w:rPr>
+                <w:b/>
+                <w:bCs/>
+                <w:sz w:val="22"/>
+                <w:szCs w:val="22"/>
+              </w:rPr>
+              <w:t>summe_indirekt|hhmm</w:t>
+            </w:r>
+            <w:proofErr w:type="spellEnd"/>
+            <w:r>
+              <w:rPr>
+                <w:b/>
+                <w:bCs/>
+                <w:sz w:val="22"/>
+                <w:szCs w:val="22"/>
+              </w:rPr>
+              <w:t>}}</w:t>
             </w:r>
           </w:p>
         </w:tc>
@@ -1028,7 +1481,27 @@
                 <w:sz w:val="22"/>
                 <w:szCs w:val="22"/>
               </w:rPr>
-              <w:t>{{summe_stunden|minutes}}</w:t>
+              <w:t>{{</w:t>
+            </w:r>
+            <w:proofErr w:type="spellStart"/>
+            <w:r>
+              <w:rPr>
+                <w:b/>
+                <w:bCs/>
+                <w:sz w:val="22"/>
+                <w:szCs w:val="22"/>
+              </w:rPr>
+              <w:t>summe_stunden|hhmm</w:t>
+            </w:r>
+            <w:proofErr w:type="spellEnd"/>
+            <w:r>
+              <w:rPr>
+                <w:b/>
+                <w:bCs/>
+                <w:sz w:val="22"/>
+                <w:szCs w:val="22"/>
+              </w:rPr>
+              <w:t>}}</w:t>
             </w:r>
           </w:p>
         </w:tc>
@@ -1047,189 +1520,48 @@
                 <w:szCs w:val="22"/>
               </w:rPr>
             </w:pPr>
-          </w:p>
-        </w:tc>
-      </w:tr>
-      <w:tr>
-        <w:trPr>
-          <w:trHeight w:val="454"/>
-        </w:trPr>
-        <w:tc>
-          <w:tcPr>
-            <w:tcW w:w="1484" w:type="dxa"/>
-            <w:vAlign w:val="bottom"/>
-          </w:tcPr>
-          <w:p>
-            <w:pPr>
-              <w:jc w:val="center"/>
-              <w:rPr>
-                <w:b/>
-                <w:bCs/>
-                <w:sz w:val="22"/>
-                <w:szCs w:val="22"/>
-              </w:rPr>
-            </w:pPr>
-            <w:r>
-              <w:rPr>
-                <w:b/>
-                <w:bCs/>
-                <w:sz w:val="22"/>
-                <w:szCs w:val="22"/>
-              </w:rPr>
-              <w:t>Summe</w:t>
-            </w:r>
-            <w:r>
-              <w:rPr>
-                <w:b/>
-                <w:bCs/>
-                <w:sz w:val="22"/>
-                <w:szCs w:val="22"/>
-              </w:rPr>
-              <w:t>/Std</w:t>
-            </w:r>
-            <w:r>
-              <w:rPr>
-                <w:b/>
-                <w:bCs/>
-                <w:sz w:val="22"/>
-                <w:szCs w:val="22"/>
-              </w:rPr>
-              <w:t>:</w:t>
-            </w:r>
-          </w:p>
-        </w:tc>
-        <w:tc>
-          <w:tcPr>
-            <w:tcW w:w="1307" w:type="dxa"/>
-            <w:vAlign w:val="bottom"/>
-          </w:tcPr>
-          <w:p>
-            <w:pPr>
-              <w:jc w:val="right"/>
-              <w:rPr>
-                <w:b/>
-                <w:bCs/>
-                <w:sz w:val="22"/>
-                <w:szCs w:val="22"/>
-              </w:rPr>
-            </w:pPr>
-            <w:r>
-              <w:rPr>
-                <w:b/>
-                <w:bCs/>
-                <w:sz w:val="22"/>
-                <w:szCs w:val="22"/>
-              </w:rPr>
-              <w:t>{{summe_fahrtzeit|hhmm}}</w:t>
-            </w:r>
-          </w:p>
-        </w:tc>
-        <w:tc>
-          <w:tcPr>
-            <w:tcW w:w="1307" w:type="dxa"/>
-            <w:vAlign w:val="bottom"/>
-          </w:tcPr>
-          <w:p>
-            <w:pPr>
-              <w:jc w:val="right"/>
-              <w:rPr>
-                <w:b/>
-                <w:bCs/>
-                <w:sz w:val="22"/>
-                <w:szCs w:val="22"/>
-              </w:rPr>
-            </w:pPr>
-            <w:r>
-              <w:rPr>
-                <w:b/>
-                <w:bCs/>
-                <w:sz w:val="22"/>
-                <w:szCs w:val="22"/>
-              </w:rPr>
-              <w:t>{{summe_direkt|hhmm}}</w:t>
-            </w:r>
-          </w:p>
-        </w:tc>
-        <w:tc>
-          <w:tcPr>
-            <w:tcW w:w="1705" w:type="dxa"/>
-            <w:vAlign w:val="bottom"/>
-          </w:tcPr>
-          <w:p>
-            <w:pPr>
-              <w:jc w:val="right"/>
-              <w:rPr>
-                <w:b/>
-                <w:bCs/>
-                <w:sz w:val="22"/>
-                <w:szCs w:val="22"/>
-              </w:rPr>
-            </w:pPr>
-            <w:r>
-              <w:rPr>
-                <w:b/>
-                <w:bCs/>
-                <w:sz w:val="22"/>
-                <w:szCs w:val="22"/>
-              </w:rPr>
-              <w:t>{{summe_indirekt|hhmm}}</w:t>
-            </w:r>
-          </w:p>
-        </w:tc>
-        <w:tc>
-          <w:tcPr>
-            <w:tcW w:w="1705" w:type="dxa"/>
-            <w:vAlign w:val="bottom"/>
-          </w:tcPr>
-          <w:p>
-            <w:pPr>
-              <w:jc w:val="right"/>
-              <w:rPr>
-                <w:b/>
-                <w:bCs/>
-                <w:sz w:val="22"/>
-                <w:szCs w:val="22"/>
-              </w:rPr>
-            </w:pPr>
-            <w:r>
-              <w:rPr>
-                <w:b/>
-                <w:bCs/>
-                <w:sz w:val="22"/>
-                <w:szCs w:val="22"/>
-              </w:rPr>
-              <w:t>{{summe_stunden|hhmm}}</w:t>
-            </w:r>
-          </w:p>
-        </w:tc>
-        <w:tc>
-          <w:tcPr>
-            <w:tcW w:w="1564" w:type="dxa"/>
-            <w:vAlign w:val="bottom"/>
-          </w:tcPr>
-          <w:p>
-            <w:pPr>
-              <w:jc w:val="right"/>
-              <w:rPr>
-                <w:b/>
-                <w:bCs/>
-                <w:sz w:val="22"/>
-                <w:szCs w:val="22"/>
-              </w:rPr>
-            </w:pPr>
-            <w:r>
-              <w:rPr>
-                <w:b/>
-                <w:bCs/>
-                <w:sz w:val="22"/>
-                <w:szCs w:val="22"/>
-              </w:rPr>
-              <w:t>{{summe_kosten|currency}}</w:t>
+            <w:r>
+              <w:rPr>
+                <w:b/>
+                <w:bCs/>
+                <w:sz w:val="22"/>
+                <w:szCs w:val="22"/>
+              </w:rPr>
+              <w:t>{{</w:t>
+            </w:r>
+            <w:proofErr w:type="spellStart"/>
+            <w:r>
+              <w:rPr>
+                <w:b/>
+                <w:bCs/>
+                <w:sz w:val="22"/>
+                <w:szCs w:val="22"/>
+              </w:rPr>
+              <w:t>summe_kosten|currency</w:t>
+            </w:r>
+            <w:proofErr w:type="spellEnd"/>
+            <w:r>
+              <w:rPr>
+                <w:b/>
+                <w:bCs/>
+                <w:sz w:val="22"/>
+                <w:szCs w:val="22"/>
+              </w:rPr>
+              <w:t>}}</w:t>
             </w:r>
           </w:p>
         </w:tc>
       </w:tr>
     </w:tbl>
+    <w:p/>
+    <w:p/>
+    <w:p/>
+    <w:p/>
+    <w:p/>
+    <w:p/>
+    <w:p/>
+    <w:p/>
+    <w:p/>
     <w:p>
       <w:r>
         <w:br w:type="page"/>
@@ -1299,9 +1631,11 @@
                             <w:r>
                               <w:t>{</w:t>
                             </w:r>
+                            <w:proofErr w:type="spellStart"/>
                             <w:r>
                               <w:t>payment_part</w:t>
                             </w:r>
+                            <w:proofErr w:type="spellEnd"/>
                             <w:r>
                               <w:t>}</w:t>
                             </w:r>
@@ -1459,21 +1793,23 @@
               <w:lang w:val="en-US"/>
             </w:rPr>
           </w:pPr>
+          <w:proofErr w:type="spellStart"/>
           <w:r>
             <w:rPr>
               <w:sz w:val="22"/>
               <w:szCs w:val="22"/>
               <w:lang w:val="en-US"/>
             </w:rPr>
-            <w:t>Wegpiraten GmbH</w:t>
-          </w:r>
+            <w:t>Wegpiraten</w:t>
+          </w:r>
+          <w:proofErr w:type="spellEnd"/>
           <w:r>
             <w:rPr>
               <w:sz w:val="22"/>
               <w:szCs w:val="22"/>
               <w:lang w:val="en-US"/>
             </w:rPr>
-            <w:br/>
+            <w:t xml:space="preserve"> GmbH</w:t>
           </w:r>
           <w:r>
             <w:rPr>
@@ -1481,7 +1817,7 @@
               <w:szCs w:val="22"/>
               <w:lang w:val="en-US"/>
             </w:rPr>
-            <w:t>{{t</w:t>
+            <w:br/>
           </w:r>
           <w:r>
             <w:rPr>
@@ -1489,15 +1825,16 @@
               <w:szCs w:val="22"/>
               <w:lang w:val="en-US"/>
             </w:rPr>
-            <w:t>enant_street}}</w:t>
-          </w:r>
+            <w:t>{{</w:t>
+          </w:r>
+          <w:proofErr w:type="spellStart"/>
           <w:r>
             <w:rPr>
               <w:sz w:val="22"/>
               <w:szCs w:val="22"/>
               <w:lang w:val="en-US"/>
             </w:rPr>
-            <w:br/>
+            <w:t>t</w:t>
           </w:r>
           <w:r>
             <w:rPr>
@@ -1505,15 +1842,16 @@
               <w:szCs w:val="22"/>
               <w:lang w:val="en-US"/>
             </w:rPr>
-            <w:t>{{tenant_zip}}</w:t>
-          </w:r>
+            <w:t>enant_street</w:t>
+          </w:r>
+          <w:proofErr w:type="spellEnd"/>
           <w:r>
             <w:rPr>
               <w:sz w:val="22"/>
               <w:szCs w:val="22"/>
               <w:lang w:val="en-US"/>
             </w:rPr>
-            <w:t xml:space="preserve"> </w:t>
+            <w:t>}}</w:t>
           </w:r>
           <w:r>
             <w:rPr>
@@ -1521,7 +1859,7 @@
               <w:szCs w:val="22"/>
               <w:lang w:val="en-US"/>
             </w:rPr>
-            <w:t>{{</w:t>
+            <w:br/>
           </w:r>
           <w:r>
             <w:rPr>
@@ -1529,15 +1867,67 @@
               <w:szCs w:val="22"/>
               <w:lang w:val="en-US"/>
             </w:rPr>
-            <w:t>tenant</w:t>
-          </w:r>
+            <w:t>{{</w:t>
+          </w:r>
+          <w:proofErr w:type="spellStart"/>
           <w:r>
             <w:rPr>
               <w:sz w:val="22"/>
               <w:szCs w:val="22"/>
               <w:lang w:val="en-US"/>
             </w:rPr>
-            <w:t>_city}}</w:t>
+            <w:t>tenant_zip</w:t>
+          </w:r>
+          <w:proofErr w:type="spellEnd"/>
+          <w:r>
+            <w:rPr>
+              <w:sz w:val="22"/>
+              <w:szCs w:val="22"/>
+              <w:lang w:val="en-US"/>
+            </w:rPr>
+            <w:t>}}</w:t>
+          </w:r>
+          <w:r>
+            <w:rPr>
+              <w:sz w:val="22"/>
+              <w:szCs w:val="22"/>
+              <w:lang w:val="en-US"/>
+            </w:rPr>
+            <w:t xml:space="preserve"> </w:t>
+          </w:r>
+          <w:r>
+            <w:rPr>
+              <w:sz w:val="22"/>
+              <w:szCs w:val="22"/>
+              <w:lang w:val="en-US"/>
+            </w:rPr>
+            <w:t>{{</w:t>
+          </w:r>
+          <w:proofErr w:type="spellStart"/>
+          <w:r>
+            <w:rPr>
+              <w:sz w:val="22"/>
+              <w:szCs w:val="22"/>
+              <w:lang w:val="en-US"/>
+            </w:rPr>
+            <w:t>tenant</w:t>
+          </w:r>
+          <w:r>
+            <w:rPr>
+              <w:sz w:val="22"/>
+              <w:szCs w:val="22"/>
+              <w:lang w:val="en-US"/>
+            </w:rPr>
+            <w:t>_city</w:t>
+          </w:r>
+          <w:proofErr w:type="spellEnd"/>
+          <w:r>
+            <w:rPr>
+              <w:sz w:val="22"/>
+              <w:szCs w:val="22"/>
+              <w:lang w:val="en-US"/>
+            </w:rPr>
+            <w:t>}}</w:t>
           </w:r>
           <w:r>
             <w:rPr>
@@ -1581,14 +1971,23 @@
               <w:sz w:val="22"/>
               <w:szCs w:val="22"/>
             </w:rPr>
-            <w:t xml:space="preserve">E-Mail: </w:t>
+            <w:t>E-Mail</w:t>
+          </w:r>
+          <w:r>
+            <w:rPr>
+              <w:sz w:val="22"/>
+              <w:szCs w:val="22"/>
+            </w:rPr>
+            <w:t xml:space="preserve">: </w:t>
           </w:r>
           <w:hyperlink r:id="rId1" w:history="1">
             <w:r>
               <w:rPr>
                 <w:rStyle w:val="Hyperlink"/>
-                <w:sz w:val="22"/>
-                <w:szCs w:val="22"/>
+                <w:color w:val="auto"/>
+                <w:sz w:val="22"/>
+                <w:szCs w:val="22"/>
+                <w:u w:val="none"/>
               </w:rPr>
               <w:t>info@wegpiraten.ch</w:t>
             </w:r>
@@ -1662,7 +2061,23 @@
               <w:sz w:val="22"/>
               <w:szCs w:val="22"/>
             </w:rPr>
-            <w:t>{{tenant_iban}}</w:t>
+            <w:t>{{</w:t>
+          </w:r>
+          <w:proofErr w:type="spellStart"/>
+          <w:r>
+            <w:rPr>
+              <w:sz w:val="22"/>
+              <w:szCs w:val="22"/>
+            </w:rPr>
+            <w:t>tenant_iban</w:t>
+          </w:r>
+          <w:proofErr w:type="spellEnd"/>
+          <w:r>
+            <w:rPr>
+              <w:sz w:val="22"/>
+              <w:szCs w:val="22"/>
+            </w:rPr>
+            <w:t>}}</w:t>
           </w:r>
         </w:p>
       </w:tc>
@@ -1899,7 +2314,15 @@
             <w:t xml:space="preserve">3800 </w:t>
           </w:r>
           <w:r>
-            <w:t>{{provider_city}}</w:t>
+            <w:t>{{</w:t>
+          </w:r>
+          <w:proofErr w:type="spellStart"/>
+          <w:r>
+            <w:t>provider_city</w:t>
+          </w:r>
+          <w:proofErr w:type="spellEnd"/>
+          <w:r>
+            <w:t>}}</w:t>
           </w:r>
         </w:p>
       </w:tc>
@@ -2018,7 +2441,15 @@
                   <w:jc w:val="right"/>
                 </w:pPr>
                 <w:r>
-                  <w:t>{{payer.street}}</w:t>
+                  <w:t>{{</w:t>
+                </w:r>
+                <w:proofErr w:type="spellStart"/>
+                <w:r>
+                  <w:t>payer.street</w:t>
+                </w:r>
+                <w:proofErr w:type="spellEnd"/>
+                <w:r>
+                  <w:t>}}</w:t>
                 </w:r>
               </w:p>
             </w:tc>
@@ -2043,7 +2474,15 @@
                   <w:jc w:val="right"/>
                 </w:pPr>
                 <w:r>
-                  <w:t>{{payer.zip_city}}</w:t>
+                  <w:t>{{</w:t>
+                </w:r>
+                <w:proofErr w:type="spellStart"/>
+                <w:r>
+                  <w:t>payer.zip_city</w:t>
+                </w:r>
+                <w:proofErr w:type="spellEnd"/>
+                <w:r>
+                  <w:t>}}</w:t>
                 </w:r>
               </w:p>
             </w:tc>
@@ -2334,8 +2773,9 @@
                 <w14:bevel/>
               </w14:textOutline>
             </w:rPr>
-            <w:t>{{tenant_street}}</w:t>
-          </w:r>
+            <w:t>{{</w:t>
+          </w:r>
+          <w:proofErr w:type="spellStart"/>
           <w:r>
             <w:rPr>
               <w14:textOutline w14:w="9525" w14:cap="rnd" w14:cmpd="sng" w14:algn="ctr">
@@ -2344,8 +2784,9 @@
                 <w14:bevel/>
               </w14:textOutline>
             </w:rPr>
-            <w:br/>
-          </w:r>
+            <w:t>tenant_street</w:t>
+          </w:r>
+          <w:proofErr w:type="spellEnd"/>
           <w:r>
             <w:rPr>
               <w14:textOutline w14:w="9525" w14:cap="rnd" w14:cmpd="sng" w14:algn="ctr">
@@ -2354,7 +2795,7 @@
                 <w14:bevel/>
               </w14:textOutline>
             </w:rPr>
-            <w:t>{{tenant_zip}}</w:t>
+            <w:t>}}</w:t>
           </w:r>
           <w:r>
             <w:rPr>
@@ -2364,7 +2805,7 @@
                 <w14:bevel/>
               </w14:textOutline>
             </w:rPr>
-            <w:t xml:space="preserve"> {{</w:t>
+            <w:br/>
           </w:r>
           <w:r>
             <w:rPr>
@@ -2374,8 +2815,9 @@
                 <w14:bevel/>
               </w14:textOutline>
             </w:rPr>
-            <w:t>tenant</w:t>
-          </w:r>
+            <w:t>{{</w:t>
+          </w:r>
+          <w:proofErr w:type="spellStart"/>
           <w:r>
             <w:rPr>
               <w14:textOutline w14:w="9525" w14:cap="rnd" w14:cmpd="sng" w14:algn="ctr">
@@ -2384,7 +2826,60 @@
                 <w14:bevel/>
               </w14:textOutline>
             </w:rPr>
-            <w:t>_city}}</w:t>
+            <w:t>tenant_zip</w:t>
+          </w:r>
+          <w:proofErr w:type="spellEnd"/>
+          <w:r>
+            <w:rPr>
+              <w14:textOutline w14:w="9525" w14:cap="rnd" w14:cmpd="sng" w14:algn="ctr">
+                <w14:noFill/>
+                <w14:prstDash w14:val="solid"/>
+                <w14:bevel/>
+              </w14:textOutline>
+            </w:rPr>
+            <w:t>}}</w:t>
+          </w:r>
+          <w:r>
+            <w:rPr>
+              <w14:textOutline w14:w="9525" w14:cap="rnd" w14:cmpd="sng" w14:algn="ctr">
+                <w14:noFill/>
+                <w14:prstDash w14:val="solid"/>
+                <w14:bevel/>
+              </w14:textOutline>
+            </w:rPr>
+            <w:t xml:space="preserve"> {{</w:t>
+          </w:r>
+          <w:proofErr w:type="spellStart"/>
+          <w:r>
+            <w:rPr>
+              <w14:textOutline w14:w="9525" w14:cap="rnd" w14:cmpd="sng" w14:algn="ctr">
+                <w14:noFill/>
+                <w14:prstDash w14:val="solid"/>
+                <w14:bevel/>
+              </w14:textOutline>
+            </w:rPr>
+            <w:t>tenant</w:t>
+          </w:r>
+          <w:r>
+            <w:rPr>
+              <w14:textOutline w14:w="9525" w14:cap="rnd" w14:cmpd="sng" w14:algn="ctr">
+                <w14:noFill/>
+                <w14:prstDash w14:val="solid"/>
+                <w14:bevel/>
+              </w14:textOutline>
+            </w:rPr>
+            <w:t>_city</w:t>
+          </w:r>
+          <w:proofErr w:type="spellEnd"/>
+          <w:r>
+            <w:rPr>
+              <w14:textOutline w14:w="9525" w14:cap="rnd" w14:cmpd="sng" w14:algn="ctr">
+                <w14:noFill/>
+                <w14:prstDash w14:val="solid"/>
+                <w14:bevel/>
+              </w14:textOutline>
+            </w:rPr>
+            <w:t>}}</w:t>
           </w:r>
         </w:p>
         <w:p>
@@ -2495,11 +2990,27 @@
           </w:r>
           <w:r>
             <w:br/>
-            <w:t>{{payer.street}}</w:t>
+            <w:t>{{</w:t>
+          </w:r>
+          <w:proofErr w:type="spellStart"/>
+          <w:r>
+            <w:t>payer.street</w:t>
+          </w:r>
+          <w:proofErr w:type="spellEnd"/>
+          <w:r>
+            <w:t>}}</w:t>
           </w:r>
           <w:r>
             <w:br/>
-            <w:t>{{payer.zip_city}}</w:t>
+            <w:t>{{</w:t>
+          </w:r>
+          <w:proofErr w:type="spellStart"/>
+          <w:r>
+            <w:t>payer.zip_city</w:t>
+          </w:r>
+          <w:proofErr w:type="spellEnd"/>
+          <w:r>
+            <w:t>}}</w:t>
           </w:r>
         </w:p>
         <w:p>
@@ -2786,8 +3297,9 @@
                 <w14:bevel/>
               </w14:textOutline>
             </w:rPr>
-            <w:t xml:space="preserve">{{tenant_street}} </w:t>
-          </w:r>
+            <w:t>{{</w:t>
+          </w:r>
+          <w:proofErr w:type="spellStart"/>
           <w:r>
             <w:rPr>
               <w14:textOutline w14:w="9525" w14:cap="rnd" w14:cmpd="sng" w14:algn="ctr">
@@ -2796,8 +3308,9 @@
                 <w14:bevel/>
               </w14:textOutline>
             </w:rPr>
-            <w:br/>
-          </w:r>
+            <w:t>tenant_street</w:t>
+          </w:r>
+          <w:proofErr w:type="spellEnd"/>
           <w:r>
             <w:rPr>
               <w14:textOutline w14:w="9525" w14:cap="rnd" w14:cmpd="sng" w14:algn="ctr">
@@ -2806,7 +3319,7 @@
                 <w14:bevel/>
               </w14:textOutline>
             </w:rPr>
-            <w:t>{{tenant_zip}}</w:t>
+            <w:t xml:space="preserve">}} </w:t>
           </w:r>
           <w:r>
             <w:rPr>
@@ -2816,7 +3329,7 @@
                 <w14:bevel/>
               </w14:textOutline>
             </w:rPr>
-            <w:t xml:space="preserve"> {{</w:t>
+            <w:br/>
           </w:r>
           <w:r>
             <w:rPr>
@@ -2826,8 +3339,9 @@
                 <w14:bevel/>
               </w14:textOutline>
             </w:rPr>
-            <w:t>tenant</w:t>
-          </w:r>
+            <w:t>{{</w:t>
+          </w:r>
+          <w:proofErr w:type="spellStart"/>
           <w:r>
             <w:rPr>
               <w14:textOutline w14:w="9525" w14:cap="rnd" w14:cmpd="sng" w14:algn="ctr">
@@ -2836,7 +3350,60 @@
                 <w14:bevel/>
               </w14:textOutline>
             </w:rPr>
-            <w:t>_city}}</w:t>
+            <w:t>tenant_zip</w:t>
+          </w:r>
+          <w:proofErr w:type="spellEnd"/>
+          <w:r>
+            <w:rPr>
+              <w14:textOutline w14:w="9525" w14:cap="rnd" w14:cmpd="sng" w14:algn="ctr">
+                <w14:noFill/>
+                <w14:prstDash w14:val="solid"/>
+                <w14:bevel/>
+              </w14:textOutline>
+            </w:rPr>
+            <w:t>}}</w:t>
+          </w:r>
+          <w:r>
+            <w:rPr>
+              <w14:textOutline w14:w="9525" w14:cap="rnd" w14:cmpd="sng" w14:algn="ctr">
+                <w14:noFill/>
+                <w14:prstDash w14:val="solid"/>
+                <w14:bevel/>
+              </w14:textOutline>
+            </w:rPr>
+            <w:t xml:space="preserve"> {{</w:t>
+          </w:r>
+          <w:proofErr w:type="spellStart"/>
+          <w:r>
+            <w:rPr>
+              <w14:textOutline w14:w="9525" w14:cap="rnd" w14:cmpd="sng" w14:algn="ctr">
+                <w14:noFill/>
+                <w14:prstDash w14:val="solid"/>
+                <w14:bevel/>
+              </w14:textOutline>
+            </w:rPr>
+            <w:t>tenant</w:t>
+          </w:r>
+          <w:r>
+            <w:rPr>
+              <w14:textOutline w14:w="9525" w14:cap="rnd" w14:cmpd="sng" w14:algn="ctr">
+                <w14:noFill/>
+                <w14:prstDash w14:val="solid"/>
+                <w14:bevel/>
+              </w14:textOutline>
+            </w:rPr>
+            <w:t>_city</w:t>
+          </w:r>
+          <w:proofErr w:type="spellEnd"/>
+          <w:r>
+            <w:rPr>
+              <w14:textOutline w14:w="9525" w14:cap="rnd" w14:cmpd="sng" w14:algn="ctr">
+                <w14:noFill/>
+                <w14:prstDash w14:val="solid"/>
+                <w14:bevel/>
+              </w14:textOutline>
+            </w:rPr>
+            <w:t>}}</w:t>
           </w:r>
         </w:p>
         <w:p>
@@ -2947,11 +3514,27 @@
           </w:r>
           <w:r>
             <w:br/>
-            <w:t>{{payer.street}}</w:t>
+            <w:t>{{</w:t>
+          </w:r>
+          <w:proofErr w:type="spellStart"/>
+          <w:r>
+            <w:t>payer.street</w:t>
+          </w:r>
+          <w:proofErr w:type="spellEnd"/>
+          <w:r>
+            <w:t>}}</w:t>
           </w:r>
           <w:r>
             <w:br/>
-            <w:t>{{payer.zip_city}}</w:t>
+            <w:t>{{</w:t>
+          </w:r>
+          <w:proofErr w:type="spellStart"/>
+          <w:r>
+            <w:t>payer.zip_city</w:t>
+          </w:r>
+          <w:proofErr w:type="spellEnd"/>
+          <w:r>
+            <w:t>}}</w:t>
           </w:r>
         </w:p>
         <w:p>

</xml_diff>

<commit_message>
Genehmigungstext in Rechnungs-Template eingefügt
</commit_message>
<xml_diff>
--- a/templates/rechnungsvorlage.docx
+++ b/templates/rechnungsvorlage.docx
@@ -19,6 +19,7 @@
         </w:rPr>
         <w:t>{{</w:t>
       </w:r>
+      <w:proofErr w:type="spellStart"/>
       <w:r>
         <w:rPr>
           <w:lang w:val="en-US"/>
@@ -29,7 +30,28 @@
         <w:rPr>
           <w:lang w:val="en-US"/>
         </w:rPr>
-        <w:t>_city}}, den {{invoice_date|date}}</w:t>
+        <w:t>_city</w:t>
+      </w:r>
+      <w:proofErr w:type="spellEnd"/>
+      <w:r>
+        <w:rPr>
+          <w:lang w:val="en-US"/>
+        </w:rPr>
+        <w:t>}}, den {{</w:t>
+      </w:r>
+      <w:proofErr w:type="spellStart"/>
+      <w:r>
+        <w:rPr>
+          <w:lang w:val="en-US"/>
+        </w:rPr>
+        <w:t>invoice_date|date</w:t>
+      </w:r>
+      <w:proofErr w:type="spellEnd"/>
+      <w:r>
+        <w:rPr>
+          <w:lang w:val="en-US"/>
+        </w:rPr>
+        <w:t>}}</w:t>
       </w:r>
     </w:p>
     <w:p>
@@ -56,6 +78,7 @@
           <w:lang w:val="en-US"/>
         </w:rPr>
       </w:pPr>
+      <w:proofErr w:type="spellStart"/>
       <w:r>
         <w:rPr>
           <w:rStyle w:val="Fett"/>
@@ -65,6 +88,7 @@
         </w:rPr>
         <w:t>Rechnungsnummer</w:t>
       </w:r>
+      <w:proofErr w:type="spellEnd"/>
       <w:r>
         <w:rPr>
           <w:rStyle w:val="Fett"/>
@@ -78,7 +102,21 @@
         <w:rPr>
           <w:lang w:val="en-US"/>
         </w:rPr>
-        <w:t>{{invoice_id}}</w:t>
+        <w:t>{{</w:t>
+      </w:r>
+      <w:proofErr w:type="spellStart"/>
+      <w:r>
+        <w:rPr>
+          <w:lang w:val="en-US"/>
+        </w:rPr>
+        <w:t>invoice_id</w:t>
+      </w:r>
+      <w:proofErr w:type="spellEnd"/>
+      <w:r>
+        <w:rPr>
+          <w:lang w:val="en-US"/>
+        </w:rPr>
+        <w:t>}}</w:t>
       </w:r>
     </w:p>
     <w:p>
@@ -97,7 +135,16 @@
           <w:bCs/>
           <w:lang w:val="en-US"/>
         </w:rPr>
-        <w:t>{{service_type</w:t>
+        <w:t>{{</w:t>
+      </w:r>
+      <w:proofErr w:type="spellStart"/>
+      <w:r>
+        <w:rPr>
+          <w:b/>
+          <w:bCs/>
+          <w:lang w:val="en-US"/>
+        </w:rPr>
+        <w:t>service_type</w:t>
       </w:r>
       <w:r>
         <w:rPr>
@@ -107,6 +154,7 @@
         </w:rPr>
         <w:t>_description</w:t>
       </w:r>
+      <w:proofErr w:type="spellEnd"/>
       <w:r>
         <w:rPr>
           <w:b/>
@@ -126,11 +174,47 @@
           <w:lang w:val="en-US"/>
         </w:rPr>
       </w:pPr>
+      <w:proofErr w:type="spellStart"/>
       <w:r>
         <w:rPr>
           <w:lang w:val="en-US"/>
         </w:rPr>
-        <w:t>Zeitraum der Leistungserbringung: {{start_inv_period|date}} –</w:t>
+        <w:t>Zeitraum</w:t>
+      </w:r>
+      <w:proofErr w:type="spellEnd"/>
+      <w:r>
+        <w:rPr>
+          <w:lang w:val="en-US"/>
+        </w:rPr>
+        <w:t xml:space="preserve"> der </w:t>
+      </w:r>
+      <w:proofErr w:type="spellStart"/>
+      <w:r>
+        <w:rPr>
+          <w:lang w:val="en-US"/>
+        </w:rPr>
+        <w:t>Leistungserbringung</w:t>
+      </w:r>
+      <w:proofErr w:type="spellEnd"/>
+      <w:r>
+        <w:rPr>
+          <w:lang w:val="en-US"/>
+        </w:rPr>
+        <w:t>: {{</w:t>
+      </w:r>
+      <w:proofErr w:type="spellStart"/>
+      <w:r>
+        <w:rPr>
+          <w:lang w:val="en-US"/>
+        </w:rPr>
+        <w:t>start_inv_period|date</w:t>
+      </w:r>
+      <w:proofErr w:type="spellEnd"/>
+      <w:r>
+        <w:rPr>
+          <w:lang w:val="en-US"/>
+        </w:rPr>
+        <w:t>}} –</w:t>
       </w:r>
       <w:r>
         <w:rPr>
@@ -142,7 +226,21 @@
         <w:rPr>
           <w:lang w:val="en-US"/>
         </w:rPr>
-        <w:t>{{end_inv_period|date}}</w:t>
+        <w:t>{{</w:t>
+      </w:r>
+      <w:proofErr w:type="spellStart"/>
+      <w:r>
+        <w:rPr>
+          <w:lang w:val="en-US"/>
+        </w:rPr>
+        <w:t>end_inv_period|date</w:t>
+      </w:r>
+      <w:proofErr w:type="spellEnd"/>
+      <w:r>
+        <w:rPr>
+          <w:lang w:val="en-US"/>
+        </w:rPr>
+        <w:t>}}</w:t>
       </w:r>
     </w:p>
     <w:p>
@@ -222,6 +320,7 @@
               </w:rPr>
               <w:t>{{</w:t>
             </w:r>
+            <w:proofErr w:type="spellStart"/>
             <w:r>
               <w:rPr>
                 <w:b w:val="0"/>
@@ -229,6 +328,7 @@
               </w:rPr>
               <w:t>service_requester</w:t>
             </w:r>
+            <w:proofErr w:type="spellEnd"/>
             <w:r>
               <w:rPr>
                 <w:b w:val="0"/>
@@ -277,6 +377,7 @@
             <w:r>
               <w:t>{{</w:t>
             </w:r>
+            <w:proofErr w:type="spellStart"/>
             <w:r>
               <w:t>client</w:t>
             </w:r>
@@ -286,6 +387,7 @@
             <w:r>
               <w:t>name</w:t>
             </w:r>
+            <w:proofErr w:type="spellEnd"/>
             <w:r>
               <w:t>}}</w:t>
             </w:r>
@@ -327,9 +429,11 @@
             <w:r>
               <w:t>{{</w:t>
             </w:r>
+            <w:proofErr w:type="spellStart"/>
             <w:r>
               <w:t>client.social_security_number</w:t>
             </w:r>
+            <w:proofErr w:type="spellEnd"/>
             <w:r>
               <w:t>}}</w:t>
             </w:r>
@@ -586,13 +690,79 @@
               </w:rPr>
               <w:t xml:space="preserve"> </w:t>
             </w:r>
-            <w:r>
-              <w:rPr>
-                <w:sz w:val="22"/>
-                <w:szCs w:val="22"/>
-              </w:rPr>
-              <w:t>Leistungsdatum|date if not item.is_intro else item.Bezeichnung</w:t>
-            </w:r>
+            <w:proofErr w:type="spellStart"/>
+            <w:r>
+              <w:rPr>
+                <w:sz w:val="22"/>
+                <w:szCs w:val="22"/>
+              </w:rPr>
+              <w:t>Leistungsdatum|date</w:t>
+            </w:r>
+            <w:proofErr w:type="spellEnd"/>
+            <w:r>
+              <w:rPr>
+                <w:sz w:val="22"/>
+                <w:szCs w:val="22"/>
+              </w:rPr>
+              <w:t xml:space="preserve"> </w:t>
+            </w:r>
+            <w:proofErr w:type="spellStart"/>
+            <w:r>
+              <w:rPr>
+                <w:sz w:val="22"/>
+                <w:szCs w:val="22"/>
+              </w:rPr>
+              <w:t>if</w:t>
+            </w:r>
+            <w:proofErr w:type="spellEnd"/>
+            <w:r>
+              <w:rPr>
+                <w:sz w:val="22"/>
+                <w:szCs w:val="22"/>
+              </w:rPr>
+              <w:t xml:space="preserve"> not </w:t>
+            </w:r>
+            <w:proofErr w:type="spellStart"/>
+            <w:r>
+              <w:rPr>
+                <w:sz w:val="22"/>
+                <w:szCs w:val="22"/>
+              </w:rPr>
+              <w:t>item.is_intro</w:t>
+            </w:r>
+            <w:proofErr w:type="spellEnd"/>
+            <w:r>
+              <w:rPr>
+                <w:sz w:val="22"/>
+                <w:szCs w:val="22"/>
+              </w:rPr>
+              <w:t xml:space="preserve"> </w:t>
+            </w:r>
+            <w:proofErr w:type="spellStart"/>
+            <w:r>
+              <w:rPr>
+                <w:sz w:val="22"/>
+                <w:szCs w:val="22"/>
+              </w:rPr>
+              <w:t>else</w:t>
+            </w:r>
+            <w:proofErr w:type="spellEnd"/>
+            <w:r>
+              <w:rPr>
+                <w:sz w:val="22"/>
+                <w:szCs w:val="22"/>
+              </w:rPr>
+              <w:t xml:space="preserve"> </w:t>
+            </w:r>
+            <w:proofErr w:type="spellStart"/>
+            <w:r>
+              <w:rPr>
+                <w:sz w:val="22"/>
+                <w:szCs w:val="22"/>
+              </w:rPr>
+              <w:t>item.Bezeichnung</w:t>
+            </w:r>
+            <w:proofErr w:type="spellEnd"/>
           </w:p>
           <w:p>
             <w:pPr>
@@ -632,7 +802,23 @@
                 <w:sz w:val="22"/>
                 <w:szCs w:val="22"/>
               </w:rPr>
-              <w:t>{{item.Fahrtzeit|minutes}}</w:t>
+              <w:t>{{</w:t>
+            </w:r>
+            <w:proofErr w:type="spellStart"/>
+            <w:r>
+              <w:rPr>
+                <w:sz w:val="22"/>
+                <w:szCs w:val="22"/>
+              </w:rPr>
+              <w:t>item.Fahrtzeit|minutes</w:t>
+            </w:r>
+            <w:proofErr w:type="spellEnd"/>
+            <w:r>
+              <w:rPr>
+                <w:sz w:val="22"/>
+                <w:szCs w:val="22"/>
+              </w:rPr>
+              <w:t>}}</w:t>
             </w:r>
           </w:p>
         </w:tc>
@@ -655,7 +841,23 @@
                 <w:sz w:val="22"/>
                 <w:szCs w:val="22"/>
               </w:rPr>
-              <w:t>{{item.Direkt|minutes}}</w:t>
+              <w:t>{{</w:t>
+            </w:r>
+            <w:proofErr w:type="spellStart"/>
+            <w:r>
+              <w:rPr>
+                <w:sz w:val="22"/>
+                <w:szCs w:val="22"/>
+              </w:rPr>
+              <w:t>item.Direkt|minutes</w:t>
+            </w:r>
+            <w:proofErr w:type="spellEnd"/>
+            <w:r>
+              <w:rPr>
+                <w:sz w:val="22"/>
+                <w:szCs w:val="22"/>
+              </w:rPr>
+              <w:t>}}</w:t>
             </w:r>
           </w:p>
         </w:tc>
@@ -678,7 +880,23 @@
                 <w:sz w:val="22"/>
                 <w:szCs w:val="22"/>
               </w:rPr>
-              <w:t>{{item.Indirekt|minutes}}</w:t>
+              <w:t>{{</w:t>
+            </w:r>
+            <w:proofErr w:type="spellStart"/>
+            <w:r>
+              <w:rPr>
+                <w:sz w:val="22"/>
+                <w:szCs w:val="22"/>
+              </w:rPr>
+              <w:t>item.Indirekt|minutes</w:t>
+            </w:r>
+            <w:proofErr w:type="spellEnd"/>
+            <w:r>
+              <w:rPr>
+                <w:sz w:val="22"/>
+                <w:szCs w:val="22"/>
+              </w:rPr>
+              <w:t>}}</w:t>
             </w:r>
           </w:p>
         </w:tc>
@@ -701,7 +919,23 @@
                 <w:sz w:val="22"/>
                 <w:szCs w:val="22"/>
               </w:rPr>
-              <w:t>{{item.Stunden|hhmm}}</w:t>
+              <w:t>{{</w:t>
+            </w:r>
+            <w:proofErr w:type="spellStart"/>
+            <w:r>
+              <w:rPr>
+                <w:sz w:val="22"/>
+                <w:szCs w:val="22"/>
+              </w:rPr>
+              <w:t>item.Stunden|hhmm</w:t>
+            </w:r>
+            <w:proofErr w:type="spellEnd"/>
+            <w:r>
+              <w:rPr>
+                <w:sz w:val="22"/>
+                <w:szCs w:val="22"/>
+              </w:rPr>
+              <w:t>}}</w:t>
             </w:r>
           </w:p>
         </w:tc>
@@ -724,8 +958,17 @@
                 <w:sz w:val="22"/>
                 <w:szCs w:val="22"/>
               </w:rPr>
-              <w:t>{{item.Kosten|currency</w:t>
-            </w:r>
+              <w:t>{{</w:t>
+            </w:r>
+            <w:proofErr w:type="spellStart"/>
+            <w:r>
+              <w:rPr>
+                <w:sz w:val="22"/>
+                <w:szCs w:val="22"/>
+              </w:rPr>
+              <w:t>item.Kosten|currency</w:t>
+            </w:r>
+            <w:proofErr w:type="spellEnd"/>
             <w:r>
               <w:rPr>
                 <w:sz w:val="22"/>
@@ -758,7 +1001,23 @@
                 <w:sz w:val="22"/>
                 <w:szCs w:val="22"/>
               </w:rPr>
-              <w:t>{% endfor %}</w:t>
+              <w:t xml:space="preserve">{% </w:t>
+            </w:r>
+            <w:proofErr w:type="spellStart"/>
+            <w:r>
+              <w:rPr>
+                <w:sz w:val="22"/>
+                <w:szCs w:val="22"/>
+              </w:rPr>
+              <w:t>endfor</w:t>
+            </w:r>
+            <w:proofErr w:type="spellEnd"/>
+            <w:r>
+              <w:rPr>
+                <w:sz w:val="22"/>
+                <w:szCs w:val="22"/>
+              </w:rPr>
+              <w:t xml:space="preserve"> %}</w:t>
             </w:r>
           </w:p>
         </w:tc>
@@ -903,7 +1162,27 @@
                 <w:sz w:val="22"/>
                 <w:szCs w:val="22"/>
               </w:rPr>
-              <w:t>{{summe_fahrtzeit|minutes}}</w:t>
+              <w:t>{{</w:t>
+            </w:r>
+            <w:proofErr w:type="spellStart"/>
+            <w:r>
+              <w:rPr>
+                <w:b/>
+                <w:bCs/>
+                <w:sz w:val="22"/>
+                <w:szCs w:val="22"/>
+              </w:rPr>
+              <w:t>summe_fahrtzeit|minutes</w:t>
+            </w:r>
+            <w:proofErr w:type="spellEnd"/>
+            <w:r>
+              <w:rPr>
+                <w:b/>
+                <w:bCs/>
+                <w:sz w:val="22"/>
+                <w:szCs w:val="22"/>
+              </w:rPr>
+              <w:t>}}</w:t>
             </w:r>
           </w:p>
         </w:tc>
@@ -929,7 +1208,27 @@
                 <w:sz w:val="22"/>
                 <w:szCs w:val="22"/>
               </w:rPr>
-              <w:t>{{summe_direkt|minutes}}</w:t>
+              <w:t>{{</w:t>
+            </w:r>
+            <w:proofErr w:type="spellStart"/>
+            <w:r>
+              <w:rPr>
+                <w:b/>
+                <w:bCs/>
+                <w:sz w:val="22"/>
+                <w:szCs w:val="22"/>
+              </w:rPr>
+              <w:t>summe_direkt|minutes</w:t>
+            </w:r>
+            <w:proofErr w:type="spellEnd"/>
+            <w:r>
+              <w:rPr>
+                <w:b/>
+                <w:bCs/>
+                <w:sz w:val="22"/>
+                <w:szCs w:val="22"/>
+              </w:rPr>
+              <w:t>}}</w:t>
             </w:r>
           </w:p>
         </w:tc>
@@ -955,7 +1254,27 @@
                 <w:sz w:val="22"/>
                 <w:szCs w:val="22"/>
               </w:rPr>
-              <w:t>{{summe_indirekt|minutes}}</w:t>
+              <w:t>{{</w:t>
+            </w:r>
+            <w:proofErr w:type="spellStart"/>
+            <w:r>
+              <w:rPr>
+                <w:b/>
+                <w:bCs/>
+                <w:sz w:val="22"/>
+                <w:szCs w:val="22"/>
+              </w:rPr>
+              <w:t>summe_indirekt|minutes</w:t>
+            </w:r>
+            <w:proofErr w:type="spellEnd"/>
+            <w:r>
+              <w:rPr>
+                <w:b/>
+                <w:bCs/>
+                <w:sz w:val="22"/>
+                <w:szCs w:val="22"/>
+              </w:rPr>
+              <w:t>}}</w:t>
             </w:r>
           </w:p>
         </w:tc>
@@ -981,7 +1300,27 @@
                 <w:sz w:val="22"/>
                 <w:szCs w:val="22"/>
               </w:rPr>
-              <w:t>{{summe_stunden|minutes}}</w:t>
+              <w:t>{{</w:t>
+            </w:r>
+            <w:proofErr w:type="spellStart"/>
+            <w:r>
+              <w:rPr>
+                <w:b/>
+                <w:bCs/>
+                <w:sz w:val="22"/>
+                <w:szCs w:val="22"/>
+              </w:rPr>
+              <w:t>summe_stunden|minutes</w:t>
+            </w:r>
+            <w:proofErr w:type="spellEnd"/>
+            <w:r>
+              <w:rPr>
+                <w:b/>
+                <w:bCs/>
+                <w:sz w:val="22"/>
+                <w:szCs w:val="22"/>
+              </w:rPr>
+              <w:t>}}</w:t>
             </w:r>
           </w:p>
         </w:tc>
@@ -1074,7 +1413,27 @@
                 <w:sz w:val="22"/>
                 <w:szCs w:val="22"/>
               </w:rPr>
-              <w:t>{{summe_fahrtzeit|hhmm}}</w:t>
+              <w:t>{{</w:t>
+            </w:r>
+            <w:proofErr w:type="spellStart"/>
+            <w:r>
+              <w:rPr>
+                <w:b/>
+                <w:bCs/>
+                <w:sz w:val="22"/>
+                <w:szCs w:val="22"/>
+              </w:rPr>
+              <w:t>summe_fahrtzeit|hhmm</w:t>
+            </w:r>
+            <w:proofErr w:type="spellEnd"/>
+            <w:r>
+              <w:rPr>
+                <w:b/>
+                <w:bCs/>
+                <w:sz w:val="22"/>
+                <w:szCs w:val="22"/>
+              </w:rPr>
+              <w:t>}}</w:t>
             </w:r>
           </w:p>
         </w:tc>
@@ -1100,7 +1459,27 @@
                 <w:sz w:val="22"/>
                 <w:szCs w:val="22"/>
               </w:rPr>
-              <w:t>{{summe_direkt|hhmm}}</w:t>
+              <w:t>{{</w:t>
+            </w:r>
+            <w:proofErr w:type="spellStart"/>
+            <w:r>
+              <w:rPr>
+                <w:b/>
+                <w:bCs/>
+                <w:sz w:val="22"/>
+                <w:szCs w:val="22"/>
+              </w:rPr>
+              <w:t>summe_direkt|hhmm</w:t>
+            </w:r>
+            <w:proofErr w:type="spellEnd"/>
+            <w:r>
+              <w:rPr>
+                <w:b/>
+                <w:bCs/>
+                <w:sz w:val="22"/>
+                <w:szCs w:val="22"/>
+              </w:rPr>
+              <w:t>}}</w:t>
             </w:r>
           </w:p>
         </w:tc>
@@ -1126,7 +1505,27 @@
                 <w:sz w:val="22"/>
                 <w:szCs w:val="22"/>
               </w:rPr>
-              <w:t>{{summe_indirekt|hhmm}}</w:t>
+              <w:t>{{</w:t>
+            </w:r>
+            <w:proofErr w:type="spellStart"/>
+            <w:r>
+              <w:rPr>
+                <w:b/>
+                <w:bCs/>
+                <w:sz w:val="22"/>
+                <w:szCs w:val="22"/>
+              </w:rPr>
+              <w:t>summe_indirekt|hhmm</w:t>
+            </w:r>
+            <w:proofErr w:type="spellEnd"/>
+            <w:r>
+              <w:rPr>
+                <w:b/>
+                <w:bCs/>
+                <w:sz w:val="22"/>
+                <w:szCs w:val="22"/>
+              </w:rPr>
+              <w:t>}}</w:t>
             </w:r>
           </w:p>
         </w:tc>
@@ -1152,7 +1551,27 @@
                 <w:sz w:val="22"/>
                 <w:szCs w:val="22"/>
               </w:rPr>
-              <w:t>{{summe_stunden|hhmm}}</w:t>
+              <w:t>{{</w:t>
+            </w:r>
+            <w:proofErr w:type="spellStart"/>
+            <w:r>
+              <w:rPr>
+                <w:b/>
+                <w:bCs/>
+                <w:sz w:val="22"/>
+                <w:szCs w:val="22"/>
+              </w:rPr>
+              <w:t>summe_stunden|hhmm</w:t>
+            </w:r>
+            <w:proofErr w:type="spellEnd"/>
+            <w:r>
+              <w:rPr>
+                <w:b/>
+                <w:bCs/>
+                <w:sz w:val="22"/>
+                <w:szCs w:val="22"/>
+              </w:rPr>
+              <w:t>}}</w:t>
             </w:r>
           </w:p>
         </w:tc>
@@ -1178,28 +1597,101 @@
                 <w:sz w:val="22"/>
                 <w:szCs w:val="22"/>
               </w:rPr>
-              <w:t>{{summe_kosten|currency}}</w:t>
+              <w:t>{{</w:t>
+            </w:r>
+            <w:proofErr w:type="spellStart"/>
+            <w:r>
+              <w:rPr>
+                <w:b/>
+                <w:bCs/>
+                <w:sz w:val="22"/>
+                <w:szCs w:val="22"/>
+              </w:rPr>
+              <w:t>summe_kosten|currency</w:t>
+            </w:r>
+            <w:proofErr w:type="spellEnd"/>
+            <w:r>
+              <w:rPr>
+                <w:b/>
+                <w:bCs/>
+                <w:sz w:val="22"/>
+                <w:szCs w:val="22"/>
+              </w:rPr>
+              <w:t>}}</w:t>
             </w:r>
           </w:p>
         </w:tc>
       </w:tr>
     </w:tbl>
     <w:p/>
-    <w:p/>
-    <w:p/>
-    <w:p/>
-    <w:p/>
-    <w:p/>
-    <w:p/>
-    <w:p/>
-    <w:p/>
     <w:p>
+      <w:pPr>
+        <w:spacing w:after="160" w:line="259" w:lineRule="auto"/>
+      </w:pPr>
       <w:r>
         <w:br w:type="page"/>
       </w:r>
+    </w:p>
+    <w:p>
       <w:r>
         <w:lastRenderedPageBreak/>
-        <w:t>Vielen herzlichen Dank, dass Sie sich für das Angebot der Wegpiraten GmbH entschieden haben. Wir bedanken uns für die gute Zusammenarbeit und das damit verbundene Vertrauen. Bitte begleichen Sie die Rechnung innerhalb von 14 Tagen unter Angabe der Rechnungsnum</w:t>
+        <w:t xml:space="preserve">{%p </w:t>
+      </w:r>
+      <w:proofErr w:type="spellStart"/>
+      <w:r>
+        <w:t>if</w:t>
+      </w:r>
+      <w:proofErr w:type="spellEnd"/>
+      <w:r>
+        <w:t xml:space="preserve"> </w:t>
+      </w:r>
+      <w:proofErr w:type="spellStart"/>
+      <w:r>
+        <w:t>budget_exceeded</w:t>
+      </w:r>
+      <w:proofErr w:type="spellEnd"/>
+      <w:r>
+        <w:t xml:space="preserve"> %}{{ </w:t>
+      </w:r>
+      <w:proofErr w:type="spellStart"/>
+      <w:r>
+        <w:t>sr_ap_gender</w:t>
+      </w:r>
+      <w:proofErr w:type="spellEnd"/>
+      <w:r>
+        <w:t xml:space="preserve"> }} {{ </w:t>
+      </w:r>
+      <w:proofErr w:type="spellStart"/>
+      <w:r>
+        <w:t>sr_ap_first_name</w:t>
+      </w:r>
+      <w:proofErr w:type="spellEnd"/>
+      <w:r>
+        <w:t xml:space="preserve"> }} {{ </w:t>
+      </w:r>
+      <w:proofErr w:type="spellStart"/>
+      <w:r>
+        <w:t>sr_ap_last_name</w:t>
+      </w:r>
+      <w:proofErr w:type="spellEnd"/>
+      <w:r>
+        <w:t xml:space="preserve"> }} hat nach Absprache mit uns das erhöhte Stundenkontingent für diesen Monat gesondert genehmigt.{%p </w:t>
+      </w:r>
+      <w:proofErr w:type="spellStart"/>
+      <w:r>
+        <w:t>endif</w:t>
+      </w:r>
+      <w:proofErr w:type="spellEnd"/>
+      <w:r>
+        <w:t xml:space="preserve"> %}</w:t>
+      </w:r>
+    </w:p>
+    <w:p>
+      <w:r>
+        <w:t>V</w:t>
+      </w:r>
+      <w:r>
+        <w:t>ielen herzlichen Dank, dass Sie sich für das Angebot der Wegpiraten GmbH entschieden haben. Wir bedanken uns für die gute Zusammenarbeit und das damit verbundene Vertrauen. Bitte begleichen Sie die Rechnung innerhalb von 14 Tagen unter Angabe der Rechnungsnum</w:t>
       </w:r>
       <w:r>
         <w:rPr>
@@ -1262,9 +1754,11 @@
                             <w:r>
                               <w:t>{</w:t>
                             </w:r>
+                            <w:proofErr w:type="spellStart"/>
                             <w:r>
                               <w:t>payment_part</w:t>
                             </w:r>
+                            <w:proofErr w:type="spellEnd"/>
                             <w:r>
                               <w:t>}</w:t>
                             </w:r>
@@ -1422,21 +1916,23 @@
               <w:lang w:val="en-US"/>
             </w:rPr>
           </w:pPr>
+          <w:proofErr w:type="spellStart"/>
           <w:r>
             <w:rPr>
               <w:sz w:val="22"/>
               <w:szCs w:val="22"/>
               <w:lang w:val="en-US"/>
             </w:rPr>
-            <w:t>Wegpiraten GmbH</w:t>
-          </w:r>
+            <w:t>Wegpiraten</w:t>
+          </w:r>
+          <w:proofErr w:type="spellEnd"/>
           <w:r>
             <w:rPr>
               <w:sz w:val="22"/>
               <w:szCs w:val="22"/>
               <w:lang w:val="en-US"/>
             </w:rPr>
-            <w:br/>
+            <w:t xml:space="preserve"> GmbH</w:t>
           </w:r>
           <w:r>
             <w:rPr>
@@ -1444,7 +1940,7 @@
               <w:szCs w:val="22"/>
               <w:lang w:val="en-US"/>
             </w:rPr>
-            <w:t>{{t</w:t>
+            <w:br/>
           </w:r>
           <w:r>
             <w:rPr>
@@ -1452,15 +1948,16 @@
               <w:szCs w:val="22"/>
               <w:lang w:val="en-US"/>
             </w:rPr>
-            <w:t>enant_street}}</w:t>
-          </w:r>
+            <w:t>{{</w:t>
+          </w:r>
+          <w:proofErr w:type="spellStart"/>
           <w:r>
             <w:rPr>
               <w:sz w:val="22"/>
               <w:szCs w:val="22"/>
               <w:lang w:val="en-US"/>
             </w:rPr>
-            <w:br/>
+            <w:t>t</w:t>
           </w:r>
           <w:r>
             <w:rPr>
@@ -1468,15 +1965,16 @@
               <w:szCs w:val="22"/>
               <w:lang w:val="en-US"/>
             </w:rPr>
-            <w:t>{{tenant_zip}}</w:t>
-          </w:r>
+            <w:t>enant_street</w:t>
+          </w:r>
+          <w:proofErr w:type="spellEnd"/>
           <w:r>
             <w:rPr>
               <w:sz w:val="22"/>
               <w:szCs w:val="22"/>
               <w:lang w:val="en-US"/>
             </w:rPr>
-            <w:t xml:space="preserve"> </w:t>
+            <w:t>}}</w:t>
           </w:r>
           <w:r>
             <w:rPr>
@@ -1484,7 +1982,7 @@
               <w:szCs w:val="22"/>
               <w:lang w:val="en-US"/>
             </w:rPr>
-            <w:t>{{</w:t>
+            <w:br/>
           </w:r>
           <w:r>
             <w:rPr>
@@ -1492,15 +1990,67 @@
               <w:szCs w:val="22"/>
               <w:lang w:val="en-US"/>
             </w:rPr>
-            <w:t>tenant</w:t>
-          </w:r>
+            <w:t>{{</w:t>
+          </w:r>
+          <w:proofErr w:type="spellStart"/>
           <w:r>
             <w:rPr>
               <w:sz w:val="22"/>
               <w:szCs w:val="22"/>
               <w:lang w:val="en-US"/>
             </w:rPr>
-            <w:t>_city}}</w:t>
+            <w:t>tenant_zip</w:t>
+          </w:r>
+          <w:proofErr w:type="spellEnd"/>
+          <w:r>
+            <w:rPr>
+              <w:sz w:val="22"/>
+              <w:szCs w:val="22"/>
+              <w:lang w:val="en-US"/>
+            </w:rPr>
+            <w:t>}}</w:t>
+          </w:r>
+          <w:r>
+            <w:rPr>
+              <w:sz w:val="22"/>
+              <w:szCs w:val="22"/>
+              <w:lang w:val="en-US"/>
+            </w:rPr>
+            <w:t xml:space="preserve"> </w:t>
+          </w:r>
+          <w:r>
+            <w:rPr>
+              <w:sz w:val="22"/>
+              <w:szCs w:val="22"/>
+              <w:lang w:val="en-US"/>
+            </w:rPr>
+            <w:t>{{</w:t>
+          </w:r>
+          <w:proofErr w:type="spellStart"/>
+          <w:r>
+            <w:rPr>
+              <w:sz w:val="22"/>
+              <w:szCs w:val="22"/>
+              <w:lang w:val="en-US"/>
+            </w:rPr>
+            <w:t>tenant</w:t>
+          </w:r>
+          <w:r>
+            <w:rPr>
+              <w:sz w:val="22"/>
+              <w:szCs w:val="22"/>
+              <w:lang w:val="en-US"/>
+            </w:rPr>
+            <w:t>_city</w:t>
+          </w:r>
+          <w:proofErr w:type="spellEnd"/>
+          <w:r>
+            <w:rPr>
+              <w:sz w:val="22"/>
+              <w:szCs w:val="22"/>
+              <w:lang w:val="en-US"/>
+            </w:rPr>
+            <w:t>}}</w:t>
           </w:r>
           <w:r>
             <w:rPr>
@@ -1634,7 +2184,23 @@
               <w:sz w:val="22"/>
               <w:szCs w:val="22"/>
             </w:rPr>
-            <w:t>{{tenant_iban}}</w:t>
+            <w:t>{{</w:t>
+          </w:r>
+          <w:proofErr w:type="spellStart"/>
+          <w:r>
+            <w:rPr>
+              <w:sz w:val="22"/>
+              <w:szCs w:val="22"/>
+            </w:rPr>
+            <w:t>tenant_iban</w:t>
+          </w:r>
+          <w:proofErr w:type="spellEnd"/>
+          <w:r>
+            <w:rPr>
+              <w:sz w:val="22"/>
+              <w:szCs w:val="22"/>
+            </w:rPr>
+            <w:t>}}</w:t>
           </w:r>
         </w:p>
       </w:tc>
@@ -1871,7 +2437,15 @@
             <w:t xml:space="preserve">3800 </w:t>
           </w:r>
           <w:r>
-            <w:t>{{provider_city}}</w:t>
+            <w:t>{{</w:t>
+          </w:r>
+          <w:proofErr w:type="spellStart"/>
+          <w:r>
+            <w:t>provider_city</w:t>
+          </w:r>
+          <w:proofErr w:type="spellEnd"/>
+          <w:r>
+            <w:t>}}</w:t>
           </w:r>
         </w:p>
       </w:tc>
@@ -1990,7 +2564,15 @@
                   <w:jc w:val="right"/>
                 </w:pPr>
                 <w:r>
-                  <w:t>{{payer.street}}</w:t>
+                  <w:t>{{</w:t>
+                </w:r>
+                <w:proofErr w:type="spellStart"/>
+                <w:r>
+                  <w:t>payer.street</w:t>
+                </w:r>
+                <w:proofErr w:type="spellEnd"/>
+                <w:r>
+                  <w:t>}}</w:t>
                 </w:r>
               </w:p>
             </w:tc>
@@ -2015,7 +2597,15 @@
                   <w:jc w:val="right"/>
                 </w:pPr>
                 <w:r>
-                  <w:t>{{payer.zip_city}}</w:t>
+                  <w:t>{{</w:t>
+                </w:r>
+                <w:proofErr w:type="spellStart"/>
+                <w:r>
+                  <w:t>payer.zip_city</w:t>
+                </w:r>
+                <w:proofErr w:type="spellEnd"/>
+                <w:r>
+                  <w:t>}}</w:t>
                 </w:r>
               </w:p>
             </w:tc>
@@ -2306,8 +2896,9 @@
                 <w14:bevel/>
               </w14:textOutline>
             </w:rPr>
-            <w:t>{{tenant_street}}</w:t>
-          </w:r>
+            <w:t>{{</w:t>
+          </w:r>
+          <w:proofErr w:type="spellStart"/>
           <w:r>
             <w:rPr>
               <w14:textOutline w14:w="9525" w14:cap="rnd" w14:cmpd="sng" w14:algn="ctr">
@@ -2316,8 +2907,9 @@
                 <w14:bevel/>
               </w14:textOutline>
             </w:rPr>
-            <w:br/>
-          </w:r>
+            <w:t>tenant_street</w:t>
+          </w:r>
+          <w:proofErr w:type="spellEnd"/>
           <w:r>
             <w:rPr>
               <w14:textOutline w14:w="9525" w14:cap="rnd" w14:cmpd="sng" w14:algn="ctr">
@@ -2326,7 +2918,7 @@
                 <w14:bevel/>
               </w14:textOutline>
             </w:rPr>
-            <w:t>{{tenant_zip}}</w:t>
+            <w:t>}}</w:t>
           </w:r>
           <w:r>
             <w:rPr>
@@ -2336,7 +2928,7 @@
                 <w14:bevel/>
               </w14:textOutline>
             </w:rPr>
-            <w:t xml:space="preserve"> {{</w:t>
+            <w:br/>
           </w:r>
           <w:r>
             <w:rPr>
@@ -2346,8 +2938,9 @@
                 <w14:bevel/>
               </w14:textOutline>
             </w:rPr>
-            <w:t>tenant</w:t>
-          </w:r>
+            <w:t>{{</w:t>
+          </w:r>
+          <w:proofErr w:type="spellStart"/>
           <w:r>
             <w:rPr>
               <w14:textOutline w14:w="9525" w14:cap="rnd" w14:cmpd="sng" w14:algn="ctr">
@@ -2356,7 +2949,60 @@
                 <w14:bevel/>
               </w14:textOutline>
             </w:rPr>
-            <w:t>_city}}</w:t>
+            <w:t>tenant_zip</w:t>
+          </w:r>
+          <w:proofErr w:type="spellEnd"/>
+          <w:r>
+            <w:rPr>
+              <w14:textOutline w14:w="9525" w14:cap="rnd" w14:cmpd="sng" w14:algn="ctr">
+                <w14:noFill/>
+                <w14:prstDash w14:val="solid"/>
+                <w14:bevel/>
+              </w14:textOutline>
+            </w:rPr>
+            <w:t>}}</w:t>
+          </w:r>
+          <w:r>
+            <w:rPr>
+              <w14:textOutline w14:w="9525" w14:cap="rnd" w14:cmpd="sng" w14:algn="ctr">
+                <w14:noFill/>
+                <w14:prstDash w14:val="solid"/>
+                <w14:bevel/>
+              </w14:textOutline>
+            </w:rPr>
+            <w:t xml:space="preserve"> {{</w:t>
+          </w:r>
+          <w:proofErr w:type="spellStart"/>
+          <w:r>
+            <w:rPr>
+              <w14:textOutline w14:w="9525" w14:cap="rnd" w14:cmpd="sng" w14:algn="ctr">
+                <w14:noFill/>
+                <w14:prstDash w14:val="solid"/>
+                <w14:bevel/>
+              </w14:textOutline>
+            </w:rPr>
+            <w:t>tenant</w:t>
+          </w:r>
+          <w:r>
+            <w:rPr>
+              <w14:textOutline w14:w="9525" w14:cap="rnd" w14:cmpd="sng" w14:algn="ctr">
+                <w14:noFill/>
+                <w14:prstDash w14:val="solid"/>
+                <w14:bevel/>
+              </w14:textOutline>
+            </w:rPr>
+            <w:t>_city</w:t>
+          </w:r>
+          <w:proofErr w:type="spellEnd"/>
+          <w:r>
+            <w:rPr>
+              <w14:textOutline w14:w="9525" w14:cap="rnd" w14:cmpd="sng" w14:algn="ctr">
+                <w14:noFill/>
+                <w14:prstDash w14:val="solid"/>
+                <w14:bevel/>
+              </w14:textOutline>
+            </w:rPr>
+            <w:t>}}</w:t>
           </w:r>
         </w:p>
         <w:p>
@@ -2467,11 +3113,27 @@
           </w:r>
           <w:r>
             <w:br/>
-            <w:t>{{payer.street}}</w:t>
+            <w:t>{{</w:t>
+          </w:r>
+          <w:proofErr w:type="spellStart"/>
+          <w:r>
+            <w:t>payer.street</w:t>
+          </w:r>
+          <w:proofErr w:type="spellEnd"/>
+          <w:r>
+            <w:t>}}</w:t>
           </w:r>
           <w:r>
             <w:br/>
-            <w:t>{{payer.zip_city}}</w:t>
+            <w:t>{{</w:t>
+          </w:r>
+          <w:proofErr w:type="spellStart"/>
+          <w:r>
+            <w:t>payer.zip_city</w:t>
+          </w:r>
+          <w:proofErr w:type="spellEnd"/>
+          <w:r>
+            <w:t>}}</w:t>
           </w:r>
         </w:p>
         <w:p>
@@ -2758,8 +3420,9 @@
                 <w14:bevel/>
               </w14:textOutline>
             </w:rPr>
-            <w:t xml:space="preserve">{{tenant_street}} </w:t>
-          </w:r>
+            <w:t>{{</w:t>
+          </w:r>
+          <w:proofErr w:type="spellStart"/>
           <w:r>
             <w:rPr>
               <w14:textOutline w14:w="9525" w14:cap="rnd" w14:cmpd="sng" w14:algn="ctr">
@@ -2768,8 +3431,9 @@
                 <w14:bevel/>
               </w14:textOutline>
             </w:rPr>
-            <w:br/>
-          </w:r>
+            <w:t>tenant_street</w:t>
+          </w:r>
+          <w:proofErr w:type="spellEnd"/>
           <w:r>
             <w:rPr>
               <w14:textOutline w14:w="9525" w14:cap="rnd" w14:cmpd="sng" w14:algn="ctr">
@@ -2778,7 +3442,7 @@
                 <w14:bevel/>
               </w14:textOutline>
             </w:rPr>
-            <w:t>{{tenant_zip}}</w:t>
+            <w:t xml:space="preserve">}} </w:t>
           </w:r>
           <w:r>
             <w:rPr>
@@ -2788,7 +3452,7 @@
                 <w14:bevel/>
               </w14:textOutline>
             </w:rPr>
-            <w:t xml:space="preserve"> {{</w:t>
+            <w:br/>
           </w:r>
           <w:r>
             <w:rPr>
@@ -2798,8 +3462,9 @@
                 <w14:bevel/>
               </w14:textOutline>
             </w:rPr>
-            <w:t>tenant</w:t>
-          </w:r>
+            <w:t>{{</w:t>
+          </w:r>
+          <w:proofErr w:type="spellStart"/>
           <w:r>
             <w:rPr>
               <w14:textOutline w14:w="9525" w14:cap="rnd" w14:cmpd="sng" w14:algn="ctr">
@@ -2808,7 +3473,60 @@
                 <w14:bevel/>
               </w14:textOutline>
             </w:rPr>
-            <w:t>_city}}</w:t>
+            <w:t>tenant_zip</w:t>
+          </w:r>
+          <w:proofErr w:type="spellEnd"/>
+          <w:r>
+            <w:rPr>
+              <w14:textOutline w14:w="9525" w14:cap="rnd" w14:cmpd="sng" w14:algn="ctr">
+                <w14:noFill/>
+                <w14:prstDash w14:val="solid"/>
+                <w14:bevel/>
+              </w14:textOutline>
+            </w:rPr>
+            <w:t>}}</w:t>
+          </w:r>
+          <w:r>
+            <w:rPr>
+              <w14:textOutline w14:w="9525" w14:cap="rnd" w14:cmpd="sng" w14:algn="ctr">
+                <w14:noFill/>
+                <w14:prstDash w14:val="solid"/>
+                <w14:bevel/>
+              </w14:textOutline>
+            </w:rPr>
+            <w:t xml:space="preserve"> {{</w:t>
+          </w:r>
+          <w:proofErr w:type="spellStart"/>
+          <w:r>
+            <w:rPr>
+              <w14:textOutline w14:w="9525" w14:cap="rnd" w14:cmpd="sng" w14:algn="ctr">
+                <w14:noFill/>
+                <w14:prstDash w14:val="solid"/>
+                <w14:bevel/>
+              </w14:textOutline>
+            </w:rPr>
+            <w:t>tenant</w:t>
+          </w:r>
+          <w:r>
+            <w:rPr>
+              <w14:textOutline w14:w="9525" w14:cap="rnd" w14:cmpd="sng" w14:algn="ctr">
+                <w14:noFill/>
+                <w14:prstDash w14:val="solid"/>
+                <w14:bevel/>
+              </w14:textOutline>
+            </w:rPr>
+            <w:t>_city</w:t>
+          </w:r>
+          <w:proofErr w:type="spellEnd"/>
+          <w:r>
+            <w:rPr>
+              <w14:textOutline w14:w="9525" w14:cap="rnd" w14:cmpd="sng" w14:algn="ctr">
+                <w14:noFill/>
+                <w14:prstDash w14:val="solid"/>
+                <w14:bevel/>
+              </w14:textOutline>
+            </w:rPr>
+            <w:t>}}</w:t>
           </w:r>
         </w:p>
         <w:p>
@@ -2919,11 +3637,27 @@
           </w:r>
           <w:r>
             <w:br/>
-            <w:t>{{payer.street}}</w:t>
+            <w:t>{{</w:t>
+          </w:r>
+          <w:proofErr w:type="spellStart"/>
+          <w:r>
+            <w:t>payer.street</w:t>
+          </w:r>
+          <w:proofErr w:type="spellEnd"/>
+          <w:r>
+            <w:t>}}</w:t>
           </w:r>
           <w:r>
             <w:br/>
-            <w:t>{{payer.zip_city}}</w:t>
+            <w:t>{{</w:t>
+          </w:r>
+          <w:proofErr w:type="spellStart"/>
+          <w:r>
+            <w:t>payer.zip_city</w:t>
+          </w:r>
+          <w:proofErr w:type="spellEnd"/>
+          <w:r>
+            <w:t>}}</w:t>
           </w:r>
         </w:p>
         <w:p>

</xml_diff>

<commit_message>
Fix: {%p if budget_exceeded %} in rechnungsvorlage.docx korrekt auf 3 Absätze aufgeteilt
docxtpl erfordert {%p tag %} jeweils in einem eigenen Absatz.
Zuvor war alles in einem Absatz → Jinja2-Fehler 'Encountered unknown tag endif'.
Jetzt: Absatz 1={%p if%}, Absatz 2=Text, Absatz 3={%p endif%}.

Co-Authored-By: Claude Sonnet 4.6 <noreply@anthropic.com>
</commit_message>
<xml_diff>
--- a/templates/rechnungsvorlage.docx
+++ b/templates/rechnungsvorlage.docx
@@ -1634,56 +1634,17 @@
     </w:p>
     <w:p>
       <w:r>
-        <w:lastRenderedPageBreak/>
-        <w:t xml:space="preserve">{%p </w:t>
+        <w:t xml:space="preserve">{%p if budget_exceeded %}</w:t>
       </w:r>
-      <w:proofErr w:type="spellStart"/>
+    </w:p>
+    <w:p>
       <w:r>
-        <w:t>if</w:t>
+        <w:t xml:space="preserve">{{ sr_ap_gender }} {{ sr_ap_first_name }} {{ sr_ap_last_name }} hat nach Absprache mit uns das erhöhte Stundenkontingent für diesen Monat gesondert genehmigt.</w:t>
       </w:r>
-      <w:proofErr w:type="spellEnd"/>
+    </w:p>
+    <w:p>
       <w:r>
-        <w:t xml:space="preserve"> </w:t>
-      </w:r>
-      <w:proofErr w:type="spellStart"/>
-      <w:r>
-        <w:t>budget_exceeded</w:t>
-      </w:r>
-      <w:proofErr w:type="spellEnd"/>
-      <w:r>
-        <w:t xml:space="preserve"> %}{{ </w:t>
-      </w:r>
-      <w:proofErr w:type="spellStart"/>
-      <w:r>
-        <w:t>sr_ap_gender</w:t>
-      </w:r>
-      <w:proofErr w:type="spellEnd"/>
-      <w:r>
-        <w:t xml:space="preserve"> }} {{ </w:t>
-      </w:r>
-      <w:proofErr w:type="spellStart"/>
-      <w:r>
-        <w:t>sr_ap_first_name</w:t>
-      </w:r>
-      <w:proofErr w:type="spellEnd"/>
-      <w:r>
-        <w:t xml:space="preserve"> }} {{ </w:t>
-      </w:r>
-      <w:proofErr w:type="spellStart"/>
-      <w:r>
-        <w:t>sr_ap_last_name</w:t>
-      </w:r>
-      <w:proofErr w:type="spellEnd"/>
-      <w:r>
-        <w:t xml:space="preserve"> }} hat nach Absprache mit uns das erhöhte Stundenkontingent für diesen Monat gesondert genehmigt.{%p </w:t>
-      </w:r>
-      <w:proofErr w:type="spellStart"/>
-      <w:r>
-        <w:t>endif</w:t>
-      </w:r>
-      <w:proofErr w:type="spellEnd"/>
-      <w:r>
-        <w:t xml:space="preserve"> %}</w:t>
+        <w:t xml:space="preserve">{%p endif %}</w:t>
       </w:r>
     </w:p>
     <w:p>

</xml_diff>

<commit_message>
SPC  Anpassung. Korrektur Rechnungsvorlage um Postionierung Zahlschein
</commit_message>
<xml_diff>
--- a/templates/rechnungsvorlage.docx
+++ b/templates/rechnungsvorlage.docx
@@ -1634,26 +1634,22 @@
     </w:p>
     <w:p>
       <w:r>
-        <w:t xml:space="preserve">{%p if budget_exceeded %}</w:t>
+        <w:lastRenderedPageBreak/>
+        <w:t>{%p if budget_exceeded %}</w:t>
       </w:r>
     </w:p>
     <w:p>
       <w:r>
-        <w:t xml:space="preserve">{{ sr_ap_gender }} {{ sr_ap_first_name }} {{ sr_ap_last_name }} hat nach Absprache mit uns das erhöhte Stundenkontingent für diesen Monat gesondert genehmigt.</w:t>
+        <w:t>{{ sr_ap_gender }} {{ sr_ap_first_name }} {{ sr_ap_last_name }} hat nach Absprache mit uns das erhöhte Stundenkontingent für diesen Monat gesondert genehmigt.</w:t>
       </w:r>
     </w:p>
     <w:p>
       <w:r>
-        <w:t xml:space="preserve">{%p endif %}</w:t>
+        <w:t>{%p endif %}</w:t>
       </w:r>
     </w:p>
+    <w:p/>
     <w:p>
-      <w:r>
-        <w:t>V</w:t>
-      </w:r>
-      <w:r>
-        <w:t>ielen herzlichen Dank, dass Sie sich für das Angebot der Wegpiraten GmbH entschieden haben. Wir bedanken uns für die gute Zusammenarbeit und das damit verbundene Vertrauen. Bitte begleichen Sie die Rechnung innerhalb von 14 Tagen unter Angabe der Rechnungsnum</w:t>
-      </w:r>
       <w:r>
         <w:rPr>
           <w:noProof/>
@@ -1661,16 +1657,16 @@
         <mc:AlternateContent>
           <mc:Choice Requires="wps">
             <w:drawing>
-              <wp:anchor distT="0" distB="0" distL="114300" distR="114300" simplePos="0" relativeHeight="251665408" behindDoc="1" locked="0" layoutInCell="1" allowOverlap="1" wp14:anchorId="29D3A37E" wp14:editId="3733DBFC">
+              <wp:anchor distT="0" distB="0" distL="114300" distR="114300" simplePos="0" relativeHeight="251665408" behindDoc="1" locked="1" layoutInCell="1" allowOverlap="0" wp14:anchorId="29D3A37E" wp14:editId="055B48B7">
                 <wp:simplePos x="0" y="0"/>
-                <wp:positionH relativeFrom="margin">
-                  <wp:posOffset>-868408</wp:posOffset>
+                <wp:positionH relativeFrom="page">
+                  <wp:align>right</wp:align>
                 </wp:positionH>
-                <wp:positionV relativeFrom="paragraph">
-                  <wp:posOffset>4239895</wp:posOffset>
+                <wp:positionV relativeFrom="bottomMargin">
+                  <wp:posOffset>-2714625</wp:posOffset>
                 </wp:positionV>
-                <wp:extent cx="7531735" cy="3425190"/>
-                <wp:effectExtent l="0" t="0" r="0" b="3810"/>
+                <wp:extent cx="7531200" cy="3423600"/>
+                <wp:effectExtent l="0" t="0" r="0" b="5715"/>
                 <wp:wrapNone/>
                 <wp:docPr id="217" name="Textfeld 2"/>
                 <wp:cNvGraphicFramePr>
@@ -1685,7 +1681,7 @@
                       <wps:spPr bwMode="auto">
                         <a:xfrm>
                           <a:off x="0" y="0"/>
-                          <a:ext cx="7531735" cy="3425190"/>
+                          <a:ext cx="7531200" cy="3423600"/>
                         </a:xfrm>
                         <a:prstGeom prst="rect">
                           <a:avLst/>
@@ -1729,12 +1725,18 @@
                           </w:p>
                         </w:txbxContent>
                       </wps:txbx>
-                      <wps:bodyPr rot="0" vert="horz" wrap="square" lIns="91440" tIns="45720" rIns="91440" bIns="45720" anchor="t" anchorCtr="0">
+                      <wps:bodyPr rot="0" vert="horz" wrap="square" lIns="91440" tIns="45720" rIns="91440" bIns="0" anchor="t" anchorCtr="0">
                         <a:noAutofit/>
                       </wps:bodyPr>
                     </wps:wsp>
                   </a:graphicData>
                 </a:graphic>
+                <wp14:sizeRelH relativeFrom="margin">
+                  <wp14:pctWidth>0</wp14:pctWidth>
+                </wp14:sizeRelH>
+                <wp14:sizeRelV relativeFrom="margin">
+                  <wp14:pctHeight>0</wp14:pctHeight>
+                </wp14:sizeRelV>
               </wp:anchor>
             </w:drawing>
           </mc:Choice>
@@ -1744,8 +1746,8 @@
                 <v:stroke joinstyle="miter"/>
                 <v:path gradientshapeok="t" o:connecttype="rect"/>
               </v:shapetype>
-              <v:shape id="Textfeld 2" o:spid="_x0000_s1026" type="#_x0000_t202" style="position:absolute;margin-left:-68.4pt;margin-top:333.85pt;width:593.05pt;height:269.7pt;z-index:-251651072;visibility:visible;mso-wrap-style:square;mso-wrap-distance-left:9pt;mso-wrap-distance-top:0;mso-wrap-distance-right:9pt;mso-wrap-distance-bottom:0;mso-position-horizontal:absolute;mso-position-horizontal-relative:margin;mso-position-vertical:absolute;mso-position-vertical-relative:text;v-text-anchor:top" o:gfxdata="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" filled="f" stroked="f">
-                <v:textbox>
+              <v:shape id="Textfeld 2" o:spid="_x0000_s1026" type="#_x0000_t202" style="position:absolute;margin-left:541.8pt;margin-top:-213.75pt;width:593pt;height:269.55pt;z-index:-251651072;visibility:visible;mso-wrap-style:square;mso-width-percent:0;mso-height-percent:0;mso-wrap-distance-left:9pt;mso-wrap-distance-top:0;mso-wrap-distance-right:9pt;mso-wrap-distance-bottom:0;mso-position-horizontal:right;mso-position-horizontal-relative:page;mso-position-vertical:absolute;mso-position-vertical-relative:bottom-margin-area;mso-width-percent:0;mso-height-percent:0;mso-width-relative:margin;mso-height-relative:margin;v-text-anchor:top" o:gfxdata="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" o:allowoverlap="f" filled="f" stroked="f">
+                <v:textbox inset=",,,0">
                   <w:txbxContent>
                     <w:p>
                       <w:pPr>
@@ -1776,14 +1778,18 @@
                     </w:p>
                   </w:txbxContent>
                 </v:textbox>
-                <w10:wrap anchorx="margin"/>
+                <w10:wrap anchorx="page" anchory="margin"/>
+                <w10:anchorlock/>
               </v:shape>
             </w:pict>
           </mc:Fallback>
         </mc:AlternateContent>
       </w:r>
       <w:r>
-        <w:t>mer auf das untenstehende Konto.</w:t>
+        <w:t>V</w:t>
+      </w:r>
+      <w:r>
+        <w:t>ielen herzlichen Dank, dass Sie sich für das Angebot der Wegpiraten GmbH entschieden haben. Wir bedanken uns für die gute Zusammenarbeit und das damit verbundene Vertrauen. Bitte begleichen Sie die Rechnung innerhalb von 14 Tagen unter Angabe der Rechnungsnummer auf das untenstehende Konto.</w:t>
       </w:r>
     </w:p>
     <w:sectPr>

</xml_diff>

<commit_message>
Fix Datums-Parsing, Gratis-Positionen und Arbeitszeitprotokoll
- batch_import_timesheets: Datum tt.mm.jj und tt.mm.jjjj (zweistelliges Jahr)
  wird jetzt erkannt; Header-Alias «Fahrzeit» → «Fahrtzeit» toleriert
- invoice_processor: Zeilen mit «ohne Berechnung» in der Notiz (case-insensitiv,
  beliebiger Zusatztext erlaubt) werden als separate Rechnungsposition mit
  Kosten=0 ausgewiesen; Datum bleibt sichtbar; neues Context-Flag
  has_intro_position steuert Hinweistext auf Seite 2
- rechnungsvorlage.docx: Datum immer anzeigen (nicht mehr via is_intro
  unterdrückt); neuer Block «Wie vereinbart, sind für die Erstberatung
  15 Minuten ohne Berechnung.» wenn has_intro_position gesetzt
- arbeitszeit_report: neues Sheet «Pivot» mit Zeitdaten je MA und Tag,
  Spalten Gesamt Min und Gesamt h:mm ([h]:mm-Formel)

Co-Authored-By: Claude Sonnet 4.6 <noreply@anthropic.com>
</commit_message>
<xml_diff>
--- a/templates/rechnungsvorlage.docx
+++ b/templates/rechnungsvorlage.docx
@@ -676,93 +676,9 @@
               <w:rPr>
                 <w:sz w:val="22"/>
                 <w:szCs w:val="22"/>
-                <w:lang w:val="en-US"/>
-              </w:rPr>
-              <w:t>{% for item in positions %}{{item.</w:t>
-            </w:r>
-            <w:r>
-              <w:rPr>
-                <w:rFonts w:ascii="Consolas" w:hAnsi="Consolas" w:cs="Times New Roman"/>
-                <w:color w:val="92D69E"/>
-                <w:sz w:val="22"/>
-                <w:szCs w:val="22"/>
-                <w:lang w:val="en-US"/>
-              </w:rPr>
-              <w:t xml:space="preserve"> </w:t>
-            </w:r>
-            <w:proofErr w:type="spellStart"/>
-            <w:r>
-              <w:rPr>
-                <w:sz w:val="22"/>
-                <w:szCs w:val="22"/>
-              </w:rPr>
-              <w:t>Leistungsdatum|date</w:t>
-            </w:r>
-            <w:proofErr w:type="spellEnd"/>
-            <w:r>
-              <w:rPr>
-                <w:sz w:val="22"/>
-                <w:szCs w:val="22"/>
-              </w:rPr>
-              <w:t xml:space="preserve"> </w:t>
-            </w:r>
-            <w:proofErr w:type="spellStart"/>
-            <w:r>
-              <w:rPr>
-                <w:sz w:val="22"/>
-                <w:szCs w:val="22"/>
-              </w:rPr>
-              <w:t>if</w:t>
-            </w:r>
-            <w:proofErr w:type="spellEnd"/>
-            <w:r>
-              <w:rPr>
-                <w:sz w:val="22"/>
-                <w:szCs w:val="22"/>
-              </w:rPr>
-              <w:t xml:space="preserve"> not </w:t>
-            </w:r>
-            <w:proofErr w:type="spellStart"/>
-            <w:r>
-              <w:rPr>
-                <w:sz w:val="22"/>
-                <w:szCs w:val="22"/>
-              </w:rPr>
-              <w:t>item.is_intro</w:t>
-            </w:r>
-            <w:proofErr w:type="spellEnd"/>
-            <w:r>
-              <w:rPr>
-                <w:sz w:val="22"/>
-                <w:szCs w:val="22"/>
-              </w:rPr>
-              <w:t xml:space="preserve"> </w:t>
-            </w:r>
-            <w:proofErr w:type="spellStart"/>
-            <w:r>
-              <w:rPr>
-                <w:sz w:val="22"/>
-                <w:szCs w:val="22"/>
-              </w:rPr>
-              <w:t>else</w:t>
-            </w:r>
-            <w:proofErr w:type="spellEnd"/>
-            <w:r>
-              <w:rPr>
-                <w:sz w:val="22"/>
-                <w:szCs w:val="22"/>
-              </w:rPr>
-              <w:t xml:space="preserve"> </w:t>
-            </w:r>
-            <w:proofErr w:type="spellStart"/>
-            <w:r>
-              <w:rPr>
-                <w:sz w:val="22"/>
-                <w:szCs w:val="22"/>
-              </w:rPr>
-              <w:t>item.Bezeichnung</w:t>
-            </w:r>
-            <w:proofErr w:type="spellEnd"/>
+              </w:rPr>
+              <w:t xml:space="preserve">{% for item in positions %}{{item.Leistungsdatum|date}}</w:t>
+            </w:r>
           </w:p>
           <w:p>
             <w:pPr>
@@ -1641,6 +1557,21 @@
     <w:p>
       <w:r>
         <w:t>{{ sr_ap_gender }} {{ sr_ap_first_name }} {{ sr_ap_last_name }} hat nach Absprache mit uns das erhöhte Stundenkontingent für diesen Monat gesondert genehmigt.</w:t>
+      </w:r>
+    </w:p>
+    <w:p>
+      <w:r>
+        <w:t>{%p endif %}</w:t>
+      </w:r>
+    </w:p>
+    <w:p>
+      <w:r>
+        <w:t>{%p if has_intro_position %}</w:t>
+      </w:r>
+    </w:p>
+    <w:p>
+      <w:r>
+        <w:t>Wie vereinbart, sind für die Erstberatung 15 Minuten ohne Berechnung.</w:t>
       </w:r>
     </w:p>
     <w:p>

</xml_diff>

<commit_message>
Rechnungsvorlage aktualisiert und Timesheet-Import-Header-Tests hinzugefügt
Co-Authored-By: Claude Sonnet 4.6 <noreply@anthropic.com>
</commit_message>
<xml_diff>
--- a/templates/rechnungsvorlage.docx
+++ b/templates/rechnungsvorlage.docx
@@ -678,24 +678,6 @@
                 <w:szCs w:val="22"/>
               </w:rPr>
               <w:t xml:space="preserve">{% for item in positions %}{{item.Leistungsdatum|date}}</w:t>
-            </w:r>
-          </w:p>
-          <w:p>
-            <w:pPr>
-              <w:jc w:val="right"/>
-              <w:rPr>
-                <w:b/>
-                <w:bCs/>
-                <w:sz w:val="22"/>
-                <w:szCs w:val="22"/>
-              </w:rPr>
-            </w:pPr>
-            <w:r>
-              <w:rPr>
-                <w:sz w:val="22"/>
-                <w:szCs w:val="22"/>
-              </w:rPr>
-              <w:t>}}</w:t>
             </w:r>
           </w:p>
         </w:tc>

</xml_diff>